<commit_message>
Kevennä tehtävänantoa: vähemmän toistoja ja päällekkäisiä rasteja
- Aloituskysymyksiä kuusi (ennen kahdeksan), featureista pilkotaan
  aluksi kaksi (ennen kolme).
- Skriptikartta lyhyemmäksi, testikierroksia kolme (ennen viisi),
  rajatestejä kolme viikoilla 38 ja 40 (ennen neljä).
- Viikon 46 katselmointi ja ratkaisun selitys yhdeksi tehtäväksi.
- Tuplatallennuksen esto pois viikolta 40.
- Näyttömatriisin rastitus siirretty osatehtävistä viikon
  päiväkirjaohjeeseen. 59 tehtävää, 316 osatehtävää (ennen 338).

Co-Authored-By: Claude Opus 5.5 <noreply@anthropic.com>
</commit_message>
<xml_diff>
--- a/downloads/kahvilakoodi-tyopaketti.docx
+++ b/downloads/kahvilakoodi-tyopaketti.docx
@@ -1852,7 +1852,7 @@
           <w:sz w:val="19"/>
           <w:szCs w:val="19"/>
         </w:rPr>
-        <w:t xml:space="preserve">☐  4. Kirjoita kahdeksan kysymystä asiakkaalle: ota mukaan Toimeksianto-näkymän Sovi asiakkaan kanssa -laatikon neljä kysymystä ja lisää neljä omaa. Jokaisen vastauksen pitää auttaa sinua päättämään jotain pelistä.</w:t>
+        <w:t xml:space="preserve">☐  4. Kirjoita kuusi kysymystä asiakkaalle: ota mukaan Toimeksianto-näkymän Sovi asiakkaan kanssa -laatikon neljä kysymystä ja lisää kaksi omaa. Jokaisen vastauksen pitää auttaa sinua päättämään jotain pelistä.</w:t>
       </w:r>
     </w:p>
     <w:p>
@@ -1892,7 +1892,7 @@
           <w:sz w:val="19"/>
           <w:szCs w:val="19"/>
         </w:rPr>
-        <w:t xml:space="preserve">Valmis kun: Sinulla on kahdeksan erilaista kysymystä, ja jokaisen perässä lukee, minkä päätöksen vastaus ratkaisee.</w:t>
+        <w:t xml:space="preserve">Valmis kun: Sinulla on kuusi erilaista kysymystä, ja jokaisen perässä lukee, minkä päätöksen vastaus ratkaisee.</w:t>
       </w:r>
     </w:p>
     <w:p>
@@ -1999,7 +1999,7 @@
           <w:sz w:val="19"/>
           <w:szCs w:val="19"/>
         </w:rPr>
-        <w:t xml:space="preserve">Valmis kun: Päiväkirjassa on jokaiselle kahdeksalle kysymykselle joko asiakkaan vastaus tai merkintä avoin sekä lista pakollisista (P0) ominaisuuksista.</w:t>
+        <w:t xml:space="preserve">Valmis kun: Päiväkirjassa on jokaiselle kuudelle kysymykselle joko asiakkaan vastaus tai merkintä avoin sekä lista pakollisista (P0) ominaisuuksista.</w:t>
       </w:r>
     </w:p>
     <w:p>
@@ -2333,19 +2333,6 @@
           <w:szCs w:val="19"/>
         </w:rPr>
         <w:t xml:space="preserve">☐  5. Tee commit eli tallenna muutokset versionhallintaan: kirjoita GitHub Desktopin Summary-kenttään ”Unity-projektin pohja” ja paina Commit to main. Tee sitten push painamalla Push origin, jolloin commit siirtyy GitHubiin.</w:t>
-      </w:r>
-    </w:p>
-    <w:p>
-      <w:pPr>
-        <w:spacing w:after="40" w:before="0"/>
-        <w:ind w:left="360"/>
-      </w:pPr>
-      <w:r>
-        <w:rPr>
-          <w:sz w:val="19"/>
-          <w:szCs w:val="19"/>
-        </w:rPr>
-        <w:t xml:space="preserve">☐  6. Rastita Näyttömatriisi-näkymässä kohdat Kehitysympäristö, Asiakkaan tarpeet ja Kehittämisympäristön käyttöönotto. Kirjoita niiden työnäytteiden linkit päiväkirjan kenttään Missä työnäyte on?</w:t>
       </w:r>
     </w:p>
     <w:p>
@@ -2601,7 +2588,7 @@
           <w:sz w:val="19"/>
           <w:szCs w:val="19"/>
         </w:rPr>
-        <w:t xml:space="preserve">☐  2. Ota listan kolme ensimmäistä featurea. Kirjoita jokaisesta paperille 3–5 pientä asiaa, joita sen tekemiseen tarvitaan, esimerkiksi pelattava kierros: kolme ruutua, ruudun vaihto, tilaus ja pisteet.</w:t>
+        <w:t xml:space="preserve">☐  2. Ota listan kaksi ensimmäistä featurea. Kirjoita jokaisesta paperille 3–5 pientä asiaa, joita sen tekemiseen tarvitaan, esimerkiksi pelattava kierros: kolme ruutua, ruudun vaihto, tilaus ja pisteet.</w:t>
       </w:r>
     </w:p>
     <w:p>
@@ -2667,7 +2654,7 @@
           <w:sz w:val="19"/>
           <w:szCs w:val="19"/>
         </w:rPr>
-        <w:t xml:space="preserve">Valmis kun: GitHubissa on issuet kolmelle ensimmäiselle featurelle ja yksi issue kustakin muusta. Jokaisessa on arvio ja Valmis kun -ehto.</w:t>
+        <w:t xml:space="preserve">Valmis kun: GitHubissa on issuet kahdelle ensimmäiselle featurelle ja yksi issue kustakin muusta. Jokaisessa on arvio ja Valmis kun -ehto.</w:t>
       </w:r>
     </w:p>
     <w:p>
@@ -2961,59 +2948,20 @@
           <w:sz w:val="19"/>
           <w:szCs w:val="19"/>
         </w:rPr>
-        <w:t xml:space="preserve">☐  3. Piirrä nuoli aina, kun skripti antaa tietoa toiselle. Esimerkiksi ProductDatabase → OrderManager: tuotelista.</w:t>
-      </w:r>
-    </w:p>
-    <w:p>
-      <w:pPr>
-        <w:spacing w:after="40" w:before="0"/>
-        <w:ind w:left="360"/>
-      </w:pPr>
-      <w:r>
-        <w:rPr>
-          <w:sz w:val="19"/>
-          <w:szCs w:val="19"/>
-        </w:rPr>
-        <w:t xml:space="preserve">☐  4. Lisää kuvaan tiedosto products.json ja nuoli siitä ProductDatabaseen. Tuotteet luetaan tästä tiedostosta, eikä niitä kirjoiteta koodiin.</w:t>
-      </w:r>
-    </w:p>
-    <w:p>
-      <w:pPr>
-        <w:spacing w:after="40" w:before="0"/>
-        <w:ind w:left="360"/>
-      </w:pPr>
-      <w:r>
-        <w:rPr>
-          <w:sz w:val="19"/>
-          <w:szCs w:val="19"/>
-        </w:rPr>
-        <w:t xml:space="preserve">☐  5. Lisää kuvaan selaimen tallennus ja nuoli SaveServicestä siihen. Parhaat tulokset säilyvät siellä, vaikka peli suljetaan.</w:t>
-      </w:r>
-    </w:p>
-    <w:p>
-      <w:pPr>
-        <w:spacing w:after="40" w:before="0"/>
-        <w:ind w:left="360"/>
-      </w:pPr>
-      <w:r>
-        <w:rPr>
-          <w:sz w:val="19"/>
-          <w:szCs w:val="19"/>
-        </w:rPr>
-        <w:t xml:space="preserve">☐  6. Kuvaa paperi ja tallenna kuva nimellä unity-rakenne.png. Näytä kuva ohjaajalle ennen koodaamista ja kirjaa päiväkirjaan hänen kommenttinsa, roolinsa ja päivä.</w:t>
-      </w:r>
-    </w:p>
-    <w:p>
-      <w:pPr>
-        <w:spacing w:after="40" w:before="0"/>
-        <w:ind w:left="360"/>
-      </w:pPr>
-      <w:r>
-        <w:rPr>
-          <w:sz w:val="19"/>
-          <w:szCs w:val="19"/>
-        </w:rPr>
-        <w:t xml:space="preserve">☐  7. Rastita Näyttömatriisi-näkymässä kohdat Tehtävistä sopiminen ja Tehtäviksi jakaminen. Kirjoita niiden työnäytteiden linkit päiväkirjan kenttään Missä työnäyte on?</w:t>
+        <w:t xml:space="preserve">☐  3. Piirrä nuolet: products.json → ProductDatabase, ProductDatabase → OrderManager (tuotelista) ja SaveService → selaimen tallennus. Tuotteet tulevat tiedostosta, ja tulokset säilyvät selaimessa.</w:t>
+      </w:r>
+    </w:p>
+    <w:p>
+      <w:pPr>
+        <w:spacing w:after="40" w:before="0"/>
+        <w:ind w:left="360"/>
+      </w:pPr>
+      <w:r>
+        <w:rPr>
+          <w:sz w:val="19"/>
+          <w:szCs w:val="19"/>
+        </w:rPr>
+        <w:t xml:space="preserve">☐  4. Kuvaa paperi ja tallenna kuva nimellä unity-rakenne.png. Näytä kuva ohjaajalle ennen koodaamista ja kirjaa päiväkirjaan hänen kommenttinsa, roolinsa ja päivä.</w:t>
       </w:r>
     </w:p>
     <w:p>
@@ -3603,7 +3551,7 @@
           <w:sz w:val="21"/>
           <w:szCs w:val="21"/>
         </w:rPr>
-        <w:t xml:space="preserve">Tehtävä 5 / 5 · Testaa kierros viisi kertaa selaimessa ja kirjaa tulokset.</w:t>
+        <w:t xml:space="preserve">Tehtävä 5 / 5 · Testaa kierros kolme kertaa selaimessa ja kirjaa tulokset.</w:t>
       </w:r>
     </w:p>
     <w:p>
@@ -3642,7 +3590,7 @@
           <w:sz w:val="19"/>
           <w:szCs w:val="19"/>
         </w:rPr>
-        <w:t xml:space="preserve">☐  3. Pelaa kierros viisi kertaa. Käytä välillä Pelaa uudelleen -painiketta.</w:t>
+        <w:t xml:space="preserve">☐  3. Pelaa kierros kolme kertaa. Käytä välillä Pelaa uudelleen -painiketta.</w:t>
       </w:r>
     </w:p>
     <w:p>
@@ -3704,24 +3652,11 @@
       </w:pPr>
       <w:r>
         <w:rPr>
-          <w:sz w:val="19"/>
-          <w:szCs w:val="19"/>
-        </w:rPr>
-        <w:t xml:space="preserve">☐  8. Rastita Näyttömatriisi-näkymässä kohdan Kirjaston toiminnot ja työkalut. Kirjoita sen työnäytteen linkki päiväkirjan kenttään Missä työnäyte on?</w:t>
-      </w:r>
-    </w:p>
-    <w:p>
-      <w:pPr>
-        <w:spacing w:after="40" w:before="0"/>
-        <w:ind w:left="360"/>
-      </w:pPr>
-      <w:r>
-        <w:rPr>
           <w:color w:val="1d4ed8"/>
           <w:sz w:val="19"/>
           <w:szCs w:val="19"/>
         </w:rPr>
-        <w:t xml:space="preserve">Valmis kun: Päiväkirjassa on viisi testikierrosta tuloksineen, ja viimeinen kierros meni odotetusti.</w:t>
+        <w:t xml:space="preserve">Valmis kun: Päiväkirjassa on kolme testikierrosta tuloksineen, ja viimeinen kierros meni odotetusti.</w:t>
       </w:r>
     </w:p>
     <w:p>
@@ -4372,19 +4307,6 @@
       </w:pPr>
       <w:r>
         <w:rPr>
-          <w:sz w:val="19"/>
-          <w:szCs w:val="19"/>
-        </w:rPr>
-        <w:t xml:space="preserve">☐  8. Rastita Näyttömatriisi-näkymässä kohdan Rajapinnat ja tieto. Kirjoita sen työnäytteen linkki päiväkirjan kenttään Missä työnäyte on?</w:t>
-      </w:r>
-    </w:p>
-    <w:p>
-      <w:pPr>
-        <w:spacing w:after="40" w:before="0"/>
-        <w:ind w:left="360"/>
-      </w:pPr>
-      <w:r>
-        <w:rPr>
           <w:color w:val="1d4ed8"/>
           <w:sz w:val="19"/>
           <w:szCs w:val="19"/>
@@ -4833,20 +4755,20 @@
           <w:sz w:val="21"/>
           <w:szCs w:val="21"/>
         </w:rPr>
-        <w:t xml:space="preserve">Tehtävä 4 / 4 · Testaa pelin neljä rajatilannetta.</w:t>
-      </w:r>
-    </w:p>
-    <w:p>
-      <w:pPr>
-        <w:spacing w:after="40" w:before="0"/>
-        <w:ind w:left="360"/>
-      </w:pPr>
-      <w:r>
-        <w:rPr>
-          <w:sz w:val="19"/>
-          <w:szCs w:val="19"/>
-        </w:rPr>
-        <w:t xml:space="preserve">☐  1. Kirjoita päiväkirjaan jokaiselle neljälle testille odotettu tulos ennen kuin testaat.</w:t>
+        <w:t xml:space="preserve">Tehtävä 4 / 4 · Testaa pelin kolme rajatilannetta.</w:t>
+      </w:r>
+    </w:p>
+    <w:p>
+      <w:pPr>
+        <w:spacing w:after="40" w:before="0"/>
+        <w:ind w:left="360"/>
+      </w:pPr>
+      <w:r>
+        <w:rPr>
+          <w:sz w:val="19"/>
+          <w:szCs w:val="19"/>
+        </w:rPr>
+        <w:t xml:space="preserve">☐  1. Kirjoita päiväkirjaan jokaiselle kolmelle testille odotettu tulos ennen kuin testaat.</w:t>
       </w:r>
     </w:p>
     <w:p>
@@ -4885,46 +4807,33 @@
           <w:sz w:val="19"/>
           <w:szCs w:val="19"/>
         </w:rPr>
-        <w:t xml:space="preserve">☐  4. Testi 3: valitse väärä tuote ja paina Toimita. Pisteet muuttuvat sääntöjen 2 ja 5 mukaan, ja palaute kertoo virheestä.</w:t>
-      </w:r>
-    </w:p>
-    <w:p>
-      <w:pPr>
-        <w:spacing w:after="40" w:before="0"/>
-        <w:ind w:left="360"/>
-      </w:pPr>
-      <w:r>
-        <w:rPr>
-          <w:sz w:val="19"/>
-          <w:szCs w:val="19"/>
-        </w:rPr>
-        <w:t xml:space="preserve">☐  5. Testi 4: paina tulosruudulla Pelaa uudelleen. Aika ja pisteet alkavat alusta.</w:t>
-      </w:r>
-    </w:p>
-    <w:p>
-      <w:pPr>
-        <w:spacing w:after="40" w:before="0"/>
-        <w:ind w:left="360"/>
-      </w:pPr>
-      <w:r>
-        <w:rPr>
-          <w:sz w:val="19"/>
-          <w:szCs w:val="19"/>
-        </w:rPr>
-        <w:t xml:space="preserve">☐  6. Jos testi ei mennyt odotetusti, korjaa vika, tee commit ja testaa uudelleen. Kirjaa molemmat ajot.</w:t>
-      </w:r>
-    </w:p>
-    <w:p>
-      <w:pPr>
-        <w:spacing w:after="40" w:before="0"/>
-        <w:ind w:left="360"/>
-      </w:pPr>
-      <w:r>
-        <w:rPr>
-          <w:sz w:val="19"/>
-          <w:szCs w:val="19"/>
-        </w:rPr>
-        <w:t xml:space="preserve">☐  7. Sulje GitHubissa tämän viikon valmiit issuet. Kirjoita jokaiseen ennen sulkemista kommentti, jossa on linkki commitiin, jossa työ tehtiin.</w:t>
+        <w:t xml:space="preserve">☐  4. Testi 3: paina tulosruudulla Pelaa uudelleen. Aika ja pisteet alkavat alusta.</w:t>
+      </w:r>
+    </w:p>
+    <w:p>
+      <w:pPr>
+        <w:spacing w:after="40" w:before="0"/>
+        <w:ind w:left="360"/>
+      </w:pPr>
+      <w:r>
+        <w:rPr>
+          <w:sz w:val="19"/>
+          <w:szCs w:val="19"/>
+        </w:rPr>
+        <w:t xml:space="preserve">☐  5. Jos testi ei mennyt odotetusti, korjaa vika, tee commit ja testaa uudelleen. Kirjaa molemmat ajot.</w:t>
+      </w:r>
+    </w:p>
+    <w:p>
+      <w:pPr>
+        <w:spacing w:after="40" w:before="0"/>
+        <w:ind w:left="360"/>
+      </w:pPr>
+      <w:r>
+        <w:rPr>
+          <w:sz w:val="19"/>
+          <w:szCs w:val="19"/>
+        </w:rPr>
+        <w:t xml:space="preserve">☐  6. Sulje GitHubissa tämän viikon valmiit issuet. Kirjoita jokaiseen ennen sulkemista kommentti, jossa on linkki commitiin, jossa työ tehtiin.</w:t>
       </w:r>
     </w:p>
     <w:p>
@@ -4938,7 +4847,7 @@
           <w:sz w:val="19"/>
           <w:szCs w:val="19"/>
         </w:rPr>
-        <w:t xml:space="preserve">Valmis kun: Neljän rajatestin odotetut ja todelliset tulokset on kirjattu, ja viimeinen ajo meni odotetusti.</w:t>
+        <w:t xml:space="preserve">Valmis kun: Kolmen rajatestin odotetut ja todelliset tulokset on kirjattu, ja viimeinen ajo meni odotetusti.</w:t>
       </w:r>
     </w:p>
     <w:p>
@@ -5349,19 +5258,6 @@
       </w:pPr>
       <w:r>
         <w:rPr>
-          <w:sz w:val="19"/>
-          <w:szCs w:val="19"/>
-        </w:rPr>
-        <w:t xml:space="preserve">☐  7. Rastita Näyttömatriisi-näkymässä kohdat Toimintalogiikka ja Ratkaisuvaihtoehdot. Kirjoita niiden työnäytteiden linkit päiväkirjan kenttään Missä työnäyte on?</w:t>
-      </w:r>
-    </w:p>
-    <w:p>
-      <w:pPr>
-        <w:spacing w:after="40" w:before="0"/>
-        <w:ind w:left="360"/>
-      </w:pPr>
-      <w:r>
-        <w:rPr>
           <w:color w:val="1d4ed8"/>
           <w:sz w:val="19"/>
           <w:szCs w:val="19"/>
@@ -5783,7 +5679,7 @@
           <w:sz w:val="21"/>
           <w:szCs w:val="21"/>
         </w:rPr>
-        <w:t xml:space="preserve">Tehtävä 4 / 5 · Tarkista nimimerkki ja estä saman tuloksen tallennus kahdesti.</w:t>
+        <w:t xml:space="preserve">Tehtävä 4 / 5 · Tarkista nimimerkki ennen tallennusta.</w:t>
       </w:r>
     </w:p>
     <w:p>
@@ -5871,24 +5767,11 @@
       </w:pPr>
       <w:r>
         <w:rPr>
-          <w:sz w:val="19"/>
-          <w:szCs w:val="19"/>
-        </w:rPr>
-        <w:t xml:space="preserve">☐  7. Estä saman tuloksen tallennus kahdesti: lisää GameManageriin muuttuja bool scoreSaved. SaveCurrentScore tallentaa vain, jos se on false, ja StartGame nollaa sen.</w:t>
-      </w:r>
-    </w:p>
-    <w:p>
-      <w:pPr>
-        <w:spacing w:after="40" w:before="0"/>
-        <w:ind w:left="360"/>
-      </w:pPr>
-      <w:r>
-        <w:rPr>
           <w:color w:val="1d4ed8"/>
           <w:sz w:val="19"/>
           <w:szCs w:val="19"/>
         </w:rPr>
-        <w:t xml:space="preserve">Valmis kun: Tyhjä nimi tallentuu nimellä Nimetön, liian pitkä nimi lyhenee ja toinen Tallenna tulos -painallus ei lisää samaa tulosta uudelleen.</w:t>
+        <w:t xml:space="preserve">Valmis kun: Tyhjä nimi tallentuu nimellä Nimetön, ja liian pitkä nimi lyhenee sallittuun pituuteen.</w:t>
       </w:r>
     </w:p>
     <w:p>
@@ -5929,98 +5812,72 @@
           <w:sz w:val="19"/>
           <w:szCs w:val="19"/>
         </w:rPr>
-        <w:t xml:space="preserve">☐  1. Kirjoita päiväkirjaan odotettu tulos neljälle testille ennen kuin testaat.</w:t>
-      </w:r>
-    </w:p>
-    <w:p>
-      <w:pPr>
-        <w:spacing w:after="40" w:before="0"/>
-        <w:ind w:left="360"/>
-      </w:pPr>
-      <w:r>
-        <w:rPr>
-          <w:sz w:val="19"/>
-          <w:szCs w:val="19"/>
-        </w:rPr>
-        <w:t xml:space="preserve">☐  2. Testi 1: avaa selainversio yksityisessä selainikkunassa. Lista on tyhjä, eikä peli kaadu.</w:t>
-      </w:r>
-    </w:p>
-    <w:p>
-      <w:pPr>
-        <w:spacing w:after="40" w:before="0"/>
-        <w:ind w:left="360"/>
-      </w:pPr>
-      <w:r>
-        <w:rPr>
-          <w:sz w:val="19"/>
-          <w:szCs w:val="19"/>
-        </w:rPr>
-        <w:t xml:space="preserve">☐  3. Testi 2: tallenna kuusi eri tulosta. Vain viisi parasta näkyy.</w:t>
-      </w:r>
-    </w:p>
-    <w:p>
-      <w:pPr>
-        <w:spacing w:after="40" w:before="0"/>
-        <w:ind w:left="360"/>
-      </w:pPr>
-      <w:r>
-        <w:rPr>
-          <w:sz w:val="19"/>
-          <w:szCs w:val="19"/>
-        </w:rPr>
-        <w:t xml:space="preserve">☐  4. Testi 3: tallenna kaksi yhtä suurta tulosta. Tarkista, että järjestys noudattaa asiakkaan kanssa sovittua sääntöä. Jos sääntöä ei ole sovittu, aiempi tulos on ylempänä, ja asia on avoin.</w:t>
-      </w:r>
-    </w:p>
-    <w:p>
-      <w:pPr>
-        <w:spacing w:after="40" w:before="0"/>
-        <w:ind w:left="360"/>
-      </w:pPr>
-      <w:r>
-        <w:rPr>
-          <w:sz w:val="19"/>
-          <w:szCs w:val="19"/>
-        </w:rPr>
-        <w:t xml:space="preserve">☐  5. Testi 4: kopioi pelin osoite, sulje välilehti ja avaa sama osoite uudelleen samassa selaimessa ilman uutta buildia. Sama lista näkyy.</w:t>
-      </w:r>
-    </w:p>
-    <w:p>
-      <w:pPr>
-        <w:spacing w:after="40" w:before="0"/>
-        <w:ind w:left="360"/>
-      </w:pPr>
-      <w:r>
-        <w:rPr>
-          <w:sz w:val="19"/>
-          <w:szCs w:val="19"/>
-        </w:rPr>
-        <w:t xml:space="preserve">☐  6. Kirjoita päiväkirjan Miksi tein näin? -kenttään, miksi PlayerPrefs sopii tähän peliin. Kirjoita myös, että tiedot säilyvät vain tässä selaimessa ja että pelaaja voi itse muuttaa tai poistaa ne.</w:t>
-      </w:r>
-    </w:p>
-    <w:p>
-      <w:pPr>
-        <w:spacing w:after="40" w:before="0"/>
-        <w:ind w:left="360"/>
-      </w:pPr>
-      <w:r>
-        <w:rPr>
-          <w:sz w:val="19"/>
-          <w:szCs w:val="19"/>
-        </w:rPr>
-        <w:t xml:space="preserve">☐  7. Sulje GitHubissa tämän viikon valmiit issuet. Kirjoita jokaiseen ennen sulkemista kommentti, jossa on linkki commitiin, jossa työ tehtiin.</w:t>
-      </w:r>
-    </w:p>
-    <w:p>
-      <w:pPr>
-        <w:spacing w:after="40" w:before="0"/>
-        <w:ind w:left="360"/>
-      </w:pPr>
-      <w:r>
-        <w:rPr>
-          <w:sz w:val="19"/>
-          <w:szCs w:val="19"/>
-        </w:rPr>
-        <w:t xml:space="preserve">☐  8. Rastita Näyttömatriisi-näkymässä kohdat Toimintojen toteutus, Tietovaraston valinta, Yhteys tietovarastoon ja Tietoturva. Kirjoita niiden työnäytteiden linkit päiväkirjan kenttään Missä työnäyte on?</w:t>
+        <w:t xml:space="preserve">☐  1. Kirjoita päiväkirjaan odotettu tulos kolmelle testille ennen kuin testaat.</w:t>
+      </w:r>
+    </w:p>
+    <w:p>
+      <w:pPr>
+        <w:spacing w:after="40" w:before="0"/>
+        <w:ind w:left="360"/>
+      </w:pPr>
+      <w:r>
+        <w:rPr>
+          <w:sz w:val="19"/>
+          <w:szCs w:val="19"/>
+        </w:rPr>
+        <w:t xml:space="preserve">☐  2. Testi 1: tallenna kuusi eri tulosta. Vain viisi parasta näkyy.</w:t>
+      </w:r>
+    </w:p>
+    <w:p>
+      <w:pPr>
+        <w:spacing w:after="40" w:before="0"/>
+        <w:ind w:left="360"/>
+      </w:pPr>
+      <w:r>
+        <w:rPr>
+          <w:sz w:val="19"/>
+          <w:szCs w:val="19"/>
+        </w:rPr>
+        <w:t xml:space="preserve">☐  3. Testi 2: tallenna kaksi yhtä suurta tulosta. Tarkista, että järjestys noudattaa asiakkaan kanssa sovittua sääntöä. Jos sääntöä ei ole sovittu, aiempi tulos on ylempänä, ja asia on avoin.</w:t>
+      </w:r>
+    </w:p>
+    <w:p>
+      <w:pPr>
+        <w:spacing w:after="40" w:before="0"/>
+        <w:ind w:left="360"/>
+      </w:pPr>
+      <w:r>
+        <w:rPr>
+          <w:sz w:val="19"/>
+          <w:szCs w:val="19"/>
+        </w:rPr>
+        <w:t xml:space="preserve">☐  4. Testi 3: kopioi pelin osoite, sulje välilehti ja avaa sama osoite uudelleen samassa selaimessa ilman uutta buildia. Sama lista näkyy.</w:t>
+      </w:r>
+    </w:p>
+    <w:p>
+      <w:pPr>
+        <w:spacing w:after="40" w:before="0"/>
+        <w:ind w:left="360"/>
+      </w:pPr>
+      <w:r>
+        <w:rPr>
+          <w:sz w:val="19"/>
+          <w:szCs w:val="19"/>
+        </w:rPr>
+        <w:t xml:space="preserve">☐  5. Kirjoita päiväkirjan Miksi tein näin? -kenttään, miksi PlayerPrefs sopii tähän peliin. Kirjoita myös, että tiedot säilyvät vain tässä selaimessa ja että pelaaja voi itse muuttaa tai poistaa ne.</w:t>
+      </w:r>
+    </w:p>
+    <w:p>
+      <w:pPr>
+        <w:spacing w:after="40" w:before="0"/>
+        <w:ind w:left="360"/>
+      </w:pPr>
+      <w:r>
+        <w:rPr>
+          <w:sz w:val="19"/>
+          <w:szCs w:val="19"/>
+        </w:rPr>
+        <w:t xml:space="preserve">☐  6. Sulje GitHubissa tämän viikon valmiit issuet. Kirjoita jokaiseen ennen sulkemista kommentti, jossa on linkki commitiin, jossa työ tehtiin.</w:t>
       </w:r>
     </w:p>
     <w:p>
@@ -6034,7 +5891,7 @@
           <w:sz w:val="19"/>
           <w:szCs w:val="19"/>
         </w:rPr>
-        <w:t xml:space="preserve">Valmis kun: Neljän testin tulokset ja ratkaisun perustelu ovat päiväkirjassa.</w:t>
+        <w:t xml:space="preserve">Valmis kun: Kolmen testin tulokset ja ratkaisun perustelu ovat päiväkirjassa.</w:t>
       </w:r>
     </w:p>
     <w:p>
@@ -6061,7 +5918,7 @@
           <w:sz w:val="19"/>
           <w:szCs w:val="19"/>
         </w:rPr>
-        <w:t xml:space="preserve">Valmis kun: Kuudesta tuloksesta näkyy vain viisi parasta myös silloin, kun sivu avataan uudelleen. Tyhjä tallennus, tasapisteet ja liian pitkä nimimerkki on testattu.</w:t>
+        <w:t xml:space="preserve">Valmis kun: Kuudesta tuloksesta näkyy vain viisi parasta myös silloin, kun sivu avataan uudelleen. Tasapisteet ja liian pitkä nimimerkki on testattu.</w:t>
       </w:r>
     </w:p>
     <w:p>
@@ -6419,19 +6276,6 @@
       </w:pPr>
       <w:r>
         <w:rPr>
-          <w:sz w:val="19"/>
-          <w:szCs w:val="19"/>
-        </w:rPr>
-        <w:t xml:space="preserve">☐  7. Rastita Näyttömatriisi-näkymässä kohdat Asiakaslähtöinen viestintä, Priorisointi ja Suunnittelu ja arviointi. Kirjoita niiden työnäytteiden linkit päiväkirjan kenttään Missä työnäyte on?</w:t>
-      </w:r>
-    </w:p>
-    <w:p>
-      <w:pPr>
-        <w:spacing w:after="40" w:before="0"/>
-        <w:ind w:left="360"/>
-      </w:pPr>
-      <w:r>
-        <w:rPr>
           <w:color w:val="1d4ed8"/>
           <w:sz w:val="19"/>
           <w:szCs w:val="19"/>
@@ -6848,19 +6692,6 @@
       </w:pPr>
       <w:r>
         <w:rPr>
-          <w:sz w:val="19"/>
-          <w:szCs w:val="19"/>
-        </w:rPr>
-        <w:t xml:space="preserve">☐  7. Rastita Näyttömatriisi-näkymässä kohdan Osan liittäminen. Kirjoita sen työnäytteen linkki päiväkirjan kenttään Missä työnäyte on?</w:t>
-      </w:r>
-    </w:p>
-    <w:p>
-      <w:pPr>
-        <w:spacing w:after="40" w:before="0"/>
-        <w:ind w:left="360"/>
-      </w:pPr>
-      <w:r>
-        <w:rPr>
           <w:color w:val="1d4ed8"/>
           <w:sz w:val="19"/>
           <w:szCs w:val="19"/>
@@ -7224,19 +7055,6 @@
       </w:pPr>
       <w:r>
         <w:rPr>
-          <w:sz w:val="19"/>
-          <w:szCs w:val="19"/>
-        </w:rPr>
-        <w:t xml:space="preserve">☐  7. Rastita Näyttömatriisi-näkymässä kohdan Käyttöliittymä. Kirjoita sen työnäytteen linkki päiväkirjan kenttään Missä työnäyte on?</w:t>
-      </w:r>
-    </w:p>
-    <w:p>
-      <w:pPr>
-        <w:spacing w:after="40" w:before="0"/>
-        <w:ind w:left="360"/>
-      </w:pPr>
-      <w:r>
-        <w:rPr>
           <w:color w:val="1d4ed8"/>
           <w:sz w:val="19"/>
           <w:szCs w:val="19"/>
@@ -7639,19 +7457,6 @@
       </w:pPr>
       <w:r>
         <w:rPr>
-          <w:sz w:val="19"/>
-          <w:szCs w:val="19"/>
-        </w:rPr>
-        <w:t xml:space="preserve">☐  7. Rastita Näyttömatriisi-näkymässä kohdat Toimintojen testaus, Virheenkorjaus ja Suunnittelu, toteutus ja testaus kirjastolla. Kirjoita niiden työnäytteiden linkit päiväkirjan kenttään Missä työnäyte on?</w:t>
-      </w:r>
-    </w:p>
-    <w:p>
-      <w:pPr>
-        <w:spacing w:after="40" w:before="0"/>
-        <w:ind w:left="360"/>
-      </w:pPr>
-      <w:r>
-        <w:rPr>
           <w:color w:val="1d4ed8"/>
           <w:sz w:val="19"/>
           <w:szCs w:val="19"/>
@@ -7739,7 +7544,7 @@
           <w:sz w:val="21"/>
           <w:szCs w:val="21"/>
         </w:rPr>
-        <w:t xml:space="preserve">Tehtävä 1 / 4 · Etsi koodista yksi kohta, jota on vaikea ymmärtää.</w:t>
+        <w:t xml:space="preserve">Tehtävä 1 / 3 · Etsi koodista yksi kohta, jota on vaikea ymmärtää.</w:t>
       </w:r>
     </w:p>
     <w:p>
@@ -7833,7 +7638,7 @@
           <w:sz w:val="21"/>
           <w:szCs w:val="21"/>
         </w:rPr>
-        <w:t xml:space="preserve">Tehtävä 2 / 4 · Selkeytä kohta niin, että peli toimii kuten ennen.</w:t>
+        <w:t xml:space="preserve">Tehtävä 2 / 3 · Selkeytä kohta niin, että peli toimii kuten ennen.</w:t>
       </w:r>
     </w:p>
     <w:p>
@@ -7927,7 +7732,7 @@
           <w:sz w:val="21"/>
           <w:szCs w:val="21"/>
         </w:rPr>
-        <w:t xml:space="preserve">Tehtävä 3 / 4 · Pyydä koodikatselmointi ja vastaa palautteeseen.</w:t>
+        <w:t xml:space="preserve">Tehtävä 3 / 3 · Pyydä koodikatselmointi ja selitä ratkaisusi.</w:t>
       </w:r>
     </w:p>
     <w:p>
@@ -7953,33 +7758,46 @@
           <w:sz w:val="19"/>
           <w:szCs w:val="19"/>
         </w:rPr>
-        <w:t xml:space="preserve">☐  2. Näytä hänelle koodi ennen ja jälkeen muutoksen, esimerkiksi GitHubin commit-näkymästä.</w:t>
-      </w:r>
-    </w:p>
-    <w:p>
-      <w:pPr>
-        <w:spacing w:after="40" w:before="0"/>
-        <w:ind w:left="360"/>
-      </w:pPr>
-      <w:r>
-        <w:rPr>
-          <w:sz w:val="19"/>
-          <w:szCs w:val="19"/>
-        </w:rPr>
-        <w:t xml:space="preserve">☐  3. Kirjaa saamasi kommentti sellaisenaan.</w:t>
-      </w:r>
-    </w:p>
-    <w:p>
-      <w:pPr>
-        <w:spacing w:after="40" w:before="0"/>
-        <w:ind w:left="360"/>
-      </w:pPr>
-      <w:r>
-        <w:rPr>
-          <w:sz w:val="19"/>
-          <w:szCs w:val="19"/>
-        </w:rPr>
-        <w:t xml:space="preserve">☐  4. Vastaa kommenttiin: korjaa koodia tai perustele, miksi pidät ratkaisun.</w:t>
+        <w:t xml:space="preserve">☐  2. Näytä hänelle koodi ennen ja jälkeen muutoksen, esimerkiksi GitHubin commit-näkymästä. Kirjaa saamasi kommentti sellaisenaan.</w:t>
+      </w:r>
+    </w:p>
+    <w:p>
+      <w:pPr>
+        <w:spacing w:after="40" w:before="0"/>
+        <w:ind w:left="360"/>
+      </w:pPr>
+      <w:r>
+        <w:rPr>
+          <w:sz w:val="19"/>
+          <w:szCs w:val="19"/>
+        </w:rPr>
+        <w:t xml:space="preserve">☐  3. Vastaa kommenttiin: korjaa koodia tai perustele, miksi pidät ratkaisun.</w:t>
+      </w:r>
+    </w:p>
+    <w:p>
+      <w:pPr>
+        <w:spacing w:after="40" w:before="0"/>
+        <w:ind w:left="360"/>
+      </w:pPr>
+      <w:r>
+        <w:rPr>
+          <w:sz w:val="19"/>
+          <w:szCs w:val="19"/>
+        </w:rPr>
+        <w:t xml:space="preserve">☐  4. Selitä samalla tapaamisella suullisesti yksi kohta, jossa käytit tekoälyä apuna. Jos et käyttänyt tekoälyä, selitä avun työpohjasta otettu kohta.</w:t>
+      </w:r>
+    </w:p>
+    <w:p>
+      <w:pPr>
+        <w:spacing w:after="40" w:before="0"/>
+        <w:ind w:left="360"/>
+      </w:pPr>
+      <w:r>
+        <w:rPr>
+          <w:sz w:val="19"/>
+          <w:szCs w:val="19"/>
+        </w:rPr>
+        <w:t xml:space="preserve">☐  5. Tarkista, että tekoälyn käyttö on kirjattu AI-lokiin eli sivuston AI-loki-näkymään, johon kirjaat tekoälyn avun.</w:t>
       </w:r>
     </w:p>
     <w:p>
@@ -7993,7 +7811,7 @@
           <w:sz w:val="19"/>
           <w:szCs w:val="19"/>
         </w:rPr>
-        <w:t xml:space="preserve">Valmis kun: Päiväkirjassa ovat katselmoijan rooli, kommentti ja oma vastauksesi.</w:t>
+        <w:t xml:space="preserve">Valmis kun: Päiväkirjassa ovat katselmoijan rooli, hänen kommenttinsa, oma vastauksesi ja se, minkä kohdan selitit suullisesti.</w:t>
       </w:r>
     </w:p>
     <w:p>
@@ -8007,92 +7825,12 @@
           <w:sz w:val="19"/>
           <w:szCs w:val="19"/>
         </w:rPr>
-        <w:t xml:space="preserve">Tallenna työnäyte: Kommentti ja vastaus viikon 46 päiväkirjaan.</w:t>
-      </w:r>
-    </w:p>
-    <w:p>
-      <w:pPr>
-        <w:spacing w:after="60" w:before="120"/>
-      </w:pPr>
-      <w:r>
-        <w:rPr>
-          <w:b/>
-          <w:bCs/>
-          <w:sz w:val="21"/>
-          <w:szCs w:val="21"/>
-        </w:rPr>
-        <w:t xml:space="preserve">Tehtävä 4 / 4 · Selitä kaksi ratkaisua omin sanoin.</w:t>
-      </w:r>
-    </w:p>
-    <w:p>
-      <w:pPr>
-        <w:spacing w:after="40" w:before="0"/>
-        <w:ind w:left="360"/>
-      </w:pPr>
-      <w:r>
-        <w:rPr>
-          <w:sz w:val="19"/>
-          <w:szCs w:val="19"/>
-        </w:rPr>
-        <w:t xml:space="preserve">☐  1. Valitse kaksi kohtaa koodista: yksi, jonka kirjoitit itse, ja yksi, jossa käytit tekoälyä apuna. Jos et käyttänyt tekoälyä, valitse avun työpohjasta otettu kohta.</w:t>
-      </w:r>
-    </w:p>
-    <w:p>
-      <w:pPr>
-        <w:spacing w:after="40" w:before="0"/>
-        <w:ind w:left="360"/>
-      </w:pPr>
-      <w:r>
-        <w:rPr>
-          <w:sz w:val="19"/>
-          <w:szCs w:val="19"/>
-        </w:rPr>
-        <w:t xml:space="preserve">☐  2. Kirjoita kummastakin 3–5 virkettä ilman tekoälyä: mitä koodi tekee ja miksi se on tehty näin.</w:t>
-      </w:r>
-    </w:p>
-    <w:p>
-      <w:pPr>
-        <w:spacing w:after="40" w:before="0"/>
-        <w:ind w:left="360"/>
-      </w:pPr>
-      <w:r>
-        <w:rPr>
-          <w:sz w:val="19"/>
-          <w:szCs w:val="19"/>
-        </w:rPr>
-        <w:t xml:space="preserve">☐  3. Selitä toinen kohdista suullisesti ohjaajalle tai vertaiselle.</w:t>
-      </w:r>
-    </w:p>
-    <w:p>
-      <w:pPr>
-        <w:spacing w:after="40" w:before="0"/>
-        <w:ind w:left="360"/>
-      </w:pPr>
-      <w:r>
-        <w:rPr>
-          <w:sz w:val="19"/>
-          <w:szCs w:val="19"/>
-        </w:rPr>
-        <w:t xml:space="preserve">☐  4. Tarkista, että tekoälyn käyttö on kirjattu AI-lokiin eli sivuston AI-loki-näkymään, johon kirjaat tekoälyn avun.</w:t>
-      </w:r>
-    </w:p>
-    <w:p>
-      <w:pPr>
-        <w:spacing w:after="40" w:before="0"/>
-        <w:ind w:left="360"/>
-      </w:pPr>
-      <w:r>
-        <w:rPr>
-          <w:sz w:val="19"/>
-          <w:szCs w:val="19"/>
-        </w:rPr>
-        <w:t xml:space="preserve">☐  5. Rastita Näyttömatriisi-näkymässä kohdat Rakenteinen ohjelmointi, Ylläpidettävä koodi ja Ratkaisujen arviointi. Kirjoita niiden työnäytteiden linkit päiväkirjan kenttään Missä työnäyte on?</w:t>
-      </w:r>
-    </w:p>
-    <w:p>
-      <w:pPr>
-        <w:spacing w:after="40" w:before="0"/>
-        <w:ind w:left="360"/>
+        <w:t xml:space="preserve">Tallenna työnäyte: Kommentti, vastaus ja selitetty kohta viikon 46 päiväkirjaan. Tekoälyn käyttö AI-lokiin.</w:t>
+      </w:r>
+    </w:p>
+    <w:p>
+      <w:pPr>
+        <w:spacing w:after="60" w:before="0"/>
       </w:pPr>
       <w:r>
         <w:rPr>
@@ -8100,34 +7838,7 @@
           <w:sz w:val="19"/>
           <w:szCs w:val="19"/>
         </w:rPr>
-        <w:t xml:space="preserve">Valmis kun: Molemmat selitykset ja suullisen selityksen kuulijan rooli ovat päiväkirjassa, ja tekoälyn käyttö on AI-lokissa.</w:t>
-      </w:r>
-    </w:p>
-    <w:p>
-      <w:pPr>
-        <w:spacing w:after="80" w:before="0"/>
-        <w:ind w:left="360"/>
-      </w:pPr>
-      <w:r>
-        <w:rPr>
-          <w:color w:val="555555"/>
-          <w:sz w:val="19"/>
-          <w:szCs w:val="19"/>
-        </w:rPr>
-        <w:t xml:space="preserve">Tallenna työnäyte: Selitykset viikon 46 päiväkirjaan ja merkintä AI-lokiin.</w:t>
-      </w:r>
-    </w:p>
-    <w:p>
-      <w:pPr>
-        <w:spacing w:after="60" w:before="0"/>
-      </w:pPr>
-      <w:r>
-        <w:rPr>
-          <w:color w:val="1d4ed8"/>
-          <w:sz w:val="19"/>
-          <w:szCs w:val="19"/>
-        </w:rPr>
-        <w:t xml:space="preserve">Valmis kun: Sama testitapaus läpäisee ennen ja jälkeen refaktoroinnin. Katselmointikommenttiin on vastattu, ja osaat selittää ratkaisut ilman tekoälyä.</w:t>
+        <w:t xml:space="preserve">Valmis kun: Sama testitapaus läpäisee ennen ja jälkeen refaktoroinnin. Katselmointikommenttiin on vastattu, ja osaat selittää ratkaisusi ilman tekoälyä.</w:t>
       </w:r>
     </w:p>
     <w:p>
@@ -8473,19 +8184,6 @@
       </w:pPr>
       <w:r>
         <w:rPr>
-          <w:sz w:val="19"/>
-          <w:szCs w:val="19"/>
-        </w:rPr>
-        <w:t xml:space="preserve">☐  6. Rastita Näyttömatriisi-näkymässä kohdan Version katselmointi. Kirjoita sen työnäytteen linkki päiväkirjan kenttään Missä työnäyte on?</w:t>
-      </w:r>
-    </w:p>
-    <w:p>
-      <w:pPr>
-        <w:spacing w:after="40" w:before="0"/>
-        <w:ind w:left="360"/>
-      </w:pPr>
-      <w:r>
-        <w:rPr>
           <w:color w:val="1d4ed8"/>
           <w:sz w:val="19"/>
           <w:szCs w:val="19"/>
@@ -8969,19 +8667,6 @@
       </w:pPr>
       <w:r>
         <w:rPr>
-          <w:sz w:val="19"/>
-          <w:szCs w:val="19"/>
-        </w:rPr>
-        <w:t xml:space="preserve">☐  5. Rastita Näyttömatriisi-näkymässä kohdat Versionhallinta, Tuotantojulkaisu, Julkaisu asiakkaan ympäristöön, Kirjaston mahdollisuudet ja rajoitteet ja Ulkoiset komponentit. Kirjoita niiden työnäytteiden linkit päiväkirjan kenttään Missä työnäyte on?</w:t>
-      </w:r>
-    </w:p>
-    <w:p>
-      <w:pPr>
-        <w:spacing w:after="40" w:before="0"/>
-        <w:ind w:left="360"/>
-      </w:pPr>
-      <w:r>
-        <w:rPr>
           <w:color w:val="1d4ed8"/>
           <w:sz w:val="19"/>
           <w:szCs w:val="19"/>
@@ -9118,24 +8803,11 @@
       </w:pPr>
       <w:r>
         <w:rPr>
-          <w:sz w:val="19"/>
-          <w:szCs w:val="19"/>
-        </w:rPr>
-        <w:t xml:space="preserve">☐  4. Paina Projektipäiväkirja-näkymän painiketta Lataa koko päiväkirja (.md). Korvaa tiedosto project-docs/projektipaivakirja.md ladatulla tiedostolla. Tee commit ja push.</w:t>
-      </w:r>
-    </w:p>
-    <w:p>
-      <w:pPr>
-        <w:spacing w:after="40" w:before="0"/>
-        <w:ind w:left="360"/>
-      </w:pPr>
-      <w:r>
-        <w:rPr>
           <w:color w:val="1d4ed8"/>
           <w:sz w:val="19"/>
           <w:szCs w:val="19"/>
         </w:rPr>
-        <w:t xml:space="preserve">Valmis kun: Kaikki 15 viikkoa on kirjattu, ja ladattu päiväkirja on repositoryssa.</w:t>
+        <w:t xml:space="preserve">Valmis kun: Kaikki 15 viikkoa on kirjattu, ja jokaisen viikon työnäytelinkki aukeaa.</w:t>
       </w:r>
     </w:p>
     <w:p>
@@ -9149,7 +8821,7 @@
           <w:sz w:val="19"/>
           <w:szCs w:val="19"/>
         </w:rPr>
-        <w:t xml:space="preserve">Tallenna työnäyte: project-docs/projektipaivakirja.md, commit ja push.</w:t>
+        <w:t xml:space="preserve">Tallenna työnäyte: Täydennetyt viikkomerkinnät sivuston projektipäiväkirjassa. Lataat tiedoston repositoryyn tehtävässä 5.</w:t>
       </w:r>
     </w:p>
     <w:p>
@@ -9471,7 +9143,7 @@
           <w:sz w:val="19"/>
           <w:szCs w:val="19"/>
         </w:rPr>
-        <w:t xml:space="preserve">☐  1. Lataa projektipäiväkirja uudelleen, koska viikon 49 merkinnät muuttuivat tehtävissä 2–4, ja korvaa repositoryn tiedosto. Tarkista, että repositoryssa ovat peli, README.md, gdd.md, testaus.md ja projektipaivakirja.md.</w:t>
+        <w:t xml:space="preserve">☐  1. Paina Projektipäiväkirja-näkymän painiketta Lataa koko päiväkirja (.md) ja korvaa repositoryn tiedosto project-docs/projektipaivakirja.md. Tee commit ja push. Tarkista, että repositoryssa ovat peli, README.md, gdd.md, testaus.md ja projektipaivakirja.md.</w:t>
       </w:r>
     </w:p>
     <w:p>

</xml_diff>

<commit_message>
KahvilaKoodi: ratkaise tehtävänannon ristiriidat
products.json + JsonUtility ja PlayerPrefs ovat sovittu toteutustapa; viikolla
40 PlayerPrefsiä verrataan vähintään yhteen vaihtoehtoon (s8, k2), uusi osa
työvaiheen 40-5 loppuun. Viikon 39 lopputarkistus omilla raja-arvoilla.
Dokumentointipohjien kuvaus korjattu opettajan lähdeaineistoksi ja pohjien
mitoitus lisätty (kuusi kysymystä, viikot). Linkitetty näyttömatriisi
nayttomatriisi.md (48-3:n loppuun). Julkiseen repoon vain roolit; ohjaaja on
asiakkaan sijainen. Osatehtävien järjestys ennallaan: uudet osat vain loppuun.

Co-Authored-By: Claude Opus 5.5 <noreply@anthropic.com>
</commit_message>
<xml_diff>
--- a/downloads/kahvilakoodi-tyopaketti.docx
+++ b/downloads/kahvilakoodi-tyopaketti.docx
@@ -2204,7 +2204,7 @@
           <w:sz w:val="19"/>
           <w:szCs w:val="19"/>
         </w:rPr>
-        <w:t xml:space="preserve">☐  2. Kysy kysymykset yksi kerrallaan. Kirjoita vastaus heti ylös asiakkaan omin sanoin.</w:t>
+        <w:t xml:space="preserve">☐  2. Kysy kysymykset yksi kerrallaan. Kirjoita vastauksen sisältö heti ylös. Nimet ja sanatarkat lausumat lähetät tarvittaessa ohjaajalle Teamsissa.</w:t>
       </w:r>
     </w:p>
     <w:p>
@@ -5465,7 +5465,7 @@
           <w:sz w:val="19"/>
           <w:szCs w:val="19"/>
         </w:rPr>
-        <w:t xml:space="preserve">Valmis kun: Pisteillä 0, 31 ja 61 peli käyttää eri tasoa, ja tason arvot voi muuttaa Inspectorissa.</w:t>
+        <w:t xml:space="preserve">Valmis kun: Omilla raja-arvoillasi (esimerkiksi 0, 31 ja 61) peli käyttää eri tasoa, ja tason arvot voi muuttaa Inspectorissa.</w:t>
       </w:r>
     </w:p>
     <w:p>
@@ -5614,7 +5614,7 @@
           <w:sz w:val="19"/>
           <w:szCs w:val="19"/>
         </w:rPr>
-        <w:t xml:space="preserve">Viikon lopputarkistus: Valinta on perusteltu. Pisteillä 0, 31 ja 61 tilauksen koko tai asiakkaan odotusaika muuttuu tasojen mukaan joka kerta, eikä jokaiselle tasolle tarvita omaa if-lausetta.</w:t>
+        <w:t xml:space="preserve">Viikon lopputarkistus: Valinta on perusteltu. Omilla raja-arvoillasi (esimerkiksi 0, 31 ja 61) tilauksen koko tai asiakkaan odotusaika muuttuu tasojen mukaan joka kerta, eikä jokaiselle tasolle tarvita omaa if-lausetta.</w:t>
       </w:r>
     </w:p>
     <w:p>
@@ -6223,11 +6223,24 @@
       </w:pPr>
       <w:r>
         <w:rPr>
+          <w:sz w:val="19"/>
+          <w:szCs w:val="19"/>
+        </w:rPr>
+        <w:t xml:space="preserve">☐  7. Vertaa sovittua PlayerPrefsiä vähintään yhteen vaihtoehtoon, esimerkiksi JSON-tiedostoon tai palvelimeen, ja kirjaa päiväkirjaan, miksi se sopii pieneen selainpeliin. Jos vertailu puoltaa selvästi muuta, poikkeamasta sovitaan ohjaajan kanssa ennen seuraavaa toteutusviikkoa.</w:t>
+      </w:r>
+    </w:p>
+    <w:p>
+      <w:pPr>
+        <w:spacing w:after="40" w:before="0"/>
+        <w:ind w:left="360"/>
+      </w:pPr>
+      <w:r>
+        <w:rPr>
           <w:color w:val="1d4ed8"/>
           <w:sz w:val="19"/>
           <w:szCs w:val="19"/>
         </w:rPr>
-        <w:t xml:space="preserve">Valmis kun: Kolmen testin tulokset ja ratkaisun perustelu ovat päiväkirjassa.</w:t>
+        <w:t xml:space="preserve">Valmis kun: Kolmen testin tulokset ja ratkaisun perustelu vertailuineen ovat päiväkirjassa.</w:t>
       </w:r>
     </w:p>
     <w:p>
@@ -6241,7 +6254,7 @@
           <w:sz w:val="19"/>
           <w:szCs w:val="19"/>
         </w:rPr>
-        <w:t xml:space="preserve">Tallenna työnäyte: Testitulokset, perustelu ja commit-linkit viikon 40 päiväkirjaan.</w:t>
+        <w:t xml:space="preserve">Tallenna työnäyte: Testitulokset, perustelu, vertailu ja commit-linkit viikon 40 päiväkirjaan.</w:t>
       </w:r>
     </w:p>
     <w:p>
@@ -6256,7 +6269,7 @@
           <w:sz w:val="19"/>
           <w:szCs w:val="19"/>
         </w:rPr>
-        <w:t xml:space="preserve">Viikon lopputarkistus: Kuudesta tuloksesta näkyy vain viisi parasta myös silloin, kun sivu avataan uudelleen. Tasapisteet ja liian pitkä nimimerkki on testattu.</w:t>
+        <w:t xml:space="preserve">Viikon lopputarkistus: Kuudesta tuloksesta näkyy vain viisi parasta myös silloin, kun sivu avataan uudelleen. Tasapisteet ja liian pitkä nimimerkki on testattu, ja PlayerPrefs on perusteltu vertaamalla sitä vähintään yhteen vaihtoehtoon.</w:t>
       </w:r>
     </w:p>
     <w:p>
@@ -6269,7 +6282,7 @@
           <w:sz w:val="19"/>
           <w:szCs w:val="19"/>
         </w:rPr>
-        <w:t xml:space="preserve">Työnäyte Git-repositoryyn ennen rastia: tallennuksen commitit, neljän testin tulokset (kuusi tulosta, tasapisteet, uudelleenavaus ja nimimerkin tarkistus) ja ratkaisun perustelu päiväkirjassa.</w:t>
+        <w:t xml:space="preserve">Työnäyte Git-repositoryyn ennen rastia: tallennuksen commitit, neljän testin tulokset (kuusi tulosta, tasapisteet, uudelleenavaus ja nimimerkin tarkistus) sekä ratkaisun perustelu ja vertailu päiväkirjassa.</w:t>
       </w:r>
     </w:p>
     <w:p>
@@ -6309,7 +6322,7 @@
           <w:sz w:val="19"/>
           <w:szCs w:val="19"/>
         </w:rPr>
-        <w:t xml:space="preserve">Yhteys kokonaisprojektiin: Viikoilla 36–40 rakensit toimeksiannon kaikki vaatimukset, ja nyt asiakas kokeilee niitä ensimmäistä kertaa omin käsin. Tarkkailet neuvomatta, missä tilaus, tuotteiden valinta tai palaute jää epäselväksi, ja erotat asiakkaan sanat omasta tulkinnastasi. Sovittu muutos tehdään syysloman jälkeen viikolla 43.</w:t>
+        <w:t xml:space="preserve">Yhteys kokonaisprojektiin: Viikoilla 36–40 rakensit toimeksiannon kaikki vaatimukset, ja nyt asiakas kokeilee niitä ensimmäistä kertaa omin käsin. Tarkkailet neuvomatta, missä tilaus, tuotteiden valinta tai palaute jää epäselväksi, ja erotat asiakkaan palautteen omasta tulkinnastasi. Sovittu muutos tehdään syysloman jälkeen viikolla 43.</w:t>
       </w:r>
     </w:p>
     <w:p>
@@ -6389,7 +6402,7 @@
           <w:sz w:val="19"/>
           <w:szCs w:val="19"/>
         </w:rPr>
-        <w:t xml:space="preserve">☐  4. Sovi ohjaajan kanssa katselmoinnin aika. Katselmointi on tapaaminen, jossa asiakas kokeilee keskeneräistä peliä ja antaa palautetta.</w:t>
+        <w:t xml:space="preserve">☐  4. Sovi ohjaajan kanssa katselmoinnin aika ja se, kuka nimetty edustaja esittää asiakasta. Katselmointi on tapaaminen, jossa asiakas kokeilee keskeneräistä peliä ja antaa palautetta.</w:t>
       </w:r>
     </w:p>
     <w:p>
@@ -6470,7 +6483,7 @@
           <w:sz w:val="19"/>
           <w:szCs w:val="19"/>
         </w:rPr>
-        <w:t xml:space="preserve">☐  2. Kirjoita ylös asiakkaan sanat sellaisinaan, esimerkiksi ”En huomannut tilausta”.</w:t>
+        <w:t xml:space="preserve">☐  2. Kirjoita ylös asiakkaan palaute ilman nimiä, esimerkiksi: asiakkaan edustaja ei huomannut tilausta. Sanatarkat lausumat lähetät tarvittaessa ohjaajalle Teamsissa.</w:t>
       </w:r>
     </w:p>
     <w:p>
@@ -6523,7 +6536,7 @@
           <w:sz w:val="19"/>
           <w:szCs w:val="19"/>
         </w:rPr>
-        <w:t xml:space="preserve">Valmis kun: Muistiinpanoissa ovat asiakkaan sanat ja omat havaintosi erikseen.</w:t>
+        <w:t xml:space="preserve">Valmis kun: Muistiinpanoissa ovat asiakkaan palaute ja omat havaintosi erikseen, ja henkilöistä on kirjattu vain roolit.</w:t>
       </w:r>
     </w:p>
     <w:p>
@@ -6577,7 +6590,7 @@
           <w:sz w:val="19"/>
           <w:szCs w:val="19"/>
         </w:rPr>
-        <w:t xml:space="preserve">☐  2. Tee muutoksesta GitHub-issue: otsikko verbillä, asiakkaan alkuperäinen palaute, arvio ja Valmis kun -ehto.</w:t>
+        <w:t xml:space="preserve">☐  2. Tee muutoksesta GitHub-issue: otsikko verbillä, asiakkaan palaute ilman nimiä, arvio ja Valmis kun -ehto.</w:t>
       </w:r>
     </w:p>
     <w:p>
@@ -6629,7 +6642,7 @@
           <w:sz w:val="19"/>
           <w:szCs w:val="19"/>
         </w:rPr>
-        <w:t xml:space="preserve">☐  6. Kirjoita katselmointimuistio päiväkirjaan: päivä, osallistujien roolit, asiakkaan sanat, oma tulkinta ja päätös.</w:t>
+        <w:t xml:space="preserve">☐  6. Kirjoita katselmointimuistio päiväkirjaan: päivä, osallistujien roolit, asiakkaan palaute, oma tulkinta ja päätös.</w:t>
       </w:r>
     </w:p>
     <w:p>
@@ -6672,7 +6685,7 @@
           <w:sz w:val="19"/>
           <w:szCs w:val="19"/>
         </w:rPr>
-        <w:t xml:space="preserve">Viikon lopputarkistus: Asiakas on pelannut pelin alusta loppuun. Muistiossa näkyvät asiakkaan sanat, oma tulkinta, päätös, hyväksyjä ja yksi rajattu issue.</w:t>
+        <w:t xml:space="preserve">Viikon lopputarkistus: Asiakas on pelannut pelin alusta loppuun. Muistiossa näkyvät asiakkaan palaute, oma tulkinta, päätös, hyväksyjän rooli ja yksi rajattu issue.</w:t>
       </w:r>
     </w:p>
     <w:p>
@@ -6778,7 +6791,7 @@
           <w:sz w:val="19"/>
           <w:szCs w:val="19"/>
         </w:rPr>
-        <w:t xml:space="preserve">☐  1. Avaa viikolla 41 tekemäsi muutosissue GitHubissa ja lue asiakkaan alkuperäinen palaute.</w:t>
+        <w:t xml:space="preserve">☐  1. Avaa viikolla 41 tekemäsi muutosissue GitHubissa ja lue siihen kirjattu asiakkaan palaute.</w:t>
       </w:r>
     </w:p>
     <w:p>
@@ -8173,7 +8186,7 @@
           <w:sz w:val="19"/>
           <w:szCs w:val="19"/>
         </w:rPr>
-        <w:t xml:space="preserve">☐  2. Näytä hänelle koodi ennen ja jälkeen muutoksen, esimerkiksi GitHubin commit-näkymästä. Kirjaa saamasi kommentti sellaisenaan.</w:t>
+        <w:t xml:space="preserve">☐  2. Näytä hänelle koodi ennen ja jälkeen muutoksen, esimerkiksi GitHubin commit-näkymästä. Kirjaa saamasi kommentin sisältö ja katselmoijan rooli.</w:t>
       </w:r>
     </w:p>
     <w:p>
@@ -8456,7 +8469,7 @@
           <w:sz w:val="19"/>
           <w:szCs w:val="19"/>
         </w:rPr>
-        <w:t xml:space="preserve">☐  1. Pyydä asiakasta ja yhtä muuta ihmistä testaamaan julkaisuehdokas (RC1).</w:t>
+        <w:t xml:space="preserve">☐  1. Pyydä asiakkaan nimettyä edustajaa ja yhtä muuta ihmistä testaamaan julkaisuehdokas (RC1).</w:t>
       </w:r>
     </w:p>
     <w:p>
@@ -8495,7 +8508,7 @@
           <w:sz w:val="19"/>
           <w:szCs w:val="19"/>
         </w:rPr>
-        <w:t xml:space="preserve">☐  4. Kirjaa jokainen havainto erikseen: kuka testasi (rooli), mitä tapahtui ja missä kohdassa.</w:t>
+        <w:t xml:space="preserve">☐  4. Kirjaa jokainen havainto erikseen: kuka testasi (rooli, esimerkiksi asiakkaan edustaja tai testaaja A), mitä tapahtui ja missä kohdassa.</w:t>
       </w:r>
     </w:p>
     <w:p>
@@ -9014,11 +9027,24 @@
       </w:pPr>
       <w:r>
         <w:rPr>
+          <w:sz w:val="19"/>
+          <w:szCs w:val="19"/>
+        </w:rPr>
+        <w:t xml:space="preserve">☐  6. Perusta tiedosto project-docs/nayttomatriisi.md: jokaista vaatimusta kohti rivi, jossa ovat tunnus, työnäytteen linkki ja viikko. Täytä jo rivit, joiden linkin tiedät, esimerkiksi julkaisu ja v1.0-tagi.</w:t>
+      </w:r>
+    </w:p>
+    <w:p>
+      <w:pPr>
+        <w:spacing w:after="40" w:before="0"/>
+        <w:ind w:left="360"/>
+      </w:pPr>
+      <w:r>
+        <w:rPr>
           <w:color w:val="1d4ed8"/>
           <w:sz w:val="19"/>
           <w:szCs w:val="19"/>
         </w:rPr>
-        <w:t xml:space="preserve">Valmis kun: README:ssä ovat julkaisulinkki, käyttöohje, tunnetut puutteet ja lähteet.</w:t>
+        <w:t xml:space="preserve">Valmis kun: README:ssä ovat julkaisulinkki, käyttöohje, tunnetut puutteet ja lähteet, ja project-docs/nayttomatriisi.md on perustettu.</w:t>
       </w:r>
     </w:p>
     <w:p>
@@ -9032,7 +9058,7 @@
           <w:sz w:val="19"/>
           <w:szCs w:val="19"/>
         </w:rPr>
-        <w:t xml:space="preserve">Tallenna työnäyte: README.md, commit ja push.</w:t>
+        <w:t xml:space="preserve">Tallenna työnäyte: README.md ja project-docs/nayttomatriisi.md, commit ja push.</w:t>
       </w:r>
     </w:p>
     <w:p>
@@ -9154,7 +9180,7 @@
           <w:sz w:val="19"/>
           <w:szCs w:val="19"/>
         </w:rPr>
-        <w:t xml:space="preserve">Työnäyte Git-repositoryyn ennen rastia: julkaisulinkki, v1.0-tagi, testitulos toiselta laitteelta ja README käyttöohjeineen.</w:t>
+        <w:t xml:space="preserve">Työnäyte Git-repositoryyn ennen rastia: julkaisulinkki, v1.0-tagi, testitulos toiselta laitteelta, README käyttöohjeineen ja perustettu project-docs/nayttomatriisi.md.</w:t>
       </w:r>
     </w:p>
     <w:p>
@@ -9435,7 +9461,7 @@
           <w:sz w:val="19"/>
           <w:szCs w:val="19"/>
         </w:rPr>
-        <w:t xml:space="preserve">☐  4. Kirjoita viikon 49 päiväkirjaan omalle rivilleen vaatimuksen nimi ja linkki. Rastita sitten vaatimus Näyttömatriisi-näkymässä.</w:t>
+        <w:t xml:space="preserve">☐  4. Kirjoita tiedostoon project-docs/nayttomatriisi.md vaatimuksen riville tunnus, linkki ja viikko. Rastita sitten vaatimus Näyttömatriisi-näkymässä: rasti on oma muistilistasi.</w:t>
       </w:r>
     </w:p>
     <w:p>
@@ -9462,7 +9488,7 @@
           <w:sz w:val="19"/>
           <w:szCs w:val="19"/>
         </w:rPr>
-        <w:t xml:space="preserve">Valmis kun: Jokaisella näyttömatriisin vaatimuksella on tarkka linkki, joka aukeaa.</w:t>
+        <w:t xml:space="preserve">Valmis kun: Tiedostossa project-docs/nayttomatriisi.md on jokaiselle 32 vaatimukselle rivi, ja jokaisen rivin tarkka linkki aukeaa.</w:t>
       </w:r>
     </w:p>
     <w:p>
@@ -9476,7 +9502,7 @@
           <w:sz w:val="19"/>
           <w:szCs w:val="19"/>
         </w:rPr>
-        <w:t xml:space="preserve">Tallenna työnäyte: Vaatimusten linkit viikon 49 päiväkirjaan, josta ne tulevat mukaan projektipaivakirja.md-tiedostoon.</w:t>
+        <w:t xml:space="preserve">Tallenna työnäyte: project-docs/nayttomatriisi.md, commit ja push. Linkki tiedostoon viikon 49 päiväkirjaan.</w:t>
       </w:r>
     </w:p>
     <w:p>
@@ -9597,7 +9623,7 @@
           <w:sz w:val="19"/>
           <w:szCs w:val="19"/>
         </w:rPr>
-        <w:t xml:space="preserve">☐  1. Paina Projektipäiväkirja-näkymän painiketta Lataa koko päiväkirja (.md) ja korvaa repositoryn tiedosto project-docs/projektipaivakirja.md. Tee commit ja push. Tarkista, että repositoryssa ovat peli, README.md, gdd.md, testaus.md ja projektipaivakirja.md.</w:t>
+        <w:t xml:space="preserve">☐  1. Paina Projektipäiväkirja-näkymän painiketta Lataa koko päiväkirja (.md) ja korvaa repositoryn tiedosto project-docs/projektipaivakirja.md. Tee commit ja push. Tarkista, että repositoryssa ovat peli, README.md, gdd.md, testaus.md, projektipaivakirja.md ja nayttomatriisi.md.</w:t>
       </w:r>
     </w:p>
     <w:p>
@@ -9679,7 +9705,7 @@
           <w:sz w:val="19"/>
           <w:szCs w:val="19"/>
         </w:rPr>
-        <w:t xml:space="preserve">Viikon lopputarkistus: Jokaisessa näyttömatriisin kohdassa on tarkka linkki, joka aukeaa. Projektipäiväkirja ja AI-loki ovat repositoryssa, ja demo käyttää samaa v1.0-versiota.</w:t>
+        <w:t xml:space="preserve">Viikon lopputarkistus: Tiedoston project-docs/nayttomatriisi.md jokaisella rivillä on tarkka linkki, joka aukeaa. Projektipäiväkirja ja AI-loki ovat repositoryssa, ja demo käyttää samaa v1.0-versiota.</w:t>
       </w:r>
     </w:p>
     <w:p>
@@ -9692,7 +9718,7 @@
           <w:sz w:val="19"/>
           <w:szCs w:val="19"/>
         </w:rPr>
-        <w:t xml:space="preserve">Työnäyte Git-repositoryyn ennen rastia: peli, repository, project-docs/projektipaivakirja.md, näyttömatriisi, AI-loki ja demo.</w:t>
+        <w:t xml:space="preserve">Työnäyte Git-repositoryyn ennen rastia: peli, repository, project-docs/projektipaivakirja.md, project-docs/nayttomatriisi.md, AI-loki ja demo.</w:t>
       </w:r>
     </w:p>
     <w:p>

</xml_diff>

<commit_message>
KahvilaKoodi: GitHub Desktop -kuvaohje viikolle 34
Linkitetään sama GitHub Desktop -kuvaohje, joka on koontirepon projekteissa
(projektikoontisivu/ohjeet/github-desktop), Unity-muodossa
(?projekti=kahvilakoodi):
- viikon 34 resurssilinkki "GitHub Desktop: kuvaohje ilman Git-komentoja"
- työvaihe 34-4: asennus ja kirjautuminen (noreply-sähköposti) ensin,
  kloonaus = kuvaohjeen reitti C; avussa linkit asennukseen ja kloonaukseen
- työvaihe 34-5: avussa linkit commit- ja push-kohtiin
- Projektin kokonaiskuva: linkki Git, GitHub Desktop ja GitHub -kohdassa
- työpaketti: viikon resurssilinkit mukaan (resurssienPerusosoite)

Co-Authored-By: Claude Opus 5.5 <noreply@anthropic.com>
</commit_message>
<xml_diff>
--- a/downloads/kahvilakoodi-tyopaketti.docx
+++ b/downloads/kahvilakoodi-tyopaketti.docx
@@ -4,7 +4,7 @@
   <w:body>
     <w:p>
       <w:pPr>
-        <w:spacing w:before="2400" w:after="200"/>
+        <w:spacing w:after="200" w:before="2400"/>
         <w:jc w:val="center"/>
       </w:pPr>
       <w:r>
@@ -68,7 +68,7 @@
     <w:p>
       <w:pPr>
         <w:pStyle w:val="Heading1"/>
-        <w:spacing w:before="320" w:after="160"/>
+        <w:spacing w:after="160" w:before="320"/>
       </w:pPr>
       <w:r>
         <w:rPr>
@@ -146,7 +146,7 @@
     <w:p>
       <w:pPr>
         <w:pStyle w:val="Heading2"/>
-        <w:spacing w:before="260" w:after="120"/>
+        <w:spacing w:after="120" w:before="260"/>
       </w:pPr>
       <w:r>
         <w:rPr>
@@ -315,7 +315,7 @@
     <w:p>
       <w:pPr>
         <w:pStyle w:val="Heading1"/>
-        <w:spacing w:before="320" w:after="160"/>
+        <w:spacing w:after="160" w:before="320"/>
       </w:pPr>
       <w:r>
         <w:rPr>
@@ -1996,7 +1996,7 @@
     <w:p>
       <w:pPr>
         <w:pStyle w:val="Heading1"/>
-        <w:spacing w:before="320" w:after="160"/>
+        <w:spacing w:after="160" w:before="320"/>
       </w:pPr>
       <w:r>
         <w:rPr>
@@ -2010,7 +2010,7 @@
     <w:p>
       <w:pPr>
         <w:pStyle w:val="Heading2"/>
-        <w:spacing w:before="260" w:after="120"/>
+        <w:spacing w:after="120" w:before="260"/>
       </w:pPr>
       <w:r>
         <w:rPr>
@@ -2046,6 +2046,28 @@
         </w:rPr>
         <w:t xml:space="preserve">Viikon tavoite: Tyhjä CafeGame-peli aukeaa selaimessa, ja tiedät asiakkaan vastauksista, millainen peli tehdään ja kenelle.</w:t>
       </w:r>
+    </w:p>
+    <w:p>
+      <w:pPr>
+        <w:spacing w:after="80"/>
+      </w:pPr>
+      <w:r>
+        <w:rPr>
+          <w:sz w:val="19"/>
+          <w:szCs w:val="19"/>
+        </w:rPr>
+        <w:t xml:space="preserve">Kuvaohje tai materiaali: </w:t>
+      </w:r>
+      <w:hyperlink w:history="1" r:id="rId4hp1puo1dqv_p2mor9w11">
+        <w:r>
+          <w:rPr>
+            <w:rStyle w:val="Hyperlink"/>
+            <w:sz w:val="19"/>
+            <w:szCs w:val="19"/>
+          </w:rPr>
+          <w:t xml:space="preserve">GitHub Desktop: kuvaohje ilman Git-komentoja</w:t>
+        </w:r>
+      </w:hyperlink>
     </w:p>
     <w:p>
       <w:pPr>
@@ -2431,59 +2453,72 @@
           <w:sz w:val="19"/>
           <w:szCs w:val="19"/>
         </w:rPr>
-        <w:t xml:space="preserve">☐  1. Luo GitHubiin uusi repository. Valitse Public, ellei ohjaaja päätä toisin: ilmaistilillä GitHub Pages toimii vain julkisessa repositoryssa.</w:t>
-      </w:r>
-    </w:p>
-    <w:p>
-      <w:pPr>
-        <w:spacing w:after="40" w:before="0"/>
-        <w:ind w:left="360"/>
-      </w:pPr>
-      <w:r>
-        <w:rPr>
-          <w:sz w:val="19"/>
-          <w:szCs w:val="19"/>
-        </w:rPr>
-        <w:t xml:space="preserve">☐  2. Valitse kohtaan Add .gitignore pohja Unity. Se pitää Unityn väliaikaiset kansiot, kuten Library ja Temp, poissa versionhallinnasta.</w:t>
-      </w:r>
-    </w:p>
-    <w:p>
-      <w:pPr>
-        <w:spacing w:after="40" w:before="0"/>
-        <w:ind w:left="360"/>
-      </w:pPr>
-      <w:r>
-        <w:rPr>
-          <w:sz w:val="19"/>
-          <w:szCs w:val="19"/>
-        </w:rPr>
-        <w:t xml:space="preserve">☐  3. Kloonaa eli kopioi repository koneellesi GitHub Desktopilla: File → Clone repository.</w:t>
-      </w:r>
-    </w:p>
-    <w:p>
-      <w:pPr>
-        <w:spacing w:after="40" w:before="0"/>
-        <w:ind w:left="360"/>
-      </w:pPr>
-      <w:r>
-        <w:rPr>
-          <w:sz w:val="19"/>
-          <w:szCs w:val="19"/>
-        </w:rPr>
-        <w:t xml:space="preserve">☐  4. Sulje Unity. Siirrä CafeGame-projektin kansiot ja tiedostot repositoryn kansioon.</w:t>
-      </w:r>
-    </w:p>
-    <w:p>
-      <w:pPr>
-        <w:spacing w:after="40" w:before="0"/>
-        <w:ind w:left="360"/>
-      </w:pPr>
-      <w:r>
-        <w:rPr>
-          <w:sz w:val="19"/>
-          <w:szCs w:val="19"/>
-        </w:rPr>
-        <w:t xml:space="preserve">☐  5. Lisää projekti uudesta paikasta Unity Hubiin: Add → Add project from disk. Avaa projekti ja tarkista, että CafeGame-scene aukeaa.</w:t>
+        <w:t xml:space="preserve">☐  1. Asenna GitHub Desktop ja kirjaudu sisään kuvaohjeen kohtien 1–2 mukaan. Kirjoita tekijätietoihin sovittu tekijänimi ja GitHubin noreply-sähköposti.</w:t>
+      </w:r>
+    </w:p>
+    <w:p>
+      <w:pPr>
+        <w:spacing w:after="40" w:before="0"/>
+        <w:ind w:left="360"/>
+      </w:pPr>
+      <w:r>
+        <w:rPr>
+          <w:sz w:val="19"/>
+          <w:szCs w:val="19"/>
+        </w:rPr>
+        <w:t xml:space="preserve">☐  2. Luo GitHubiin uusi repository. Valitse Public, ellei ohjaaja päätä toisin: ilmaistilillä GitHub Pages toimii vain julkisessa repositoryssa.</w:t>
+      </w:r>
+    </w:p>
+    <w:p>
+      <w:pPr>
+        <w:spacing w:after="40" w:before="0"/>
+        <w:ind w:left="360"/>
+      </w:pPr>
+      <w:r>
+        <w:rPr>
+          <w:sz w:val="19"/>
+          <w:szCs w:val="19"/>
+        </w:rPr>
+        <w:t xml:space="preserve">☐  3. Valitse kohtaan Add .gitignore pohja Unity. Se pitää Unityn väliaikaiset kansiot, kuten Library ja Temp, poissa versionhallinnasta.</w:t>
+      </w:r>
+    </w:p>
+    <w:p>
+      <w:pPr>
+        <w:spacing w:after="40" w:before="0"/>
+        <w:ind w:left="360"/>
+      </w:pPr>
+      <w:r>
+        <w:rPr>
+          <w:sz w:val="19"/>
+          <w:szCs w:val="19"/>
+        </w:rPr>
+        <w:t xml:space="preserve">☐  4. Kloonaa eli kopioi repository koneellesi GitHub Desktopilla: File → Clone repository → URL. Tämä on kuvaohjeen reitti C.</w:t>
+      </w:r>
+    </w:p>
+    <w:p>
+      <w:pPr>
+        <w:spacing w:after="40" w:before="0"/>
+        <w:ind w:left="360"/>
+      </w:pPr>
+      <w:r>
+        <w:rPr>
+          <w:sz w:val="19"/>
+          <w:szCs w:val="19"/>
+        </w:rPr>
+        <w:t xml:space="preserve">☐  5. Sulje Unity. Siirrä CafeGame-projektin kansiot ja tiedostot repositoryn kansioon.</w:t>
+      </w:r>
+    </w:p>
+    <w:p>
+      <w:pPr>
+        <w:spacing w:after="40" w:before="0"/>
+        <w:ind w:left="360"/>
+      </w:pPr>
+      <w:r>
+        <w:rPr>
+          <w:sz w:val="19"/>
+          <w:szCs w:val="19"/>
+        </w:rPr>
+        <w:t xml:space="preserve">☐  6. Lisää projekti uudesta paikasta Unity Hubiin: Add → Add project from disk. Avaa projekti ja tarkista, että CafeGame-scene aukeaa.</w:t>
       </w:r>
     </w:p>
     <w:p>
@@ -2652,7 +2687,7 @@
     <w:p>
       <w:pPr>
         <w:pStyle w:val="Heading2"/>
-        <w:spacing w:before="260" w:after="120"/>
+        <w:spacing w:after="120" w:before="260"/>
       </w:pPr>
       <w:r>
         <w:rPr>
@@ -2688,6 +2723,50 @@
         </w:rPr>
         <w:t xml:space="preserve">Viikon tavoite: Peli on suunniteltu ennen koodia: GDD on repositoryssa, GitHub-issuet on priorisoitu ja ohjaaja on hyväksynyt rajauksen.</w:t>
       </w:r>
+    </w:p>
+    <w:p>
+      <w:pPr>
+        <w:spacing w:after="80"/>
+      </w:pPr>
+      <w:r>
+        <w:rPr>
+          <w:sz w:val="19"/>
+          <w:szCs w:val="19"/>
+        </w:rPr>
+        <w:t xml:space="preserve">Kuvaohje tai materiaali: </w:t>
+      </w:r>
+      <w:hyperlink w:history="1" r:id="rIdr5l_1rtl2q2ljarvg-lwv">
+        <w:r>
+          <w:rPr>
+            <w:rStyle w:val="Hyperlink"/>
+            <w:sz w:val="19"/>
+            <w:szCs w:val="19"/>
+          </w:rPr>
+          <w:t xml:space="preserve">Täytä GDD tällä sivulla</w:t>
+        </w:r>
+      </w:hyperlink>
+    </w:p>
+    <w:p>
+      <w:pPr>
+        <w:spacing w:after="80"/>
+      </w:pPr>
+      <w:r>
+        <w:rPr>
+          <w:sz w:val="19"/>
+          <w:szCs w:val="19"/>
+        </w:rPr>
+        <w:t xml:space="preserve">Kuvaohje tai materiaali: </w:t>
+      </w:r>
+      <w:hyperlink w:history="1" r:id="rIdowpmtdfwzetomqwldtzqt">
+        <w:r>
+          <w:rPr>
+            <w:rStyle w:val="Hyperlink"/>
+            <w:sz w:val="19"/>
+            <w:szCs w:val="19"/>
+          </w:rPr>
+          <w:t xml:space="preserve">Avaa koko toimeksianto</w:t>
+        </w:r>
+      </w:hyperlink>
     </w:p>
     <w:p>
       <w:pPr>
@@ -3294,7 +3373,7 @@
     <w:p>
       <w:pPr>
         <w:pStyle w:val="Heading1"/>
-        <w:spacing w:before="320" w:after="160"/>
+        <w:spacing w:after="160" w:before="320"/>
       </w:pPr>
       <w:r>
         <w:rPr>
@@ -3308,7 +3387,7 @@
     <w:p>
       <w:pPr>
         <w:pStyle w:val="Heading2"/>
-        <w:spacing w:before="260" w:after="120"/>
+        <w:spacing w:after="120" w:before="260"/>
       </w:pPr>
       <w:r>
         <w:rPr>
@@ -3344,6 +3423,72 @@
         </w:rPr>
         <w:t xml:space="preserve">Viikon tavoite: Peliä voi pelata alusta loppuun: Aloita → asiakas tilaa kahvin → pelaaja toimittaa → tulosruutu näyttää pisteet.</w:t>
       </w:r>
+    </w:p>
+    <w:p>
+      <w:pPr>
+        <w:spacing w:after="80"/>
+      </w:pPr>
+      <w:r>
+        <w:rPr>
+          <w:sz w:val="19"/>
+          <w:szCs w:val="19"/>
+        </w:rPr>
+        <w:t xml:space="preserve">Kuvaohje tai materiaali: </w:t>
+      </w:r>
+      <w:hyperlink w:history="1" r:id="rIdoebdr6llvxbeimnj1gdlf">
+        <w:r>
+          <w:rPr>
+            <w:rStyle w:val="Hyperlink"/>
+            <w:sz w:val="19"/>
+            <w:szCs w:val="19"/>
+          </w:rPr>
+          <w:t xml:space="preserve">Kenney.nl – ilmaiset CC0-assetit: hahmot, esineet ja käyttöliittymäkuvat</w:t>
+        </w:r>
+      </w:hyperlink>
+    </w:p>
+    <w:p>
+      <w:pPr>
+        <w:spacing w:after="80"/>
+      </w:pPr>
+      <w:r>
+        <w:rPr>
+          <w:sz w:val="19"/>
+          <w:szCs w:val="19"/>
+        </w:rPr>
+        <w:t xml:space="preserve">Kuvaohje tai materiaali: </w:t>
+      </w:r>
+      <w:hyperlink w:history="1" r:id="rIdnw_l_a-yvutplfh3znwbx">
+        <w:r>
+          <w:rPr>
+            <w:rStyle w:val="Hyperlink"/>
+            <w:sz w:val="19"/>
+            <w:szCs w:val="19"/>
+          </w:rPr>
+          <w:t xml:space="preserve">OpenGameArt – 2D-hahmot ja taustat (tarkista lisenssi)</w:t>
+        </w:r>
+      </w:hyperlink>
+    </w:p>
+    <w:p>
+      <w:pPr>
+        <w:spacing w:after="80"/>
+      </w:pPr>
+      <w:r>
+        <w:rPr>
+          <w:sz w:val="19"/>
+          <w:szCs w:val="19"/>
+        </w:rPr>
+        <w:t xml:space="preserve">Kuvaohje tai materiaali: </w:t>
+      </w:r>
+      <w:hyperlink w:history="1" r:id="rId6uwtjuwyr-rbdcknp7c3o">
+        <w:r>
+          <w:rPr>
+            <w:rStyle w:val="Hyperlink"/>
+            <w:sz w:val="19"/>
+            <w:szCs w:val="19"/>
+          </w:rPr>
+          <w:t xml:space="preserve">Piskel – piirrä omat spritet selaimessa</w:t>
+        </w:r>
+      </w:hyperlink>
     </w:p>
     <w:p>
       <w:pPr>
@@ -4002,7 +4147,7 @@
     <w:p>
       <w:pPr>
         <w:pStyle w:val="Heading2"/>
-        <w:spacing w:before="260" w:after="120"/>
+        <w:spacing w:after="120" w:before="260"/>
       </w:pPr>
       <w:r>
         <w:rPr>
@@ -4670,7 +4815,7 @@
     <w:p>
       <w:pPr>
         <w:pStyle w:val="Heading2"/>
-        <w:spacing w:before="260" w:after="120"/>
+        <w:spacing w:after="120" w:before="260"/>
       </w:pPr>
       <w:r>
         <w:rPr>
@@ -5205,7 +5350,7 @@
     <w:p>
       <w:pPr>
         <w:pStyle w:val="Heading2"/>
-        <w:spacing w:before="260" w:after="120"/>
+        <w:spacing w:after="120" w:before="260"/>
       </w:pPr>
       <w:r>
         <w:rPr>
@@ -5633,7 +5778,7 @@
     <w:p>
       <w:pPr>
         <w:pStyle w:val="Heading2"/>
-        <w:spacing w:before="260" w:after="120"/>
+        <w:spacing w:after="120" w:before="260"/>
       </w:pPr>
       <w:r>
         <w:rPr>
@@ -6288,7 +6433,7 @@
     <w:p>
       <w:pPr>
         <w:pStyle w:val="Heading1"/>
-        <w:spacing w:before="320" w:after="160"/>
+        <w:spacing w:after="160" w:before="320"/>
       </w:pPr>
       <w:r>
         <w:rPr>
@@ -6302,7 +6447,7 @@
     <w:p>
       <w:pPr>
         <w:pStyle w:val="Heading2"/>
-        <w:spacing w:before="260" w:after="120"/>
+        <w:spacing w:after="120" w:before="260"/>
       </w:pPr>
       <w:r>
         <w:rPr>
@@ -6704,7 +6849,7 @@
     <w:p>
       <w:pPr>
         <w:pStyle w:val="Heading2"/>
-        <w:spacing w:before="260" w:after="120"/>
+        <w:spacing w:after="120" w:before="260"/>
       </w:pPr>
       <w:r>
         <w:rPr>
@@ -6730,7 +6875,7 @@
     <w:p>
       <w:pPr>
         <w:pStyle w:val="Heading2"/>
-        <w:spacing w:before="260" w:after="120"/>
+        <w:spacing w:after="120" w:before="260"/>
       </w:pPr>
       <w:r>
         <w:rPr>
@@ -7119,7 +7264,7 @@
     <w:p>
       <w:pPr>
         <w:pStyle w:val="Heading2"/>
-        <w:spacing w:before="260" w:after="120"/>
+        <w:spacing w:after="120" w:before="260"/>
       </w:pPr>
       <w:r>
         <w:rPr>
@@ -7155,6 +7300,50 @@
         </w:rPr>
         <w:t xml:space="preserve">Viikon tavoite: Uusi pelaaja ymmärtää tavoitteen ja pelaa kierroksen ilman, että kukaan neuvoo vieressä.</w:t>
       </w:r>
+    </w:p>
+    <w:p>
+      <w:pPr>
+        <w:spacing w:after="80"/>
+      </w:pPr>
+      <w:r>
+        <w:rPr>
+          <w:sz w:val="19"/>
+          <w:szCs w:val="19"/>
+        </w:rPr>
+        <w:t xml:space="preserve">Kuvaohje tai materiaali: </w:t>
+      </w:r>
+      <w:hyperlink w:history="1" r:id="rIdjzrdc54agqdoig9rtvf_c">
+        <w:r>
+          <w:rPr>
+            <w:rStyle w:val="Hyperlink"/>
+            <w:sz w:val="19"/>
+            <w:szCs w:val="19"/>
+          </w:rPr>
+          <w:t xml:space="preserve">Kenney.nl – käyttöliittymäpaketit ja ikonit (CC0)</w:t>
+        </w:r>
+      </w:hyperlink>
+    </w:p>
+    <w:p>
+      <w:pPr>
+        <w:spacing w:after="80"/>
+      </w:pPr>
+      <w:r>
+        <w:rPr>
+          <w:sz w:val="19"/>
+          <w:szCs w:val="19"/>
+        </w:rPr>
+        <w:t xml:space="preserve">Kuvaohje tai materiaali: </w:t>
+      </w:r>
+      <w:hyperlink w:history="1" r:id="rId-hnsezyllhrqj17v_lwbp">
+        <w:r>
+          <w:rPr>
+            <w:rStyle w:val="Hyperlink"/>
+            <w:sz w:val="19"/>
+            <w:szCs w:val="19"/>
+          </w:rPr>
+          <w:t xml:space="preserve">Game-icons.net – tuhansia ikoneita (CC BY, mainitse tekijä)</w:t>
+        </w:r>
+      </w:hyperlink>
     </w:p>
     <w:p>
       <w:pPr>
@@ -7495,7 +7684,7 @@
     <w:p>
       <w:pPr>
         <w:pStyle w:val="Heading1"/>
-        <w:spacing w:before="320" w:after="160"/>
+        <w:spacing w:after="160" w:before="320"/>
       </w:pPr>
       <w:r>
         <w:rPr>
@@ -7509,7 +7698,7 @@
     <w:p>
       <w:pPr>
         <w:pStyle w:val="Heading2"/>
-        <w:spacing w:before="260" w:after="120"/>
+        <w:spacing w:after="120" w:before="260"/>
       </w:pPr>
       <w:r>
         <w:rPr>
@@ -7545,6 +7734,28 @@
         </w:rPr>
         <w:t xml:space="preserve">Viikon tavoite: Pelin koko kierros on testattu 12 testitapauksella, ja kolme virhettä on korjattu ketjuna uusintatesteineen.</w:t>
       </w:r>
+    </w:p>
+    <w:p>
+      <w:pPr>
+        <w:spacing w:after="80"/>
+      </w:pPr>
+      <w:r>
+        <w:rPr>
+          <w:sz w:val="19"/>
+          <w:szCs w:val="19"/>
+        </w:rPr>
+        <w:t xml:space="preserve">Kuvaohje tai materiaali: </w:t>
+      </w:r>
+      <w:hyperlink w:history="1" r:id="rIdoojkwqwvyxfjndn6dyxi-">
+        <w:r>
+          <w:rPr>
+            <w:rStyle w:val="Hyperlink"/>
+            <w:sz w:val="19"/>
+            <w:szCs w:val="19"/>
+          </w:rPr>
+          <w:t xml:space="preserve">Avaa näyttöaineisto</w:t>
+        </w:r>
+      </w:hyperlink>
     </w:p>
     <w:p>
       <w:pPr>
@@ -7924,7 +8135,7 @@
     <w:p>
       <w:pPr>
         <w:pStyle w:val="Heading2"/>
-        <w:spacing w:before="260" w:after="120"/>
+        <w:spacing w:after="120" w:before="260"/>
       </w:pPr>
       <w:r>
         <w:rPr>
@@ -8287,7 +8498,7 @@
     <w:p>
       <w:pPr>
         <w:pStyle w:val="Heading1"/>
-        <w:spacing w:before="320" w:after="160"/>
+        <w:spacing w:after="160" w:before="320"/>
       </w:pPr>
       <w:r>
         <w:rPr>
@@ -8301,7 +8512,7 @@
     <w:p>
       <w:pPr>
         <w:pStyle w:val="Heading2"/>
-        <w:spacing w:before="260" w:after="120"/>
+        <w:spacing w:after="120" w:before="260"/>
       </w:pPr>
       <w:r>
         <w:rPr>
@@ -8677,7 +8888,7 @@
     <w:p>
       <w:pPr>
         <w:pStyle w:val="Heading2"/>
-        <w:spacing w:before="260" w:after="120"/>
+        <w:spacing w:after="120" w:before="260"/>
       </w:pPr>
       <w:r>
         <w:rPr>
@@ -9186,7 +9397,7 @@
     <w:p>
       <w:pPr>
         <w:pStyle w:val="Heading2"/>
-        <w:spacing w:before="260" w:after="120"/>
+        <w:spacing w:after="120" w:before="260"/>
       </w:pPr>
       <w:r>
         <w:rPr>
@@ -9222,6 +9433,50 @@
         </w:rPr>
         <w:t xml:space="preserve">Viikon tavoite: Peli, repository ja projektipäiväkirja on luovutettu, ja jokaisella näyttömatriisin vaatimuksella on toimiva linkki.</w:t>
       </w:r>
+    </w:p>
+    <w:p>
+      <w:pPr>
+        <w:spacing w:after="80"/>
+      </w:pPr>
+      <w:r>
+        <w:rPr>
+          <w:sz w:val="19"/>
+          <w:szCs w:val="19"/>
+        </w:rPr>
+        <w:t xml:space="preserve">Kuvaohje tai materiaali: </w:t>
+      </w:r>
+      <w:hyperlink w:history="1" r:id="rIdtlk-oxanwhxr4mtiakvun">
+        <w:r>
+          <w:rPr>
+            <w:rStyle w:val="Hyperlink"/>
+            <w:sz w:val="19"/>
+            <w:szCs w:val="19"/>
+          </w:rPr>
+          <w:t xml:space="preserve">Avaa näyttömatriisi</w:t>
+        </w:r>
+      </w:hyperlink>
+    </w:p>
+    <w:p>
+      <w:pPr>
+        <w:spacing w:after="80"/>
+      </w:pPr>
+      <w:r>
+        <w:rPr>
+          <w:sz w:val="19"/>
+          <w:szCs w:val="19"/>
+        </w:rPr>
+        <w:t xml:space="preserve">Kuvaohje tai materiaali: </w:t>
+      </w:r>
+      <w:hyperlink w:history="1" r:id="rIdrfvmqre7p1r8javuhvsg8">
+        <w:r>
+          <w:rPr>
+            <w:rStyle w:val="Hyperlink"/>
+            <w:sz w:val="19"/>
+            <w:szCs w:val="19"/>
+          </w:rPr>
+          <w:t xml:space="preserve">Avaa ja lataa AI-loki</w:t>
+        </w:r>
+      </w:hyperlink>
     </w:p>
     <w:p>
       <w:pPr>
@@ -9729,7 +9984,7 @@
     <w:p>
       <w:pPr>
         <w:pStyle w:val="Heading1"/>
-        <w:spacing w:before="320" w:after="160"/>
+        <w:spacing w:after="160" w:before="320"/>
       </w:pPr>
       <w:r>
         <w:rPr>
@@ -11598,7 +11853,7 @@
     <w:p>
       <w:pPr>
         <w:pStyle w:val="Heading1"/>
-        <w:spacing w:before="320" w:after="160"/>
+        <w:spacing w:after="160" w:before="320"/>
       </w:pPr>
       <w:r>
         <w:rPr>
@@ -11625,7 +11880,7 @@
     <w:p>
       <w:pPr>
         <w:pStyle w:val="Heading2"/>
-        <w:spacing w:before="260" w:after="120"/>
+        <w:spacing w:after="120" w:before="260"/>
       </w:pPr>
       <w:r>
         <w:rPr>
@@ -11771,7 +12026,7 @@
     <w:p>
       <w:pPr>
         <w:pStyle w:val="Heading2"/>
-        <w:spacing w:before="260" w:after="120"/>
+        <w:spacing w:after="120" w:before="260"/>
       </w:pPr>
       <w:r>
         <w:rPr>
@@ -11953,7 +12208,7 @@
     <w:p>
       <w:pPr>
         <w:pStyle w:val="Heading2"/>
-        <w:spacing w:before="260" w:after="120"/>
+        <w:spacing w:after="120" w:before="260"/>
       </w:pPr>
       <w:r>
         <w:rPr>
@@ -12075,6 +12330,43 @@
 
 <file path=word/comments.xml><?xml version="1.0" encoding="utf-8"?>
 <w:comments xmlns:cx="http://schemas.microsoft.com/office/drawing/2014/chartex" xmlns:cx1="http://schemas.microsoft.com/office/drawing/2015/9/8/chartex" xmlns:cx2="http://schemas.microsoft.com/office/drawing/2015/10/21/chartex" xmlns:cx3="http://schemas.microsoft.com/office/drawing/2016/5/9/chartex" xmlns:cx4="http://schemas.microsoft.com/office/drawing/2016/5/10/chartex" xmlns:cx5="http://schemas.microsoft.com/office/drawing/2016/5/11/chartex" xmlns:cx6="http://schemas.microsoft.com/office/drawing/2016/5/12/chartex" xmlns:cx7="http://schemas.microsoft.com/office/drawing/2016/5/13/chartex" xmlns:cx8="http://schemas.microsoft.com/office/drawing/2016/5/14/chartex" xmlns:mc="http://schemas.openxmlformats.org/markup-compatibility/2006" xmlns:aink="http://schemas.microsoft.com/office/drawing/2016/ink" xmlns:am3d="http://schemas.microsoft.com/office/drawing/2017/model3d" xmlns:o="urn:schemas-microsoft-com:office:office" xmlns:r="http://schemas.openxmlformats.org/officeDocument/2006/relationships" xmlns:m="http://schemas.openxmlformats.org/officeDocument/2006/math" xmlns:v="urn:schemas-microsoft-com:vml" xmlns:wp14="http://schemas.microsoft.com/office/word/2010/wordprocessingDrawing" xmlns:wp="http://schemas.openxmlformats.org/drawingml/2006/wordprocessingDrawing" xmlns:w10="urn:schemas-microsoft-com:office:word" xmlns:w="http://schemas.openxmlformats.org/wordprocessingml/2006/main" xmlns:w14="http://schemas.microsoft.com/office/word/2010/wordml" xmlns:w15="http://schemas.microsoft.com/office/word/2012/wordml" xmlns:w16cex="http://schemas.microsoft.com/office/word/2018/wordml/cex" xmlns:w16cid="http://schemas.microsoft.com/office/word/2016/wordml/cid" xmlns:w16="http://schemas.microsoft.com/office/word/2018/wordml" xmlns:w16sdtdh="http://schemas.microsoft.com/office/word/2020/wordml/sdtdatahash" xmlns:w16se="http://schemas.microsoft.com/office/word/2015/wordml/symex" xmlns:wpg="http://schemas.microsoft.com/office/word/2010/wordprocessingGroup" xmlns:wpi="http://schemas.microsoft.com/office/word/2010/wordprocessingInk" xmlns:wne="http://schemas.microsoft.com/office/word/2006/wordml" xmlns:wps="http://schemas.microsoft.com/office/word/2010/wordprocessingShape"/>
+</file>
+
+<file path=word/endnotes.xml><?xml version="1.0" encoding="utf-8"?>
+<w:endnotes xmlns:wpc="http://schemas.microsoft.com/office/word/2010/wordprocessingCanvas" xmlns:mc="http://schemas.openxmlformats.org/markup-compatibility/2006" xmlns:o="urn:schemas-microsoft-com:office:office" xmlns:r="http://schemas.openxmlformats.org/officeDocument/2006/relationships" xmlns:m="http://schemas.openxmlformats.org/officeDocument/2006/math" xmlns:v="urn:schemas-microsoft-com:vml" xmlns:wp14="http://schemas.microsoft.com/office/word/2010/wordprocessingDrawing" xmlns:wp="http://schemas.openxmlformats.org/drawingml/2006/wordprocessingDrawing" xmlns:w10="urn:schemas-microsoft-com:office:word" xmlns:w="http://schemas.openxmlformats.org/wordprocessingml/2006/main" xmlns:w14="http://schemas.microsoft.com/office/word/2010/wordml" xmlns:w15="http://schemas.microsoft.com/office/word/2012/wordml" xmlns:wpg="http://schemas.microsoft.com/office/word/2010/wordprocessingGroup" xmlns:wpi="http://schemas.microsoft.com/office/word/2010/wordprocessingInk" xmlns:wne="http://schemas.microsoft.com/office/word/2006/wordml" xmlns:wps="http://schemas.microsoft.com/office/word/2010/wordprocessingShape" mc:Ignorable="w14 w15 wp14">
+  <w:endnote w:type="separator" w:id="-1">
+    <w:p>
+      <w:pPr>
+        <w:spacing w:after="0" w:line="240" w:lineRule="auto"/>
+      </w:pPr>
+      <w:r>
+        <w:rPr>
+          <w:rStyle w:val="EndnoteReference"/>
+        </w:rPr>
+        <w:endnoteRef/>
+      </w:r>
+      <w:r>
+        <w:separator/>
+      </w:r>
+    </w:p>
+  </w:endnote>
+  <w:endnote w:type="continuationSeparator" w:id="0">
+    <w:p>
+      <w:pPr>
+        <w:spacing w:after="0" w:line="240" w:lineRule="auto"/>
+      </w:pPr>
+      <w:r>
+        <w:rPr>
+          <w:rStyle w:val="EndnoteReference"/>
+        </w:rPr>
+        <w:endnoteRef/>
+      </w:r>
+      <w:r>
+        <w:continuationSeparator/>
+      </w:r>
+    </w:p>
+  </w:endnote>
+</w:endnotes>
 </file>
 
 <file path=word/footnotes.xml><?xml version="1.0" encoding="utf-8"?>
@@ -12214,9 +12506,9 @@
   <w:docDefaults>
     <w:rPrDefault>
       <w:rPr>
+        <w:rFonts w:ascii="Calibri" w:cs="Calibri" w:eastAsia="Calibri" w:hAnsi="Calibri"/>
         <w:sz w:val="21"/>
         <w:szCs w:val="21"/>
-        <w:rFonts w:ascii="Calibri" w:cs="Calibri" w:eastAsia="Calibri" w:hAnsi="Calibri"/>
       </w:rPr>
     </w:rPrDefault>
     <w:pPrDefault/>
@@ -12314,8 +12606,8 @@
     <w:uiPriority w:val="99"/>
     <w:unhideWhenUsed/>
     <w:rPr>
+      <w:color w:val="0563C1"/>
       <w:u w:val="single"/>
-      <w:color w:val="0563C1"/>
     </w:rPr>
   </w:style>
   <w:style w:type="character" w:styleId="FootnoteReference">
@@ -12355,5 +12647,42 @@
       <w:szCs w:val="20"/>
     </w:rPr>
   </w:style>
+  <w:style w:type="character" w:styleId="EndnoteReference">
+    <w:name w:val="endnote reference"/>
+    <w:basedOn w:val="DefaultParagraphFont"/>
+    <w:uiPriority w:val="99"/>
+    <w:semiHidden/>
+    <w:unhideWhenUsed/>
+    <w:rPr>
+      <w:vertAlign w:val="superscript"/>
+    </w:rPr>
+  </w:style>
+  <w:style w:type="paragraph" w:styleId="EndnoteText">
+    <w:name w:val="endnote text"/>
+    <w:basedOn w:val="Normal"/>
+    <w:link w:val="EndnoteTextChar"/>
+    <w:uiPriority w:val="99"/>
+    <w:semiHidden/>
+    <w:unhideWhenUsed/>
+    <w:pPr>
+      <w:spacing w:after="0" w:line="240" w:lineRule="auto"/>
+    </w:pPr>
+    <w:rPr>
+      <w:sz w:val="20"/>
+      <w:szCs w:val="20"/>
+    </w:rPr>
+  </w:style>
+  <w:style w:type="character" w:styleId="EndnoteTextChar">
+    <w:name w:val="Endnote Text Char"/>
+    <w:basedOn w:val="DefaultParagraphFont"/>
+    <w:link w:val="EndnoteText"/>
+    <w:uiPriority w:val="99"/>
+    <w:semiHidden/>
+    <w:unhideWhenUsed/>
+    <w:rPr>
+      <w:sz w:val="20"/>
+      <w:szCs w:val="20"/>
+    </w:rPr>
+  </w:style>
 </w:styles>
 </file>
</xml_diff>

<commit_message>
KahvilaKoodi alkaa alusta: viikot 43–51/2026 ja 2–7/2027
Sisältö ja 15 työviikkoa ennallaan, uusi ajankohta: joululoma viikoilla
52, 53 ja 1, luovutus pe 19.2.2027. Syysloma poistui. Viikkonumerot,
tehtävätunnukset (34-1 → 43-1), päivämäärät, viikkokorttien päivät ja
tukisivut (tuki/viikko-43–45.html) siirrettiin. perii-kentät poistettiin,
koska vanhoja rasteja ei siirretä uuteen aloitukseen. Vaihekuva,
työpaketti, dokumentointipohjat ja odotukset.json tuotettu uudelleen.

Co-Authored-By: Claude Opus 5.5 <noreply@anthropic.com>
</commit_message>
<xml_diff>
--- a/downloads/kahvilakoodi-tyopaketti.docx
+++ b/downloads/kahvilakoodi-tyopaketti.docx
@@ -43,7 +43,7 @@
           <w:sz w:val="24"/>
           <w:szCs w:val="24"/>
         </w:rPr>
-        <w:t xml:space="preserve">Viikot 34–49</w:t>
+        <w:t xml:space="preserve">Viikot 43–7</w:t>
       </w:r>
     </w:p>
     <w:p>
@@ -168,7 +168,7 @@
           <w:sz w:val="21"/>
           <w:szCs w:val="21"/>
         </w:rPr>
-        <w:t xml:space="preserve">1. Valmistelu ja suunnitelma · viikot 34–35</w:t>
+        <w:t xml:space="preserve">1. Valmistelu ja suunnitelma · viikot 43–44</w:t>
       </w:r>
     </w:p>
     <w:p>
@@ -195,7 +195,7 @@
           <w:sz w:val="21"/>
           <w:szCs w:val="21"/>
         </w:rPr>
-        <w:t xml:space="preserve">2. Pelattava peli · viikot 36–40</w:t>
+        <w:t xml:space="preserve">2. Pelattava peli · viikot 45–49</w:t>
       </w:r>
     </w:p>
     <w:p>
@@ -222,7 +222,7 @@
           <w:sz w:val="21"/>
           <w:szCs w:val="21"/>
         </w:rPr>
-        <w:t xml:space="preserve">3. Asiakkaan palaute ja käytettävyys · viikot 41–44</w:t>
+        <w:t xml:space="preserve">3. Asiakkaan palaute ja käytettävyys · viikot 50–2</w:t>
       </w:r>
     </w:p>
     <w:p>
@@ -249,7 +249,7 @@
           <w:sz w:val="21"/>
           <w:szCs w:val="21"/>
         </w:rPr>
-        <w:t xml:space="preserve">4. Testaus ja koodin laatu · viikot 45–46</w:t>
+        <w:t xml:space="preserve">4. Testaus ja koodin laatu · viikot 3–4</w:t>
       </w:r>
     </w:p>
     <w:p>
@@ -276,7 +276,7 @@
           <w:sz w:val="21"/>
           <w:szCs w:val="21"/>
         </w:rPr>
-        <w:t xml:space="preserve">5. Julkaisu ja näyttö · viikot 47–49</w:t>
+        <w:t xml:space="preserve">5. Julkaisu ja näyttö · viikot 5–7</w:t>
       </w:r>
     </w:p>
     <w:p>
@@ -475,7 +475,7 @@
                 <w:sz w:val="19"/>
                 <w:szCs w:val="19"/>
               </w:rPr>
-              <w:t xml:space="preserve">34</w:t>
+              <w:t xml:space="preserve">43</w:t>
             </w:r>
           </w:p>
         </w:tc>
@@ -498,7 +498,7 @@
                 <w:sz w:val="19"/>
                 <w:szCs w:val="19"/>
               </w:rPr>
-              <w:t xml:space="preserve">17.–21.8.</w:t>
+              <w:t xml:space="preserve">19.–23.10.</w:t>
             </w:r>
           </w:p>
         </w:tc>
@@ -571,7 +571,7 @@
                 <w:sz w:val="19"/>
                 <w:szCs w:val="19"/>
               </w:rPr>
-              <w:t xml:space="preserve">35</w:t>
+              <w:t xml:space="preserve">44</w:t>
             </w:r>
           </w:p>
         </w:tc>
@@ -594,7 +594,7 @@
                 <w:sz w:val="19"/>
                 <w:szCs w:val="19"/>
               </w:rPr>
-              <w:t xml:space="preserve">24.–28.8.</w:t>
+              <w:t xml:space="preserve">26.–30.10.</w:t>
             </w:r>
           </w:p>
         </w:tc>
@@ -667,7 +667,7 @@
                 <w:sz w:val="19"/>
                 <w:szCs w:val="19"/>
               </w:rPr>
-              <w:t xml:space="preserve">36</w:t>
+              <w:t xml:space="preserve">45</w:t>
             </w:r>
           </w:p>
         </w:tc>
@@ -690,7 +690,7 @@
                 <w:sz w:val="19"/>
                 <w:szCs w:val="19"/>
               </w:rPr>
-              <w:t xml:space="preserve">31.8.–4.9.</w:t>
+              <w:t xml:space="preserve">2.–6.11.</w:t>
             </w:r>
           </w:p>
         </w:tc>
@@ -763,7 +763,7 @@
                 <w:sz w:val="19"/>
                 <w:szCs w:val="19"/>
               </w:rPr>
-              <w:t xml:space="preserve">37</w:t>
+              <w:t xml:space="preserve">46</w:t>
             </w:r>
           </w:p>
         </w:tc>
@@ -786,7 +786,7 @@
                 <w:sz w:val="19"/>
                 <w:szCs w:val="19"/>
               </w:rPr>
-              <w:t xml:space="preserve">7.–11.9.</w:t>
+              <w:t xml:space="preserve">9.–13.11.</w:t>
             </w:r>
           </w:p>
         </w:tc>
@@ -859,7 +859,7 @@
                 <w:sz w:val="19"/>
                 <w:szCs w:val="19"/>
               </w:rPr>
-              <w:t xml:space="preserve">38</w:t>
+              <w:t xml:space="preserve">47</w:t>
             </w:r>
           </w:p>
         </w:tc>
@@ -882,7 +882,7 @@
                 <w:sz w:val="19"/>
                 <w:szCs w:val="19"/>
               </w:rPr>
-              <w:t xml:space="preserve">14.–18.9.</w:t>
+              <w:t xml:space="preserve">16.–20.11.</w:t>
             </w:r>
           </w:p>
         </w:tc>
@@ -955,7 +955,7 @@
                 <w:sz w:val="19"/>
                 <w:szCs w:val="19"/>
               </w:rPr>
-              <w:t xml:space="preserve">39</w:t>
+              <w:t xml:space="preserve">48</w:t>
             </w:r>
           </w:p>
         </w:tc>
@@ -978,7 +978,7 @@
                 <w:sz w:val="19"/>
                 <w:szCs w:val="19"/>
               </w:rPr>
-              <w:t xml:space="preserve">21.–25.9.</w:t>
+              <w:t xml:space="preserve">23.–27.11.</w:t>
             </w:r>
           </w:p>
         </w:tc>
@@ -1051,7 +1051,7 @@
                 <w:sz w:val="19"/>
                 <w:szCs w:val="19"/>
               </w:rPr>
-              <w:t xml:space="preserve">40</w:t>
+              <w:t xml:space="preserve">49</w:t>
             </w:r>
           </w:p>
         </w:tc>
@@ -1074,7 +1074,7 @@
                 <w:sz w:val="19"/>
                 <w:szCs w:val="19"/>
               </w:rPr>
-              <w:t xml:space="preserve">28.9.–2.10.</w:t>
+              <w:t xml:space="preserve">30.11.–4.12.</w:t>
             </w:r>
           </w:p>
         </w:tc>
@@ -1147,7 +1147,7 @@
                 <w:sz w:val="19"/>
                 <w:szCs w:val="19"/>
               </w:rPr>
-              <w:t xml:space="preserve">41</w:t>
+              <w:t xml:space="preserve">50</w:t>
             </w:r>
           </w:p>
         </w:tc>
@@ -1170,7 +1170,7 @@
                 <w:sz w:val="19"/>
                 <w:szCs w:val="19"/>
               </w:rPr>
-              <w:t xml:space="preserve">5.–9.10.</w:t>
+              <w:t xml:space="preserve">7.–11.12.</w:t>
             </w:r>
           </w:p>
         </w:tc>
@@ -1238,10 +1238,12 @@
             </w:pPr>
             <w:r>
               <w:rPr>
-                <w:sz w:val="19"/>
-                <w:szCs w:val="19"/>
-              </w:rPr>
-              <w:t xml:space="preserve">42</w:t>
+                <w:b/>
+                <w:bCs/>
+                <w:sz w:val="19"/>
+                <w:szCs w:val="19"/>
+              </w:rPr>
+              <w:t xml:space="preserve">51</w:t>
             </w:r>
           </w:p>
         </w:tc>
@@ -1264,7 +1266,7 @@
                 <w:sz w:val="19"/>
                 <w:szCs w:val="19"/>
               </w:rPr>
-              <w:t xml:space="preserve">12.–16.10.</w:t>
+              <w:t xml:space="preserve">14.–18.12.</w:t>
             </w:r>
           </w:p>
         </w:tc>
@@ -1287,7 +1289,7 @@
                 <w:sz w:val="19"/>
                 <w:szCs w:val="19"/>
               </w:rPr>
-              <w:t xml:space="preserve">Syysloma – ei projektityötä</w:t>
+              <w:t xml:space="preserve">Feature 6 · Asiakkaan toivoma parannus</w:t>
             </w:r>
           </w:p>
         </w:tc>
@@ -1310,7 +1312,7 @@
                 <w:sz w:val="19"/>
                 <w:szCs w:val="19"/>
               </w:rPr>
-              <w:t xml:space="preserve">–</w:t>
+              <w:t xml:space="preserve">3 · Palaute</w:t>
             </w:r>
           </w:p>
         </w:tc>
@@ -1332,12 +1334,294 @@
             </w:pPr>
             <w:r>
               <w:rPr>
+                <w:sz w:val="19"/>
+                <w:szCs w:val="19"/>
+              </w:rPr>
+              <w:t xml:space="preserve">52</w:t>
+            </w:r>
+          </w:p>
+        </w:tc>
+        <w:tc>
+          <w:tcPr>
+            <w:tcW w:type="dxa" w:w="1807"/>
+            <w:tcMar>
+              <w:top w:type="dxa" w:w="60"/>
+              <w:left w:type="dxa" w:w="100"/>
+              <w:bottom w:type="dxa" w:w="60"/>
+              <w:right w:type="dxa" w:w="100"/>
+            </w:tcMar>
+          </w:tcPr>
+          <w:p>
+            <w:pPr>
+              <w:spacing w:after="0"/>
+            </w:pPr>
+            <w:r>
+              <w:rPr>
+                <w:sz w:val="19"/>
+                <w:szCs w:val="19"/>
+              </w:rPr>
+              <w:t xml:space="preserve">21.–25.12.</w:t>
+            </w:r>
+          </w:p>
+        </w:tc>
+        <w:tc>
+          <w:tcPr>
+            <w:tcW w:type="dxa" w:w="5120"/>
+            <w:tcMar>
+              <w:top w:type="dxa" w:w="60"/>
+              <w:left w:type="dxa" w:w="100"/>
+              <w:bottom w:type="dxa" w:w="60"/>
+              <w:right w:type="dxa" w:w="100"/>
+            </w:tcMar>
+          </w:tcPr>
+          <w:p>
+            <w:pPr>
+              <w:spacing w:after="0"/>
+            </w:pPr>
+            <w:r>
+              <w:rPr>
+                <w:sz w:val="19"/>
+                <w:szCs w:val="19"/>
+              </w:rPr>
+              <w:t xml:space="preserve">Joululoma – ei projektityötä</w:t>
+            </w:r>
+          </w:p>
+        </w:tc>
+        <w:tc>
+          <w:tcPr>
+            <w:tcW w:type="dxa" w:w="1807"/>
+            <w:tcMar>
+              <w:top w:type="dxa" w:w="60"/>
+              <w:left w:type="dxa" w:w="100"/>
+              <w:bottom w:type="dxa" w:w="60"/>
+              <w:right w:type="dxa" w:w="100"/>
+            </w:tcMar>
+          </w:tcPr>
+          <w:p>
+            <w:pPr>
+              <w:spacing w:after="0"/>
+            </w:pPr>
+            <w:r>
+              <w:rPr>
+                <w:sz w:val="19"/>
+                <w:szCs w:val="19"/>
+              </w:rPr>
+              <w:t xml:space="preserve">–</w:t>
+            </w:r>
+          </w:p>
+        </w:tc>
+      </w:tr>
+      <w:tr>
+        <w:tc>
+          <w:tcPr>
+            <w:tcW w:type="dxa" w:w="904"/>
+            <w:tcMar>
+              <w:top w:type="dxa" w:w="60"/>
+              <w:left w:type="dxa" w:w="100"/>
+              <w:bottom w:type="dxa" w:w="60"/>
+              <w:right w:type="dxa" w:w="100"/>
+            </w:tcMar>
+          </w:tcPr>
+          <w:p>
+            <w:pPr>
+              <w:spacing w:after="0"/>
+            </w:pPr>
+            <w:r>
+              <w:rPr>
+                <w:sz w:val="19"/>
+                <w:szCs w:val="19"/>
+              </w:rPr>
+              <w:t xml:space="preserve">53</w:t>
+            </w:r>
+          </w:p>
+        </w:tc>
+        <w:tc>
+          <w:tcPr>
+            <w:tcW w:type="dxa" w:w="1807"/>
+            <w:tcMar>
+              <w:top w:type="dxa" w:w="60"/>
+              <w:left w:type="dxa" w:w="100"/>
+              <w:bottom w:type="dxa" w:w="60"/>
+              <w:right w:type="dxa" w:w="100"/>
+            </w:tcMar>
+          </w:tcPr>
+          <w:p>
+            <w:pPr>
+              <w:spacing w:after="0"/>
+            </w:pPr>
+            <w:r>
+              <w:rPr>
+                <w:sz w:val="19"/>
+                <w:szCs w:val="19"/>
+              </w:rPr>
+              <w:t xml:space="preserve">28.12.–1.1.</w:t>
+            </w:r>
+          </w:p>
+        </w:tc>
+        <w:tc>
+          <w:tcPr>
+            <w:tcW w:type="dxa" w:w="5120"/>
+            <w:tcMar>
+              <w:top w:type="dxa" w:w="60"/>
+              <w:left w:type="dxa" w:w="100"/>
+              <w:bottom w:type="dxa" w:w="60"/>
+              <w:right w:type="dxa" w:w="100"/>
+            </w:tcMar>
+          </w:tcPr>
+          <w:p>
+            <w:pPr>
+              <w:spacing w:after="0"/>
+            </w:pPr>
+            <w:r>
+              <w:rPr>
+                <w:sz w:val="19"/>
+                <w:szCs w:val="19"/>
+              </w:rPr>
+              <w:t xml:space="preserve">Joululoma – ei projektityötä</w:t>
+            </w:r>
+          </w:p>
+        </w:tc>
+        <w:tc>
+          <w:tcPr>
+            <w:tcW w:type="dxa" w:w="1807"/>
+            <w:tcMar>
+              <w:top w:type="dxa" w:w="60"/>
+              <w:left w:type="dxa" w:w="100"/>
+              <w:bottom w:type="dxa" w:w="60"/>
+              <w:right w:type="dxa" w:w="100"/>
+            </w:tcMar>
+          </w:tcPr>
+          <w:p>
+            <w:pPr>
+              <w:spacing w:after="0"/>
+            </w:pPr>
+            <w:r>
+              <w:rPr>
+                <w:sz w:val="19"/>
+                <w:szCs w:val="19"/>
+              </w:rPr>
+              <w:t xml:space="preserve">–</w:t>
+            </w:r>
+          </w:p>
+        </w:tc>
+      </w:tr>
+      <w:tr>
+        <w:tc>
+          <w:tcPr>
+            <w:tcW w:type="dxa" w:w="904"/>
+            <w:tcMar>
+              <w:top w:type="dxa" w:w="60"/>
+              <w:left w:type="dxa" w:w="100"/>
+              <w:bottom w:type="dxa" w:w="60"/>
+              <w:right w:type="dxa" w:w="100"/>
+            </w:tcMar>
+          </w:tcPr>
+          <w:p>
+            <w:pPr>
+              <w:spacing w:after="0"/>
+            </w:pPr>
+            <w:r>
+              <w:rPr>
+                <w:sz w:val="19"/>
+                <w:szCs w:val="19"/>
+              </w:rPr>
+              <w:t xml:space="preserve">1</w:t>
+            </w:r>
+          </w:p>
+        </w:tc>
+        <w:tc>
+          <w:tcPr>
+            <w:tcW w:type="dxa" w:w="1807"/>
+            <w:tcMar>
+              <w:top w:type="dxa" w:w="60"/>
+              <w:left w:type="dxa" w:w="100"/>
+              <w:bottom w:type="dxa" w:w="60"/>
+              <w:right w:type="dxa" w:w="100"/>
+            </w:tcMar>
+          </w:tcPr>
+          <w:p>
+            <w:pPr>
+              <w:spacing w:after="0"/>
+            </w:pPr>
+            <w:r>
+              <w:rPr>
+                <w:sz w:val="19"/>
+                <w:szCs w:val="19"/>
+              </w:rPr>
+              <w:t xml:space="preserve">4.–8.1.</w:t>
+            </w:r>
+          </w:p>
+        </w:tc>
+        <w:tc>
+          <w:tcPr>
+            <w:tcW w:type="dxa" w:w="5120"/>
+            <w:tcMar>
+              <w:top w:type="dxa" w:w="60"/>
+              <w:left w:type="dxa" w:w="100"/>
+              <w:bottom w:type="dxa" w:w="60"/>
+              <w:right w:type="dxa" w:w="100"/>
+            </w:tcMar>
+          </w:tcPr>
+          <w:p>
+            <w:pPr>
+              <w:spacing w:after="0"/>
+            </w:pPr>
+            <w:r>
+              <w:rPr>
+                <w:sz w:val="19"/>
+                <w:szCs w:val="19"/>
+              </w:rPr>
+              <w:t xml:space="preserve">Joululoma – ei projektityötä</w:t>
+            </w:r>
+          </w:p>
+        </w:tc>
+        <w:tc>
+          <w:tcPr>
+            <w:tcW w:type="dxa" w:w="1807"/>
+            <w:tcMar>
+              <w:top w:type="dxa" w:w="60"/>
+              <w:left w:type="dxa" w:w="100"/>
+              <w:bottom w:type="dxa" w:w="60"/>
+              <w:right w:type="dxa" w:w="100"/>
+            </w:tcMar>
+          </w:tcPr>
+          <w:p>
+            <w:pPr>
+              <w:spacing w:after="0"/>
+            </w:pPr>
+            <w:r>
+              <w:rPr>
+                <w:sz w:val="19"/>
+                <w:szCs w:val="19"/>
+              </w:rPr>
+              <w:t xml:space="preserve">–</w:t>
+            </w:r>
+          </w:p>
+        </w:tc>
+      </w:tr>
+      <w:tr>
+        <w:tc>
+          <w:tcPr>
+            <w:tcW w:type="dxa" w:w="904"/>
+            <w:tcMar>
+              <w:top w:type="dxa" w:w="60"/>
+              <w:left w:type="dxa" w:w="100"/>
+              <w:bottom w:type="dxa" w:w="60"/>
+              <w:right w:type="dxa" w:w="100"/>
+            </w:tcMar>
+          </w:tcPr>
+          <w:p>
+            <w:pPr>
+              <w:spacing w:after="0"/>
+            </w:pPr>
+            <w:r>
+              <w:rPr>
                 <w:b/>
                 <w:bCs/>
                 <w:sz w:val="19"/>
                 <w:szCs w:val="19"/>
               </w:rPr>
-              <w:t xml:space="preserve">43</w:t>
+              <w:t xml:space="preserve">2</w:t>
             </w:r>
           </w:p>
         </w:tc>
@@ -1360,7 +1644,7 @@
                 <w:sz w:val="19"/>
                 <w:szCs w:val="19"/>
               </w:rPr>
-              <w:t xml:space="preserve">19.–23.10.</w:t>
+              <w:t xml:space="preserve">11.–15.1.</w:t>
             </w:r>
           </w:p>
         </w:tc>
@@ -1383,7 +1667,7 @@
                 <w:sz w:val="19"/>
                 <w:szCs w:val="19"/>
               </w:rPr>
-              <w:t xml:space="preserve">Feature 6 · Asiakkaan toivoma parannus</w:t>
+              <w:t xml:space="preserve">Feature 7 · Peli ohjaa pelaajaa itse</w:t>
             </w:r>
           </w:p>
         </w:tc>
@@ -1433,7 +1717,7 @@
                 <w:sz w:val="19"/>
                 <w:szCs w:val="19"/>
               </w:rPr>
-              <w:t xml:space="preserve">44</w:t>
+              <w:t xml:space="preserve">3</w:t>
             </w:r>
           </w:p>
         </w:tc>
@@ -1456,7 +1740,7 @@
                 <w:sz w:val="19"/>
                 <w:szCs w:val="19"/>
               </w:rPr>
-              <w:t xml:space="preserve">26.–30.10.</w:t>
+              <w:t xml:space="preserve">18.–22.1.</w:t>
             </w:r>
           </w:p>
         </w:tc>
@@ -1479,7 +1763,7 @@
                 <w:sz w:val="19"/>
                 <w:szCs w:val="19"/>
               </w:rPr>
-              <w:t xml:space="preserve">Feature 7 · Peli ohjaa pelaajaa itse</w:t>
+              <w:t xml:space="preserve">Pelin laatu · Peli kestää pelaamista</w:t>
             </w:r>
           </w:p>
         </w:tc>
@@ -1502,7 +1786,7 @@
                 <w:sz w:val="19"/>
                 <w:szCs w:val="19"/>
               </w:rPr>
-              <w:t xml:space="preserve">3 · Palaute</w:t>
+              <w:t xml:space="preserve">4 · Laatu</w:t>
             </w:r>
           </w:p>
         </w:tc>
@@ -1529,7 +1813,7 @@
                 <w:sz w:val="19"/>
                 <w:szCs w:val="19"/>
               </w:rPr>
-              <w:t xml:space="preserve">45</w:t>
+              <w:t xml:space="preserve">4</w:t>
             </w:r>
           </w:p>
         </w:tc>
@@ -1552,7 +1836,7 @@
                 <w:sz w:val="19"/>
                 <w:szCs w:val="19"/>
               </w:rPr>
-              <w:t xml:space="preserve">2.–6.11.</w:t>
+              <w:t xml:space="preserve">25.–29.1.</w:t>
             </w:r>
           </w:p>
         </w:tc>
@@ -1575,7 +1859,7 @@
                 <w:sz w:val="19"/>
                 <w:szCs w:val="19"/>
               </w:rPr>
-              <w:t xml:space="preserve">Pelin laatu · Peli kestää pelaamista</w:t>
+              <w:t xml:space="preserve">Pelin laatu · Koodi, jonka toinen ymmärtää</w:t>
             </w:r>
           </w:p>
         </w:tc>
@@ -1625,7 +1909,7 @@
                 <w:sz w:val="19"/>
                 <w:szCs w:val="19"/>
               </w:rPr>
-              <w:t xml:space="preserve">46</w:t>
+              <w:t xml:space="preserve">5</w:t>
             </w:r>
           </w:p>
         </w:tc>
@@ -1648,7 +1932,7 @@
                 <w:sz w:val="19"/>
                 <w:szCs w:val="19"/>
               </w:rPr>
-              <w:t xml:space="preserve">9.–13.11.</w:t>
+              <w:t xml:space="preserve">1.–5.2.</w:t>
             </w:r>
           </w:p>
         </w:tc>
@@ -1671,7 +1955,7 @@
                 <w:sz w:val="19"/>
                 <w:szCs w:val="19"/>
               </w:rPr>
-              <w:t xml:space="preserve">Pelin laatu · Koodi, jonka toinen ymmärtää</w:t>
+              <w:t xml:space="preserve">Pelin julkaisu · Ensimmäinen julkaisuehdokas RC1 testipelattavana</w:t>
             </w:r>
           </w:p>
         </w:tc>
@@ -1694,7 +1978,7 @@
                 <w:sz w:val="19"/>
                 <w:szCs w:val="19"/>
               </w:rPr>
-              <w:t xml:space="preserve">4 · Laatu</w:t>
+              <w:t xml:space="preserve">5 · Julkaisu</w:t>
             </w:r>
           </w:p>
         </w:tc>
@@ -1721,7 +2005,7 @@
                 <w:sz w:val="19"/>
                 <w:szCs w:val="19"/>
               </w:rPr>
-              <w:t xml:space="preserve">47</w:t>
+              <w:t xml:space="preserve">6</w:t>
             </w:r>
           </w:p>
         </w:tc>
@@ -1744,7 +2028,7 @@
                 <w:sz w:val="19"/>
                 <w:szCs w:val="19"/>
               </w:rPr>
-              <w:t xml:space="preserve">16.–20.11.</w:t>
+              <w:t xml:space="preserve">8.–12.2.</w:t>
             </w:r>
           </w:p>
         </w:tc>
@@ -1767,7 +2051,7 @@
                 <w:sz w:val="19"/>
                 <w:szCs w:val="19"/>
               </w:rPr>
-              <w:t xml:space="preserve">Pelin julkaisu · Ensimmäinen julkaisuehdokas RC1 testipelattavana</w:t>
+              <w:t xml:space="preserve">Pelin julkaisu · v1.0 julki</w:t>
             </w:r>
           </w:p>
         </w:tc>
@@ -1817,7 +2101,7 @@
                 <w:sz w:val="19"/>
                 <w:szCs w:val="19"/>
               </w:rPr>
-              <w:t xml:space="preserve">48</w:t>
+              <w:t xml:space="preserve">7</w:t>
             </w:r>
           </w:p>
         </w:tc>
@@ -1840,103 +2124,7 @@
                 <w:sz w:val="19"/>
                 <w:szCs w:val="19"/>
               </w:rPr>
-              <w:t xml:space="preserve">23.–27.11.</w:t>
-            </w:r>
-          </w:p>
-        </w:tc>
-        <w:tc>
-          <w:tcPr>
-            <w:tcW w:type="dxa" w:w="5120"/>
-            <w:tcMar>
-              <w:top w:type="dxa" w:w="60"/>
-              <w:left w:type="dxa" w:w="100"/>
-              <w:bottom w:type="dxa" w:w="60"/>
-              <w:right w:type="dxa" w:w="100"/>
-            </w:tcMar>
-          </w:tcPr>
-          <w:p>
-            <w:pPr>
-              <w:spacing w:after="0"/>
-            </w:pPr>
-            <w:r>
-              <w:rPr>
-                <w:sz w:val="19"/>
-                <w:szCs w:val="19"/>
-              </w:rPr>
-              <w:t xml:space="preserve">Pelin julkaisu · v1.0 julki</w:t>
-            </w:r>
-          </w:p>
-        </w:tc>
-        <w:tc>
-          <w:tcPr>
-            <w:tcW w:type="dxa" w:w="1807"/>
-            <w:tcMar>
-              <w:top w:type="dxa" w:w="60"/>
-              <w:left w:type="dxa" w:w="100"/>
-              <w:bottom w:type="dxa" w:w="60"/>
-              <w:right w:type="dxa" w:w="100"/>
-            </w:tcMar>
-          </w:tcPr>
-          <w:p>
-            <w:pPr>
-              <w:spacing w:after="0"/>
-            </w:pPr>
-            <w:r>
-              <w:rPr>
-                <w:sz w:val="19"/>
-                <w:szCs w:val="19"/>
-              </w:rPr>
-              <w:t xml:space="preserve">5 · Julkaisu</w:t>
-            </w:r>
-          </w:p>
-        </w:tc>
-      </w:tr>
-      <w:tr>
-        <w:tc>
-          <w:tcPr>
-            <w:tcW w:type="dxa" w:w="904"/>
-            <w:tcMar>
-              <w:top w:type="dxa" w:w="60"/>
-              <w:left w:type="dxa" w:w="100"/>
-              <w:bottom w:type="dxa" w:w="60"/>
-              <w:right w:type="dxa" w:w="100"/>
-            </w:tcMar>
-          </w:tcPr>
-          <w:p>
-            <w:pPr>
-              <w:spacing w:after="0"/>
-            </w:pPr>
-            <w:r>
-              <w:rPr>
-                <w:b/>
-                <w:bCs/>
-                <w:sz w:val="19"/>
-                <w:szCs w:val="19"/>
-              </w:rPr>
-              <w:t xml:space="preserve">49</w:t>
-            </w:r>
-          </w:p>
-        </w:tc>
-        <w:tc>
-          <w:tcPr>
-            <w:tcW w:type="dxa" w:w="1807"/>
-            <w:tcMar>
-              <w:top w:type="dxa" w:w="60"/>
-              <w:left w:type="dxa" w:w="100"/>
-              <w:bottom w:type="dxa" w:w="60"/>
-              <w:right w:type="dxa" w:w="100"/>
-            </w:tcMar>
-          </w:tcPr>
-          <w:p>
-            <w:pPr>
-              <w:spacing w:after="0"/>
-            </w:pPr>
-            <w:r>
-              <w:rPr>
-                <w:sz w:val="19"/>
-                <w:szCs w:val="19"/>
-              </w:rPr>
-              <w:t xml:space="preserve">30.11.–4.12.</w:t>
+              <w:t xml:space="preserve">15.–19.2.</w:t>
             </w:r>
           </w:p>
         </w:tc>
@@ -2018,7 +2206,7 @@
           <w:bCs/>
           <w:color w:val="1d4ed8"/>
         </w:rPr>
-        <w:t xml:space="preserve">Vko 34 · 17.–21.8. – Aloitus: peli-idea ja työkalut</w:t>
+        <w:t xml:space="preserve">Vko 43 · 19.–23.10. – Aloitus: peli-idea ja työkalut</w:t>
       </w:r>
     </w:p>
     <w:p>
@@ -2030,7 +2218,7 @@
           <w:sz w:val="19"/>
           <w:szCs w:val="19"/>
         </w:rPr>
-        <w:t xml:space="preserve">Yhteys kokonaisprojektiin: Projekti alkaa asiakkaan toimeksiannosta, joka ei vielä kerro kaikkea: kysymyksillä selvität avoimet asiat ennen kuin rakennat mitään. Samalla teet Unity-projektin ja Git-repositoryn ja kokeilet, että tyhjä peli aukeaa selaimessa, koska koko peli julkaistaan lopuksi selainversiona. Vastaukset ja toimiva työympäristö ovat pohja viikon 35 suunnitelmalle.</w:t>
+        <w:t xml:space="preserve">Yhteys kokonaisprojektiin: Projekti alkaa asiakkaan toimeksiannosta, joka ei vielä kerro kaikkea: kysymyksillä selvität avoimet asiat ennen kuin rakennat mitään. Samalla teet Unity-projektin ja Git-repositoryn ja kokeilet, että tyhjä peli aukeaa selaimessa, koska koko peli julkaistaan lopuksi selainversiona. Vastaukset ja toimiva työympäristö ovat pohja viikon 44 suunnitelmalle.</w:t>
       </w:r>
     </w:p>
     <w:p>
@@ -2058,7 +2246,29 @@
         </w:rPr>
         <w:t xml:space="preserve">Kuvaohje tai materiaali: </w:t>
       </w:r>
-      <w:hyperlink w:history="1" r:id="rId4hp1puo1dqv_p2mor9w11">
+      <w:hyperlink w:history="1" r:id="rIdoyw1mseoytfdjjuw1yert">
+        <w:r>
+          <w:rPr>
+            <w:rStyle w:val="Hyperlink"/>
+            <w:sz w:val="19"/>
+            <w:szCs w:val="19"/>
+          </w:rPr>
+          <w:t xml:space="preserve">Kuvallinen tukiohje · viikko 43 · Unity 6</w:t>
+        </w:r>
+      </w:hyperlink>
+    </w:p>
+    <w:p>
+      <w:pPr>
+        <w:spacing w:after="80"/>
+      </w:pPr>
+      <w:r>
+        <w:rPr>
+          <w:sz w:val="19"/>
+          <w:szCs w:val="19"/>
+        </w:rPr>
+        <w:t xml:space="preserve">Kuvaohje tai materiaali: </w:t>
+      </w:r>
+      <w:hyperlink w:history="1" r:id="rIdgh0yvl-1xwlqqgy6plo1j">
         <w:r>
           <w:rPr>
             <w:rStyle w:val="Hyperlink"/>
@@ -2186,7 +2396,7 @@
           <w:sz w:val="19"/>
           <w:szCs w:val="19"/>
         </w:rPr>
-        <w:t xml:space="preserve">Tallenna työnäyte: Kysymyslista viikon 34 päiväkirjaan, kenttään Mitä tein ja miten?</w:t>
+        <w:t xml:space="preserve">Tallenna työnäyte: Kysymyslista viikon 43 päiväkirjaan, kenttään Mitä tein ja miten?</w:t>
       </w:r>
     </w:p>
     <w:p>
@@ -2293,7 +2503,7 @@
           <w:sz w:val="19"/>
           <w:szCs w:val="19"/>
         </w:rPr>
-        <w:t xml:space="preserve">Tallenna työnäyte: Vastaukset ja avoimet asiat viikon 34 päiväkirjaan.</w:t>
+        <w:t xml:space="preserve">Tallenna työnäyte: Vastaukset ja avoimet asiat viikon 43 päiväkirjaan.</w:t>
       </w:r>
     </w:p>
     <w:p>
@@ -2426,7 +2636,7 @@
           <w:sz w:val="19"/>
           <w:szCs w:val="19"/>
         </w:rPr>
-        <w:t xml:space="preserve">Tallenna työnäyte: Unity-versio viikon 34 päiväkirjaan. Kuvakaappaus auenneesta selainversiosta, jonka viet työvaiheessa 5 polkuun project-docs/evidence/week-34/web-test.png.</w:t>
+        <w:t xml:space="preserve">Tallenna työnäyte: Unity-versio viikon 43 päiväkirjaan. Kuvakaappaus auenneesta selainversiosta, jonka viet työvaiheessa 5 polkuun project-docs/evidence/week-43/web-test.png.</w:t>
       </w:r>
     </w:p>
     <w:p>
@@ -2546,7 +2756,7 @@
           <w:sz w:val="19"/>
           <w:szCs w:val="19"/>
         </w:rPr>
-        <w:t xml:space="preserve">Tallenna työnäyte: Repositoryn linkki viikon 34 päiväkirjaan.</w:t>
+        <w:t xml:space="preserve">Tallenna työnäyte: Repositoryn linkki viikon 43 päiväkirjaan.</w:t>
       </w:r>
     </w:p>
     <w:p>
@@ -2586,7 +2796,7 @@
           <w:sz w:val="19"/>
           <w:szCs w:val="19"/>
         </w:rPr>
-        <w:t xml:space="preserve">☐  2. Siirrä työvaiheen 3 kuvakaappaus polkuun project-docs/evidence/week-34/web-test.png.</w:t>
+        <w:t xml:space="preserve">☐  2. Siirrä työvaiheen 3 kuvakaappaus polkuun project-docs/evidence/week-43/web-test.png.</w:t>
       </w:r>
     </w:p>
     <w:p>
@@ -2653,7 +2863,7 @@
           <w:sz w:val="19"/>
           <w:szCs w:val="19"/>
         </w:rPr>
-        <w:t xml:space="preserve">Tallenna työnäyte: Repositoryn linkki ja ensimmäisen commitin tunniste (7 merkin koodi GitHubin commit-listassa, esimerkiksi a1b2c3d) viikon 34 päiväkirjaan.</w:t>
+        <w:t xml:space="preserve">Tallenna työnäyte: Repositoryn linkki ja ensimmäisen commitin tunniste (7 merkin koodi GitHubin commit-listassa, esimerkiksi a1b2c3d) viikon 43 päiväkirjaan.</w:t>
       </w:r>
     </w:p>
     <w:p>
@@ -2695,7 +2905,7 @@
           <w:bCs/>
           <w:color w:val="1d4ed8"/>
         </w:rPr>
-        <w:t xml:space="preserve">Vko 35 · 24.–28.8. – Pelin suunnitelma: ruudut ja feature-lista</w:t>
+        <w:t xml:space="preserve">Vko 44 · 26.–30.10. – Pelin suunnitelma: ruudut ja feature-lista</w:t>
       </w:r>
     </w:p>
     <w:p>
@@ -2707,7 +2917,7 @@
           <w:sz w:val="19"/>
           <w:szCs w:val="19"/>
         </w:rPr>
-        <w:t xml:space="preserve">Yhteys kokonaisprojektiin: Viikon 34 asiakasvastausten perusteella muutat toimeksiannon suunnitelmaksi: pelin säännöt GDD:hen, pienet GitHub-issuet, ruutujen luonnos ja skriptien kartta. Rajaus estää peliä kasvamasta liian suureksi, ja Valmis kun -ehdoista näet, milloin työn voi testata. Viikosta 36 alkaen rakennat ruudut luonnoksen ja skriptit kartan mukaan.</w:t>
+        <w:t xml:space="preserve">Yhteys kokonaisprojektiin: Viikon 43 asiakasvastausten perusteella muutat toimeksiannon suunnitelmaksi: pelin säännöt GDD:hen, pienet GitHub-issuet, ruutujen luonnos ja skriptien kartta. Rajaus estää peliä kasvamasta liian suureksi, ja Valmis kun -ehdoista näet, milloin työn voi testata. Viikosta 45 alkaen rakennat ruudut luonnoksen ja skriptit kartan mukaan.</w:t>
       </w:r>
     </w:p>
     <w:p>
@@ -2735,7 +2945,29 @@
         </w:rPr>
         <w:t xml:space="preserve">Kuvaohje tai materiaali: </w:t>
       </w:r>
-      <w:hyperlink w:history="1" r:id="rIdr5l_1rtl2q2ljarvg-lwv">
+      <w:hyperlink w:history="1" r:id="rIdk4bcwitu_lo3w38uw-lw1">
+        <w:r>
+          <w:rPr>
+            <w:rStyle w:val="Hyperlink"/>
+            <w:sz w:val="19"/>
+            <w:szCs w:val="19"/>
+          </w:rPr>
+          <w:t xml:space="preserve">Kuvallinen tukiohje · viikko 44 · Unity 6</w:t>
+        </w:r>
+      </w:hyperlink>
+    </w:p>
+    <w:p>
+      <w:pPr>
+        <w:spacing w:after="80"/>
+      </w:pPr>
+      <w:r>
+        <w:rPr>
+          <w:sz w:val="19"/>
+          <w:szCs w:val="19"/>
+        </w:rPr>
+        <w:t xml:space="preserve">Kuvaohje tai materiaali: </w:t>
+      </w:r>
+      <w:hyperlink w:history="1" r:id="rIdrewnjiozgt4elxkorv1zo">
         <w:r>
           <w:rPr>
             <w:rStyle w:val="Hyperlink"/>
@@ -2757,7 +2989,7 @@
         </w:rPr>
         <w:t xml:space="preserve">Kuvaohje tai materiaali: </w:t>
       </w:r>
-      <w:hyperlink w:history="1" r:id="rIdowpmtdfwzetomqwldtzqt">
+      <w:hyperlink w:history="1" r:id="rIdqhv7t_qblurhkn-f55i4h">
         <w:r>
           <w:rPr>
             <w:rStyle w:val="Hyperlink"/>
@@ -2857,7 +3089,7 @@
           <w:sz w:val="19"/>
           <w:szCs w:val="19"/>
         </w:rPr>
-        <w:t xml:space="preserve">☐  6. Jos sovit kierroksen pituuden asiakkaan kanssa viikolla 34, kirjaa se. Muuten jätä kenttä tyhjäksi: se on avoin asia.</w:t>
+        <w:t xml:space="preserve">☐  6. Jos sovit kierroksen pituuden asiakkaan kanssa viikolla 43, kirjaa se. Muuten jätä kenttä tyhjäksi: se on avoin asia.</w:t>
       </w:r>
     </w:p>
     <w:p>
@@ -2898,7 +3130,7 @@
           <w:sz w:val="19"/>
           <w:szCs w:val="19"/>
         </w:rPr>
-        <w:t xml:space="preserve">Tallenna työnäyte: project-docs/gdd.md ja commit-linkki viikon 35 päiväkirjaan.</w:t>
+        <w:t xml:space="preserve">Tallenna työnäyte: project-docs/gdd.md ja commit-linkki viikon 44 päiväkirjaan.</w:t>
       </w:r>
     </w:p>
     <w:p>
@@ -2990,7 +3222,7 @@
           <w:sz w:val="19"/>
           <w:szCs w:val="19"/>
         </w:rPr>
-        <w:t xml:space="preserve">☐  6. Lisää vielä yksi issue kustakin muusta featuresta paitsi asiakkaan toivomasta parannuksesta, joka selviää vasta viikolla 41. Pilkot ne tarkemmin sillä viikolla, kun teet featuren.</w:t>
+        <w:t xml:space="preserve">☐  6. Lisää vielä yksi issue kustakin muusta featuresta paitsi asiakkaan toivomasta parannuksesta, joka selviää vasta viikolla 50. Pilkot ne tarkemmin sillä viikolla, kun teet featuren.</w:t>
       </w:r>
     </w:p>
     <w:p>
@@ -3018,7 +3250,7 @@
           <w:sz w:val="19"/>
           <w:szCs w:val="19"/>
         </w:rPr>
-        <w:t xml:space="preserve">Tallenna työnäyte: Linkki GitHubin Issues-listaan viikon 35 päiväkirjaan.</w:t>
+        <w:t xml:space="preserve">Tallenna työnäyte: Linkki GitHubin Issues-listaan viikon 44 päiväkirjaan.</w:t>
       </w:r>
     </w:p>
     <w:p>
@@ -3058,7 +3290,7 @@
           <w:sz w:val="19"/>
           <w:szCs w:val="19"/>
         </w:rPr>
-        <w:t xml:space="preserve">☐  2. Anna label P0 pakollinen jokaiselle issuelle, jota ilman peliä ei voi antaa asiakkaalle. Kaikki toimeksiannon vaatimukset ovat pakollisia (P0). Käytä apuna viikon 34 aloituskeskustelun pakollisten (P0) listaa.</w:t>
+        <w:t xml:space="preserve">☐  2. Anna label P0 pakollinen jokaiselle issuelle, jota ilman peliä ei voi antaa asiakkaalle. Kaikki toimeksiannon vaatimukset ovat pakollisia (P0). Käytä apuna viikon 43 aloituskeskustelun pakollisten (P0) listaa.</w:t>
       </w:r>
     </w:p>
     <w:p>
@@ -3125,7 +3357,7 @@
           <w:sz w:val="19"/>
           <w:szCs w:val="19"/>
         </w:rPr>
-        <w:t xml:space="preserve">Tallenna työnäyte: Linkki Issues-listaan sekä hyväksyjän rooli ja päivä viikon 35 päiväkirjaan.</w:t>
+        <w:t xml:space="preserve">Tallenna työnäyte: Linkki Issues-listaan sekä hyväksyjän rooli ja päivä viikon 44 päiväkirjaan.</w:t>
       </w:r>
     </w:p>
     <w:p>
@@ -3245,7 +3477,7 @@
           <w:sz w:val="19"/>
           <w:szCs w:val="19"/>
         </w:rPr>
-        <w:t xml:space="preserve">Tallenna työnäyte: Kuva polkuun project-docs/evidence/week-35/mockup.png, commit ja push.</w:t>
+        <w:t xml:space="preserve">Tallenna työnäyte: Kuva polkuun project-docs/evidence/week-44/mockup.png, commit ja push.</w:t>
       </w:r>
     </w:p>
     <w:p>
@@ -3339,7 +3571,7 @@
           <w:sz w:val="19"/>
           <w:szCs w:val="19"/>
         </w:rPr>
-        <w:t xml:space="preserve">Tallenna työnäyte: Kuva polkuun project-docs/evidence/week-35/unity-rakenne.png, commit ja push.</w:t>
+        <w:t xml:space="preserve">Tallenna työnäyte: Kuva polkuun project-docs/evidence/week-44/unity-rakenne.png, commit ja push.</w:t>
       </w:r>
     </w:p>
     <w:p>
@@ -3395,7 +3627,7 @@
           <w:bCs/>
           <w:color w:val="1d4ed8"/>
         </w:rPr>
-        <w:t xml:space="preserve">Vko 36 · 31.8.–4.9. – Feature 1 · Ensimmäinen pelattava kierros</w:t>
+        <w:t xml:space="preserve">Vko 45 · 2.–6.11. – Feature 1 · Ensimmäinen pelattava kierros</w:t>
       </w:r>
     </w:p>
     <w:p>
@@ -3407,7 +3639,7 @@
           <w:sz w:val="19"/>
           <w:szCs w:val="19"/>
         </w:rPr>
-        <w:t xml:space="preserve">Yhteys kokonaisprojektiin: Viikon 35 luonnoksesta ja skriptien kartasta tulee nyt ensimmäinen pelattava versio. Rakennat kolme ruutua ja GameManagerin, ja yksi kiinteä kahvitilaus riittää, koska pieni alusta loppuun toimiva peli paljastaa Canvasin ja painikkeiden kytkentävirheet aikaisin. Viikolla 37 kiinteä kahvi vaihtuu tuotelistasta arvottuun tilaukseen.</w:t>
+        <w:t xml:space="preserve">Yhteys kokonaisprojektiin: Viikon 44 luonnoksesta ja skriptien kartasta tulee nyt ensimmäinen pelattava versio. Rakennat kolme ruutua ja GameManagerin, ja yksi kiinteä kahvitilaus riittää, koska pieni alusta loppuun toimiva peli paljastaa Canvasin ja painikkeiden kytkentävirheet aikaisin. Viikolla 46 kiinteä kahvi vaihtuu tuotelistasta arvottuun tilaukseen.</w:t>
       </w:r>
     </w:p>
     <w:p>
@@ -3435,7 +3667,29 @@
         </w:rPr>
         <w:t xml:space="preserve">Kuvaohje tai materiaali: </w:t>
       </w:r>
-      <w:hyperlink w:history="1" r:id="rIdoebdr6llvxbeimnj1gdlf">
+      <w:hyperlink w:history="1" r:id="rIdz8ofvxmpcpbkwp1qw8qmc">
+        <w:r>
+          <w:rPr>
+            <w:rStyle w:val="Hyperlink"/>
+            <w:sz w:val="19"/>
+            <w:szCs w:val="19"/>
+          </w:rPr>
+          <w:t xml:space="preserve">Kuvallinen tukiohje · viikko 45 · Unity 6</w:t>
+        </w:r>
+      </w:hyperlink>
+    </w:p>
+    <w:p>
+      <w:pPr>
+        <w:spacing w:after="80"/>
+      </w:pPr>
+      <w:r>
+        <w:rPr>
+          <w:sz w:val="19"/>
+          <w:szCs w:val="19"/>
+        </w:rPr>
+        <w:t xml:space="preserve">Kuvaohje tai materiaali: </w:t>
+      </w:r>
+      <w:hyperlink w:history="1" r:id="rIdowlhogektcczuthx6-5uk">
         <w:r>
           <w:rPr>
             <w:rStyle w:val="Hyperlink"/>
@@ -3457,7 +3711,7 @@
         </w:rPr>
         <w:t xml:space="preserve">Kuvaohje tai materiaali: </w:t>
       </w:r>
-      <w:hyperlink w:history="1" r:id="rIdnw_l_a-yvutplfh3znwbx">
+      <w:hyperlink w:history="1" r:id="rIdlcj_fxnlwqcdrwim_olll">
         <w:r>
           <w:rPr>
             <w:rStyle w:val="Hyperlink"/>
@@ -3479,7 +3733,7 @@
         </w:rPr>
         <w:t xml:space="preserve">Kuvaohje tai materiaali: </w:t>
       </w:r>
-      <w:hyperlink w:history="1" r:id="rId6uwtjuwyr-rbdcknp7c3o">
+      <w:hyperlink w:history="1" r:id="rIdpi1rrbh7iqo9cksinep37">
         <w:r>
           <w:rPr>
             <w:rStyle w:val="Hyperlink"/>
@@ -3607,7 +3861,7 @@
           <w:sz w:val="19"/>
           <w:szCs w:val="19"/>
         </w:rPr>
-        <w:t xml:space="preserve">Tallenna työnäyte: Commit ja push. Commit-linkki viikon 36 päiväkirjaan.</w:t>
+        <w:t xml:space="preserve">Tallenna työnäyte: Commit ja push. Commit-linkki viikon 45 päiväkirjaan.</w:t>
       </w:r>
     </w:p>
     <w:p>
@@ -3714,7 +3968,7 @@
           <w:sz w:val="19"/>
           <w:szCs w:val="19"/>
         </w:rPr>
-        <w:t xml:space="preserve">Tallenna työnäyte: Kuvakaappaus Hierarchy-ikkunasta polkuun project-docs/evidence/week-36/hierarchy.png, commit ja push. Polku viikon 36 päiväkirjan kenttään Missä työnäyte on?</w:t>
+        <w:t xml:space="preserve">Tallenna työnäyte: Kuvakaappaus Hierarchy-ikkunasta polkuun project-docs/evidence/week-45/hierarchy.png, commit ja push. Polku viikon 45 päiväkirjan kenttään Missä työnäyte on?</w:t>
       </w:r>
     </w:p>
     <w:p>
@@ -3860,7 +4114,7 @@
           <w:sz w:val="19"/>
           <w:szCs w:val="19"/>
         </w:rPr>
-        <w:t xml:space="preserve">Tallenna työnäyte: Commit ja push. Commit-linkki viikon 36 päiväkirjaan.</w:t>
+        <w:t xml:space="preserve">Tallenna työnäyte: Commit ja push. Commit-linkki viikon 45 päiväkirjaan.</w:t>
       </w:r>
     </w:p>
     <w:p>
@@ -3980,7 +4234,7 @@
           <w:sz w:val="19"/>
           <w:szCs w:val="19"/>
         </w:rPr>
-        <w:t xml:space="preserve">Tallenna työnäyte: Commit ja push. Commit-linkki viikon 36 päiväkirjaan.</w:t>
+        <w:t xml:space="preserve">Tallenna työnäyte: Commit ja push. Commit-linkki viikon 45 päiväkirjaan.</w:t>
       </w:r>
     </w:p>
     <w:p>
@@ -4113,7 +4367,7 @@
           <w:sz w:val="19"/>
           <w:szCs w:val="19"/>
         </w:rPr>
-        <w:t xml:space="preserve">Tallenna työnäyte: Kolme kuvaa tai lyhyt video pelipolusta kansioon project-docs/evidence/week-36/, commit ja push. Testikirjaukset ja commit-linkki viikon 36 päiväkirjaan.</w:t>
+        <w:t xml:space="preserve">Tallenna työnäyte: Kolme kuvaa tai lyhyt video pelipolusta kansioon project-docs/evidence/week-45/, commit ja push. Testikirjaukset ja commit-linkki viikon 45 päiväkirjaan.</w:t>
       </w:r>
     </w:p>
     <w:p>
@@ -4155,7 +4409,7 @@
           <w:bCs/>
           <w:color w:val="1d4ed8"/>
         </w:rPr>
-        <w:t xml:space="preserve">Vko 37 · 7.–11.9. – Feature 2 · Kahvilan oikea tuotelista</w:t>
+        <w:t xml:space="preserve">Vko 46 · 9.–13.11. – Feature 2 · Kahvilan oikea tuotelista</w:t>
       </w:r>
     </w:p>
     <w:p>
@@ -4167,7 +4421,7 @@
           <w:sz w:val="19"/>
           <w:szCs w:val="19"/>
         </w:rPr>
-        <w:t xml:space="preserve">Yhteys kokonaisprojektiin: Viikon 36 kierros toimii, mutta kahvi on kirjoitettu suoraan koodiin. Nyt tuotteet luetaan erillisestä products.json-tiedostosta, kuten toimeksianto vaatii, ja OrderManager arpoo tilauksen ja tarkistaa toimituksen. Tilaus ja sen pisteet ovat pohja viikon 38 kellolle, palautteelle ja pelisäännöille.</w:t>
+        <w:t xml:space="preserve">Yhteys kokonaisprojektiin: Viikon 45 kierros toimii, mutta kahvi on kirjoitettu suoraan koodiin. Nyt tuotteet luetaan erillisestä products.json-tiedostosta, kuten toimeksianto vaatii, ja OrderManager arpoo tilauksen ja tarkistaa toimituksen. Tilaus ja sen pisteet ovat pohja viikon 47 kellolle, palautteelle ja pelisäännöille.</w:t>
       </w:r>
     </w:p>
     <w:p>
@@ -4288,7 +4542,7 @@
           <w:sz w:val="19"/>
           <w:szCs w:val="19"/>
         </w:rPr>
-        <w:t xml:space="preserve">Tallenna työnäyte: Commit ja push. Tiedoston polku viikon 37 päiväkirjaan.</w:t>
+        <w:t xml:space="preserve">Tallenna työnäyte: Commit ja push. Tiedoston polku viikon 46 päiväkirjaan.</w:t>
       </w:r>
     </w:p>
     <w:p>
@@ -4408,7 +4662,7 @@
           <w:sz w:val="19"/>
           <w:szCs w:val="19"/>
         </w:rPr>
-        <w:t xml:space="preserve">Tallenna työnäyte: Commit ja push. Commit-linkki viikon 37 päiväkirjaan.</w:t>
+        <w:t xml:space="preserve">Tallenna työnäyte: Commit ja push. Commit-linkki viikon 46 päiväkirjaan.</w:t>
       </w:r>
     </w:p>
     <w:p>
@@ -4528,7 +4782,7 @@
           <w:sz w:val="19"/>
           <w:szCs w:val="19"/>
         </w:rPr>
-        <w:t xml:space="preserve">Tallenna työnäyte: Commit ja push. Commit-linkki ja viiden tilauksen lista viikon 37 päiväkirjaan.</w:t>
+        <w:t xml:space="preserve">Tallenna työnäyte: Commit ja push. Commit-linkki ja viiden tilauksen lista viikon 46 päiväkirjaan.</w:t>
       </w:r>
     </w:p>
     <w:p>
@@ -4648,7 +4902,7 @@
           <w:sz w:val="19"/>
           <w:szCs w:val="19"/>
         </w:rPr>
-        <w:t xml:space="preserve">Tallenna työnäyte: Commit ja push. Commit-linkki ja kahden toimituksen tulos viikon 37 päiväkirjaan.</w:t>
+        <w:t xml:space="preserve">Tallenna työnäyte: Commit ja push. Commit-linkki ja kahden toimituksen tulos viikon 46 päiväkirjaan.</w:t>
       </w:r>
     </w:p>
     <w:p>
@@ -4781,7 +5035,7 @@
           <w:sz w:val="19"/>
           <w:szCs w:val="19"/>
         </w:rPr>
-        <w:t xml:space="preserve">Tallenna työnäyte: Testien tulokset ja tiedon kulku viikon 37 päiväkirjaan.</w:t>
+        <w:t xml:space="preserve">Tallenna työnäyte: Testien tulokset ja tiedon kulku viikon 46 päiväkirjaan.</w:t>
       </w:r>
     </w:p>
     <w:p>
@@ -4823,7 +5077,7 @@
           <w:bCs/>
           <w:color w:val="1d4ed8"/>
         </w:rPr>
-        <w:t xml:space="preserve">Vko 38 · 14.–18.9. – Feature 3 · Kello, pisteet ja palaute</w:t>
+        <w:t xml:space="preserve">Vko 47 · 16.–20.11. – Feature 3 · Kello, pisteet ja palaute</w:t>
       </w:r>
     </w:p>
     <w:p>
@@ -4835,7 +5089,7 @@
           <w:sz w:val="19"/>
           <w:szCs w:val="19"/>
         </w:rPr>
-        <w:t xml:space="preserve">Yhteys kokonaisprojektiin: Viikon 37 tilaus ja toimituksen tarkistus antavat pisteet, mutta peli päättyy vielä ensimmäiseen toimitukseen. Kirjoitat ensin pelisäännöt GDD:n pisteytyksen pohjalta ja lisäät sitten ajastimen, palautteen ja rajatestit, jotta pelaaja voi tehdä päätöksiä ajan ja tuloksen perusteella. Kun kierros kestää ajan loppuun, viikolla 39 kiirettä voi kasvattaa.</w:t>
+        <w:t xml:space="preserve">Yhteys kokonaisprojektiin: Viikon 46 tilaus ja toimituksen tarkistus antavat pisteet, mutta peli päättyy vielä ensimmäiseen toimitukseen. Kirjoitat ensin pelisäännöt GDD:n pisteytyksen pohjalta ja lisäät sitten ajastimen, palautteen ja rajatestit, jotta pelaaja voi tehdä päätöksiä ajan ja tuloksen perusteella. Kun kierros kestää ajan loppuun, viikolla 48 kiirettä voi kasvattaa.</w:t>
       </w:r>
     </w:p>
     <w:p>
@@ -4956,7 +5210,7 @@
           <w:sz w:val="19"/>
           <w:szCs w:val="19"/>
         </w:rPr>
-        <w:t xml:space="preserve">Tallenna työnäyte: Säännöt viikon 38 päiväkirjaan.</w:t>
+        <w:t xml:space="preserve">Tallenna työnäyte: Säännöt viikon 47 päiväkirjaan.</w:t>
       </w:r>
     </w:p>
     <w:p>
@@ -5048,7 +5302,7 @@
           <w:sz w:val="19"/>
           <w:szCs w:val="19"/>
         </w:rPr>
-        <w:t xml:space="preserve">☐  6. Poista SubmitOrder-metodista viikolla 36 lisätty EndGame-kutsu. Nyt kierros päättyy vasta, kun aika loppuu.</w:t>
+        <w:t xml:space="preserve">☐  6. Poista SubmitOrder-metodista viikolla 45 lisätty EndGame-kutsu. Nyt kierros päättyy vasta, kun aika loppuu.</w:t>
       </w:r>
     </w:p>
     <w:p>
@@ -5076,7 +5330,7 @@
           <w:sz w:val="19"/>
           <w:szCs w:val="19"/>
         </w:rPr>
-        <w:t xml:space="preserve">Tallenna työnäyte: Commit ja push. Commit-linkki viikon 38 päiväkirjaan.</w:t>
+        <w:t xml:space="preserve">Tallenna työnäyte: Commit ja push. Commit-linkki viikon 47 päiväkirjaan.</w:t>
       </w:r>
     </w:p>
     <w:p>
@@ -5196,7 +5450,7 @@
           <w:sz w:val="19"/>
           <w:szCs w:val="19"/>
         </w:rPr>
-        <w:t xml:space="preserve">Tallenna työnäyte: Kuvakaappaukset molemmista palautteista kansioon project-docs/evidence/week-38/, commit ja push. Polut viikon 38 päiväkirjaan.</w:t>
+        <w:t xml:space="preserve">Tallenna työnäyte: Kuvakaappaukset molemmista palautteista kansioon project-docs/evidence/week-47/, commit ja push. Polut viikon 47 päiväkirjaan.</w:t>
       </w:r>
     </w:p>
     <w:p>
@@ -5316,7 +5570,7 @@
           <w:sz w:val="19"/>
           <w:szCs w:val="19"/>
         </w:rPr>
-        <w:t xml:space="preserve">Tallenna työnäyte: Testien tulokset ja korjausten commit-linkit viikon 38 päiväkirjaan.</w:t>
+        <w:t xml:space="preserve">Tallenna työnäyte: Testien tulokset ja korjausten commit-linkit viikon 47 päiväkirjaan.</w:t>
       </w:r>
     </w:p>
     <w:p>
@@ -5358,7 +5612,7 @@
           <w:bCs/>
           <w:color w:val="1d4ed8"/>
         </w:rPr>
-        <w:t xml:space="preserve">Vko 39 · 21.–25.9. – Feature 4 · Kasvava kiire</w:t>
+        <w:t xml:space="preserve">Vko 48 · 23.–27.11. – Feature 4 · Kasvava kiire</w:t>
       </w:r>
     </w:p>
     <w:p>
@@ -5370,7 +5624,7 @@
           <w:sz w:val="19"/>
           <w:szCs w:val="19"/>
         </w:rPr>
-        <w:t xml:space="preserve">Yhteys kokonaisprojektiin: Viikon 38 kello ja pisteet tekevät pelistä kierroksen, mutta kiire pysyy samana alusta loppuun. Toimeksianto vaatii kasvavaa vaikeutta, joten vertaat ensin kahta tapaa ja rakennat valitun tavan tasot yhteen Inspectorissa säädettävään listaan. Kun tasot ovat yhdessä paikassa, niitä voi säätää testien ja palautteen jälkeen koskematta koodiin.</w:t>
+        <w:t xml:space="preserve">Yhteys kokonaisprojektiin: Viikon 47 kello ja pisteet tekevät pelistä kierroksen, mutta kiire pysyy samana alusta loppuun. Toimeksianto vaatii kasvavaa vaikeutta, joten vertaat ensin kahta tapaa ja rakennat valitun tavan tasot yhteen Inspectorissa säädettävään listaan. Kun tasot ovat yhdessä paikassa, niitä voi säätää testien ja palautteen jälkeen koskematta koodiin.</w:t>
       </w:r>
     </w:p>
     <w:p>
@@ -5491,7 +5745,7 @@
           <w:sz w:val="19"/>
           <w:szCs w:val="19"/>
         </w:rPr>
-        <w:t xml:space="preserve">Tallenna työnäyte: Vertailu ja valinta viikon 39 päiväkirjaan.</w:t>
+        <w:t xml:space="preserve">Tallenna työnäyte: Vertailu ja valinta viikon 48 päiväkirjaan.</w:t>
       </w:r>
     </w:p>
     <w:p>
@@ -5624,7 +5878,7 @@
           <w:sz w:val="19"/>
           <w:szCs w:val="19"/>
         </w:rPr>
-        <w:t xml:space="preserve">Tallenna työnäyte: Commit ja push. Commit-linkki ja tasotaulukko viikon 39 päiväkirjaan.</w:t>
+        <w:t xml:space="preserve">Tallenna työnäyte: Commit ja push. Commit-linkki ja tasotaulukko viikon 48 päiväkirjaan.</w:t>
       </w:r>
     </w:p>
     <w:p>
@@ -5744,7 +5998,7 @@
           <w:sz w:val="19"/>
           <w:szCs w:val="19"/>
         </w:rPr>
-        <w:t xml:space="preserve">Tallenna työnäyte: Testien tulokset ja commit-linkit viikon 39 päiväkirjaan.</w:t>
+        <w:t xml:space="preserve">Tallenna työnäyte: Testien tulokset ja commit-linkit viikon 48 päiväkirjaan.</w:t>
       </w:r>
     </w:p>
     <w:p>
@@ -5786,7 +6040,7 @@
           <w:bCs/>
           <w:color w:val="1d4ed8"/>
         </w:rPr>
-        <w:t xml:space="preserve">Vko 40 · 28.9.–2.10. – Feature 5 · Top 5 -tuloslista</w:t>
+        <w:t xml:space="preserve">Vko 49 · 30.11.–4.12. – Feature 5 · Top 5 -tuloslista</w:t>
       </w:r>
     </w:p>
     <w:p>
@@ -5798,7 +6052,7 @@
           <w:sz w:val="19"/>
           <w:szCs w:val="19"/>
         </w:rPr>
-        <w:t xml:space="preserve">Yhteys kokonaisprojektiin: Viikon 39 jälkeen kierros päättyy pisteisiin, mutta tulos katoaa, kun peli suljetaan. Nyt tulosruutu saa nimimerkin ja top 5 -listan, jonka SaveService tallentaa PlayerPrefsiin selaimen muistiin, koska toimeksianto vaatii parhaiden tulosten tallentamista. Tämän jälkeen toimeksiannon kaikki vaatimukset toimivat, ja asiakas pelaa koko peliä viikolla 41.</w:t>
+        <w:t xml:space="preserve">Yhteys kokonaisprojektiin: Viikon 48 jälkeen kierros päättyy pisteisiin, mutta tulos katoaa, kun peli suljetaan. Nyt tulosruutu saa nimimerkin ja top 5 -listan, jonka SaveService tallentaa PlayerPrefsiin selaimen muistiin, koska toimeksianto vaatii parhaiden tulosten tallentamista. Tämän jälkeen toimeksiannon kaikki vaatimukset toimivat, ja asiakas pelaa koko peliä viikolla 50.</w:t>
       </w:r>
     </w:p>
     <w:p>
@@ -5906,7 +6160,7 @@
           <w:sz w:val="19"/>
           <w:szCs w:val="19"/>
         </w:rPr>
-        <w:t xml:space="preserve">Tallenna työnäyte: Kuvakaappaus tulosruudusta polkuun project-docs/evidence/week-40/tulosruutu.png, commit ja push. Polku viikon 40 päiväkirjaan.</w:t>
+        <w:t xml:space="preserve">Tallenna työnäyte: Kuvakaappaus tulosruudusta polkuun project-docs/evidence/week-49/tulosruutu.png, commit ja push. Polku viikon 49 päiväkirjaan.</w:t>
       </w:r>
     </w:p>
     <w:p>
@@ -6013,7 +6267,7 @@
           <w:sz w:val="19"/>
           <w:szCs w:val="19"/>
         </w:rPr>
-        <w:t xml:space="preserve">Tallenna työnäyte: Commit ja push. Commit-linkki ja selitys viikon 40 päiväkirjaan.</w:t>
+        <w:t xml:space="preserve">Tallenna työnäyte: Commit ja push. Commit-linkki ja selitys viikon 49 päiväkirjaan.</w:t>
       </w:r>
     </w:p>
     <w:p>
@@ -6146,7 +6400,7 @@
           <w:sz w:val="19"/>
           <w:szCs w:val="19"/>
         </w:rPr>
-        <w:t xml:space="preserve">Tallenna työnäyte: Commit ja push. Kuvakaappaus listasta kansioon project-docs/evidence/week-40/ ja polku viikon 40 päiväkirjaan.</w:t>
+        <w:t xml:space="preserve">Tallenna työnäyte: Commit ja push. Kuvakaappaus listasta kansioon project-docs/evidence/week-49/ ja polku viikon 49 päiväkirjaan.</w:t>
       </w:r>
     </w:p>
     <w:p>
@@ -6266,7 +6520,7 @@
           <w:sz w:val="19"/>
           <w:szCs w:val="19"/>
         </w:rPr>
-        <w:t xml:space="preserve">Tallenna työnäyte: Commit ja push. Päätökset ja commit-linkki viikon 40 päiväkirjaan.</w:t>
+        <w:t xml:space="preserve">Tallenna työnäyte: Commit ja push. Päätökset ja commit-linkki viikon 49 päiväkirjaan.</w:t>
       </w:r>
     </w:p>
     <w:p>
@@ -6399,7 +6653,7 @@
           <w:sz w:val="19"/>
           <w:szCs w:val="19"/>
         </w:rPr>
-        <w:t xml:space="preserve">Tallenna työnäyte: Testitulokset, perustelu, vertailu ja commit-linkit viikon 40 päiväkirjaan.</w:t>
+        <w:t xml:space="preserve">Tallenna työnäyte: Testitulokset, perustelu, vertailu ja commit-linkit viikon 49 päiväkirjaan.</w:t>
       </w:r>
     </w:p>
     <w:p>
@@ -6455,7 +6709,7 @@
           <w:bCs/>
           <w:color w:val="1d4ed8"/>
         </w:rPr>
-        <w:t xml:space="preserve">Vko 41 · 5.–9.10. – Katselmointi · Asiakas pelaa peliäsi</w:t>
+        <w:t xml:space="preserve">Vko 50 · 7.–11.12. – Katselmointi · Asiakas pelaa peliäsi</w:t>
       </w:r>
     </w:p>
     <w:p>
@@ -6467,7 +6721,7 @@
           <w:sz w:val="19"/>
           <w:szCs w:val="19"/>
         </w:rPr>
-        <w:t xml:space="preserve">Yhteys kokonaisprojektiin: Viikoilla 36–40 rakensit toimeksiannon kaikki vaatimukset, ja nyt asiakas kokeilee niitä ensimmäistä kertaa omin käsin. Tarkkailet neuvomatta, missä tilaus, tuotteiden valinta tai palaute jää epäselväksi, ja erotat asiakkaan palautteen omasta tulkinnastasi. Sovittu muutos tehdään syysloman jälkeen viikolla 43.</w:t>
+        <w:t xml:space="preserve">Yhteys kokonaisprojektiin: Viikoilla 45–49 rakensit toimeksiannon kaikki vaatimukset, ja nyt asiakas kokeilee niitä ensimmäistä kertaa omin käsin. Tarkkailet neuvomatta, missä tilaus, tuotteiden valinta tai palaute jää epäselväksi, ja erotat asiakkaan palautteen omasta tulkinnastasi. Sovittu muutos tehdään heti seuraavalla viikolla 51, ennen joululomaa.</w:t>
       </w:r>
     </w:p>
     <w:p>
@@ -6588,7 +6842,7 @@
           <w:sz w:val="19"/>
           <w:szCs w:val="19"/>
         </w:rPr>
-        <w:t xml:space="preserve">Tallenna työnäyte: Version tunniste ja tarkistuslistan tulos viikon 41 päiväkirjaan.</w:t>
+        <w:t xml:space="preserve">Tallenna työnäyte: Version tunniste ja tarkistuslistan tulos viikon 50 päiväkirjaan.</w:t>
       </w:r>
     </w:p>
     <w:p>
@@ -6695,7 +6949,7 @@
           <w:sz w:val="19"/>
           <w:szCs w:val="19"/>
         </w:rPr>
-        <w:t xml:space="preserve">Tallenna työnäyte: Muistiinpanot viikon 41 päiväkirjaan.</w:t>
+        <w:t xml:space="preserve">Tallenna työnäyte: Muistiinpanot viikon 50 päiväkirjaan.</w:t>
       </w:r>
     </w:p>
     <w:p>
@@ -6722,7 +6976,7 @@
           <w:sz w:val="19"/>
           <w:szCs w:val="19"/>
         </w:rPr>
-        <w:t xml:space="preserve">☐  1. Valitse palautteesta yhdessä asiakkaan kanssa yksi muutos, jonka ehdit tehdä viikolla 43.</w:t>
+        <w:t xml:space="preserve">☐  1. Valitse palautteesta yhdessä asiakkaan kanssa yksi muutos, jonka ehdit tehdä viikolla 51.</w:t>
       </w:r>
     </w:p>
     <w:p>
@@ -6774,7 +7028,7 @@
           <w:sz w:val="19"/>
           <w:szCs w:val="19"/>
         </w:rPr>
-        <w:t xml:space="preserve">☐  5. Vertaa kolmen viikolla 35 tehdyn issuen arviota siihen, kauanko työ oikeasti kesti. Kirjaa ero ja sen syy päiväkirjaan.</w:t>
+        <w:t xml:space="preserve">☐  5. Vertaa kolmen viikolla 44 tehdyn issuen arviota siihen, kauanko työ oikeasti kesti. Kirjaa ero ja sen syy päiväkirjaan.</w:t>
       </w:r>
     </w:p>
     <w:p>
@@ -6815,7 +7069,7 @@
           <w:sz w:val="19"/>
           <w:szCs w:val="19"/>
         </w:rPr>
-        <w:t xml:space="preserve">Tallenna työnäyte: Issuen linkki ja katselmointimuistio viikon 41 päiväkirjaan.</w:t>
+        <w:t xml:space="preserve">Tallenna työnäyte: Issuen linkki ja katselmointimuistio viikon 50 päiväkirjaan.</w:t>
       </w:r>
     </w:p>
     <w:p>
@@ -6855,35 +7109,9 @@
         <w:rPr>
           <w:b/>
           <w:bCs/>
-          <w:color w:val="8A6D00"/>
-        </w:rPr>
-        <w:t xml:space="preserve">Vko 42 · 12.–16.10. – Syysloma</w:t>
-      </w:r>
-    </w:p>
-    <w:p>
-      <w:pPr>
-        <w:spacing w:after="200" w:before="0"/>
-      </w:pPr>
-      <w:r>
-        <w:rPr>
-          <w:sz w:val="21"/>
-          <w:szCs w:val="21"/>
-        </w:rPr>
-        <w:t xml:space="preserve">Ei projektityötä eikä korvaavia tehtäviä. Jatka viikolla 43 viimeisimmästä toimivasta main-versiosta.</w:t>
-      </w:r>
-    </w:p>
-    <w:p>
-      <w:pPr>
-        <w:pStyle w:val="Heading2"/>
-        <w:spacing w:after="120" w:before="260"/>
-      </w:pPr>
-      <w:r>
-        <w:rPr>
-          <w:b/>
-          <w:bCs/>
           <w:color w:val="1d4ed8"/>
         </w:rPr>
-        <w:t xml:space="preserve">Vko 43 · 19.–23.10. – Feature 6 · Asiakkaan toivoma parannus</w:t>
+        <w:t xml:space="preserve">Vko 51 · 14.–18.12. – Feature 6 · Asiakkaan toivoma parannus</w:t>
       </w:r>
     </w:p>
     <w:p>
@@ -6895,7 +7123,7 @@
           <w:sz w:val="19"/>
           <w:szCs w:val="19"/>
         </w:rPr>
-        <w:t xml:space="preserve">Yhteys kokonaisprojektiin: Viikon 41 katselmoinnissa asiakas valitsi yhden muutoksen, ja nyt toteutat sen omassa Git-haarassa. Haara pitää toimivan main-version turvassa, ja pull request näyttää ketjun palautteesta issueen, koodiin ja testiin. Kun muutos on yhdistetty, viikolla 44 uusi pelaaja kokeilee peliä ilman neuvoja.</w:t>
+        <w:t xml:space="preserve">Yhteys kokonaisprojektiin: Viikon 50 katselmoinnissa asiakas valitsi yhden muutoksen, ja nyt toteutat sen omassa Git-haarassa. Haara pitää toimivan main-version turvassa, ja pull request näyttää ketjun palautteesta issueen, koodiin ja testiin. Kun muutos on yhdistetty, viikolla 2 uusi pelaaja kokeilee peliä ilman neuvoja.</w:t>
       </w:r>
     </w:p>
     <w:p>
@@ -6936,7 +7164,7 @@
           <w:sz w:val="19"/>
           <w:szCs w:val="19"/>
         </w:rPr>
-        <w:t xml:space="preserve">☐  1. Avaa viikolla 41 tekemäsi muutosissue GitHubissa ja lue siihen kirjattu asiakkaan palaute.</w:t>
+        <w:t xml:space="preserve">☐  1. Avaa viikolla 50 tekemäsi muutosissue GitHubissa ja lue siihen kirjattu asiakkaan palaute.</w:t>
       </w:r>
     </w:p>
     <w:p>
@@ -7003,7 +7231,7 @@
           <w:sz w:val="19"/>
           <w:szCs w:val="19"/>
         </w:rPr>
-        <w:t xml:space="preserve">Tallenna työnäyte: Issuen linkki viikon 43 päiväkirjaan.</w:t>
+        <w:t xml:space="preserve">Tallenna työnäyte: Issuen linkki viikon 51 päiväkirjaan.</w:t>
       </w:r>
     </w:p>
     <w:p>
@@ -7110,7 +7338,7 @@
           <w:sz w:val="19"/>
           <w:szCs w:val="19"/>
         </w:rPr>
-        <w:t xml:space="preserve">Tallenna työnäyte: Haaran nimi ja commit-linkit viikon 43 päiväkirjaan.</w:t>
+        <w:t xml:space="preserve">Tallenna työnäyte: Haaran nimi ja commit-linkit viikon 51 päiväkirjaan.</w:t>
       </w:r>
     </w:p>
     <w:p>
@@ -7230,7 +7458,7 @@
           <w:sz w:val="19"/>
           <w:szCs w:val="19"/>
         </w:rPr>
-        <w:t xml:space="preserve">Tallenna työnäyte: Pull requestin linkki ja koko ketju viikon 43 päiväkirjaan.</w:t>
+        <w:t xml:space="preserve">Tallenna työnäyte: Pull requestin linkki ja koko ketju viikon 51 päiväkirjaan.</w:t>
       </w:r>
     </w:p>
     <w:p>
@@ -7270,31 +7498,109 @@
         <w:rPr>
           <w:b/>
           <w:bCs/>
-          <w:color w:val="1d4ed8"/>
-        </w:rPr>
-        <w:t xml:space="preserve">Vko 44 · 26.–30.10. – Feature 7 · Peli ohjaa pelaajaa itse</w:t>
-      </w:r>
-    </w:p>
-    <w:p>
-      <w:pPr>
-        <w:spacing w:after="60" w:before="0"/>
-      </w:pPr>
-      <w:r>
-        <w:rPr>
-          <w:sz w:val="19"/>
-          <w:szCs w:val="19"/>
-        </w:rPr>
-        <w:t xml:space="preserve">Yhteys kokonaisprojektiin: Asiakkaan muutos on nyt pelissä, mutta et itse enää huomaa, mikä pelissä on epäselvää. Vertaat peliä viikon 35 luonnokseen ja katsot, miten uusi pelaaja selviää ilman neuvoja, koska julkaistu peli ei saa vaatia tekijää vieressä. Kaksi korjausta ja uusintatesti vievät pelin viikon 45 järjestelmälliseen testaukseen.</w:t>
-      </w:r>
-    </w:p>
-    <w:p>
-      <w:pPr>
-        <w:spacing w:after="80" w:before="0"/>
+          <w:color w:val="8A6D00"/>
+        </w:rPr>
+        <w:t xml:space="preserve">Vko 52 · 21.–25.12. – Joululoma</w:t>
+      </w:r>
+    </w:p>
+    <w:p>
+      <w:pPr>
+        <w:spacing w:after="200" w:before="0"/>
+      </w:pPr>
+      <w:r>
+        <w:rPr>
+          <w:sz w:val="21"/>
+          <w:szCs w:val="21"/>
+        </w:rPr>
+        <w:t xml:space="preserve">Ei projektityötä eikä korvaavia tehtäviä. Jatka viikolla 2 viimeisimmästä toimivasta main-versiosta.</w:t>
+      </w:r>
+    </w:p>
+    <w:p>
+      <w:pPr>
+        <w:pStyle w:val="Heading2"/>
+        <w:spacing w:after="120" w:before="260"/>
       </w:pPr>
       <w:r>
         <w:rPr>
           <w:b/>
           <w:bCs/>
+          <w:color w:val="8A6D00"/>
+        </w:rPr>
+        <w:t xml:space="preserve">Vko 53 · 28.12.–1.1. – Joululoma</w:t>
+      </w:r>
+    </w:p>
+    <w:p>
+      <w:pPr>
+        <w:spacing w:after="200" w:before="0"/>
+      </w:pPr>
+      <w:r>
+        <w:rPr>
+          <w:sz w:val="21"/>
+          <w:szCs w:val="21"/>
+        </w:rPr>
+        <w:t xml:space="preserve">Ei projektityötä eikä korvaavia tehtäviä. Jatka viikolla 2 viimeisimmästä toimivasta main-versiosta.</w:t>
+      </w:r>
+    </w:p>
+    <w:p>
+      <w:pPr>
+        <w:pStyle w:val="Heading2"/>
+        <w:spacing w:after="120" w:before="260"/>
+      </w:pPr>
+      <w:r>
+        <w:rPr>
+          <w:b/>
+          <w:bCs/>
+          <w:color w:val="8A6D00"/>
+        </w:rPr>
+        <w:t xml:space="preserve">Vko 1 · 4.–8.1. – Joululoma</w:t>
+      </w:r>
+    </w:p>
+    <w:p>
+      <w:pPr>
+        <w:spacing w:after="200" w:before="0"/>
+      </w:pPr>
+      <w:r>
+        <w:rPr>
+          <w:sz w:val="21"/>
+          <w:szCs w:val="21"/>
+        </w:rPr>
+        <w:t xml:space="preserve">Ei projektityötä eikä korvaavia tehtäviä. Jatka viikolla 2 viimeisimmästä toimivasta main-versiosta.</w:t>
+      </w:r>
+    </w:p>
+    <w:p>
+      <w:pPr>
+        <w:pStyle w:val="Heading2"/>
+        <w:spacing w:after="120" w:before="260"/>
+      </w:pPr>
+      <w:r>
+        <w:rPr>
+          <w:b/>
+          <w:bCs/>
+          <w:color w:val="1d4ed8"/>
+        </w:rPr>
+        <w:t xml:space="preserve">Vko 2 · 11.–15.1. – Feature 7 · Peli ohjaa pelaajaa itse</w:t>
+      </w:r>
+    </w:p>
+    <w:p>
+      <w:pPr>
+        <w:spacing w:after="60" w:before="0"/>
+      </w:pPr>
+      <w:r>
+        <w:rPr>
+          <w:sz w:val="19"/>
+          <w:szCs w:val="19"/>
+        </w:rPr>
+        <w:t xml:space="preserve">Yhteys kokonaisprojektiin: Asiakkaan muutos on nyt pelissä, mutta et itse enää huomaa, mikä pelissä on epäselvää. Vertaat peliä viikon 44 luonnokseen ja katsot, miten uusi pelaaja selviää ilman neuvoja, koska julkaistu peli ei saa vaatia tekijää vieressä. Kaksi korjausta ja uusintatesti vievät pelin viikon 3 järjestelmälliseen testaukseen.</w:t>
+      </w:r>
+    </w:p>
+    <w:p>
+      <w:pPr>
+        <w:spacing w:after="80" w:before="0"/>
+      </w:pPr>
+      <w:r>
+        <w:rPr>
+          <w:b/>
+          <w:bCs/>
           <w:sz w:val="19"/>
           <w:szCs w:val="19"/>
         </w:rPr>
@@ -7312,7 +7618,7 @@
         </w:rPr>
         <w:t xml:space="preserve">Kuvaohje tai materiaali: </w:t>
       </w:r>
-      <w:hyperlink w:history="1" r:id="rIdjzrdc54agqdoig9rtvf_c">
+      <w:hyperlink w:history="1" r:id="rId2un3_4v_dp3tamin7iolq">
         <w:r>
           <w:rPr>
             <w:rStyle w:val="Hyperlink"/>
@@ -7334,7 +7640,7 @@
         </w:rPr>
         <w:t xml:space="preserve">Kuvaohje tai materiaali: </w:t>
       </w:r>
-      <w:hyperlink w:history="1" r:id="rId-hnsezyllhrqj17v_lwbp">
+      <w:hyperlink w:history="1" r:id="rIdilz-aynzhyml3mgvsebpk">
         <w:r>
           <w:rPr>
             <w:rStyle w:val="Hyperlink"/>
@@ -7356,20 +7662,20 @@
           <w:sz w:val="21"/>
           <w:szCs w:val="21"/>
         </w:rPr>
-        <w:t xml:space="preserve">Työvaihe 1 / 3 · Vertaa peliä viikon 35 luonnokseen.</w:t>
-      </w:r>
-    </w:p>
-    <w:p>
-      <w:pPr>
-        <w:spacing w:after="40" w:before="0"/>
-        <w:ind w:left="360"/>
-      </w:pPr>
-      <w:r>
-        <w:rPr>
-          <w:sz w:val="19"/>
-          <w:szCs w:val="19"/>
-        </w:rPr>
-        <w:t xml:space="preserve">☐  1. Avaa viikon 35 luonnos project-docs/evidence/week-35/mockup.png.</w:t>
+        <w:t xml:space="preserve">Työvaihe 1 / 3 · Vertaa peliä viikon 44 luonnokseen.</w:t>
+      </w:r>
+    </w:p>
+    <w:p>
+      <w:pPr>
+        <w:spacing w:after="40" w:before="0"/>
+        <w:ind w:left="360"/>
+      </w:pPr>
+      <w:r>
+        <w:rPr>
+          <w:sz w:val="19"/>
+          <w:szCs w:val="19"/>
+        </w:rPr>
+        <w:t xml:space="preserve">☐  1. Avaa viikon 44 luonnos project-docs/evidence/week-44/mockup.png.</w:t>
       </w:r>
     </w:p>
     <w:p>
@@ -7436,7 +7742,7 @@
           <w:sz w:val="19"/>
           <w:szCs w:val="19"/>
         </w:rPr>
-        <w:t xml:space="preserve">Tallenna työnäyte: Kuvakaappaukset kansioon project-docs/evidence/week-44/, commit ja push. Vertailu viikon 44 päiväkirjaan.</w:t>
+        <w:t xml:space="preserve">Tallenna työnäyte: Kuvakaappaukset kansioon project-docs/evidence/week-2/, commit ja push. Vertailu viikon 2 päiväkirjaan.</w:t>
       </w:r>
     </w:p>
     <w:p>
@@ -7530,7 +7836,7 @@
           <w:sz w:val="19"/>
           <w:szCs w:val="19"/>
         </w:rPr>
-        <w:t xml:space="preserve">Tallenna työnäyte: Havainnot viikon 44 päiväkirjaan.</w:t>
+        <w:t xml:space="preserve">Tallenna työnäyte: Havainnot viikon 2 päiväkirjaan.</w:t>
       </w:r>
     </w:p>
     <w:p>
@@ -7650,7 +7956,7 @@
           <w:sz w:val="19"/>
           <w:szCs w:val="19"/>
         </w:rPr>
-        <w:t xml:space="preserve">Tallenna työnäyte: Ennen/jälkeen-kuvat kansioon project-docs/evidence/week-44/. Uusintatestin tulos ja commit-linkki viikon 44 päiväkirjaan.</w:t>
+        <w:t xml:space="preserve">Tallenna työnäyte: Ennen/jälkeen-kuvat kansioon project-docs/evidence/week-2/. Uusintatestin tulos ja commit-linkki viikon 2 päiväkirjaan.</w:t>
       </w:r>
     </w:p>
     <w:p>
@@ -7706,7 +8012,7 @@
           <w:bCs/>
           <w:color w:val="1d4ed8"/>
         </w:rPr>
-        <w:t xml:space="preserve">Vko 45 · 2.–6.11. – Pelin laatu · Peli kestää pelaamista</w:t>
+        <w:t xml:space="preserve">Vko 3 · 18.–22.1. – Pelin laatu · Peli kestää pelaamista</w:t>
       </w:r>
     </w:p>
     <w:p>
@@ -7718,7 +8024,7 @@
           <w:sz w:val="19"/>
           <w:szCs w:val="19"/>
         </w:rPr>
-        <w:t xml:space="preserve">Yhteys kokonaisprojektiin: Tähän asti olet testannut kunkin viikon uuden toiminnon erikseen. Nyt kirjoitat 12 testitapausta koko pelille ennen ajoa ja ajat ne selainversiolla, koska järjestelmällinen testaus näyttää, kestääkö peli rajatilanteet ja rikkinäiset tiedostot. Testaustaulukon tapauksia käytät viikon 46 refaktoroinnissa ja julkaisun korjauksissa.</w:t>
+        <w:t xml:space="preserve">Yhteys kokonaisprojektiin: Tähän asti olet testannut kunkin viikon uuden toiminnon erikseen. Nyt kirjoitat 12 testitapausta koko pelille ennen ajoa ja ajat ne selainversiolla, koska järjestelmällinen testaus näyttää, kestääkö peli rajatilanteet ja rikkinäiset tiedostot. Testaustaulukon tapauksia käytät viikon 4 refaktoroinnissa ja julkaisun korjauksissa.</w:t>
       </w:r>
     </w:p>
     <w:p>
@@ -7746,7 +8052,7 @@
         </w:rPr>
         <w:t xml:space="preserve">Kuvaohje tai materiaali: </w:t>
       </w:r>
-      <w:hyperlink w:history="1" r:id="rIdoojkwqwvyxfjndn6dyxi-">
+      <w:hyperlink w:history="1" r:id="rId02qusdepptwslt9ps6nig">
         <w:r>
           <w:rPr>
             <w:rStyle w:val="Hyperlink"/>
@@ -8101,7 +8407,7 @@
           <w:sz w:val="19"/>
           <w:szCs w:val="19"/>
         </w:rPr>
-        <w:t xml:space="preserve">Tallenna työnäyte: Kolme ketjua commit-linkkeineen viikon 45 päiväkirjaan.</w:t>
+        <w:t xml:space="preserve">Tallenna työnäyte: Kolme ketjua commit-linkkeineen viikon 3 päiväkirjaan.</w:t>
       </w:r>
     </w:p>
     <w:p>
@@ -8143,7 +8449,7 @@
           <w:bCs/>
           <w:color w:val="1d4ed8"/>
         </w:rPr>
-        <w:t xml:space="preserve">Vko 46 · 9.–13.11. – Pelin laatu · Koodi, jonka toinen ymmärtää</w:t>
+        <w:t xml:space="preserve">Vko 4 · 25.–29.1. – Pelin laatu · Koodi, jonka toinen ymmärtää</w:t>
       </w:r>
     </w:p>
     <w:p>
@@ -8155,7 +8461,7 @@
           <w:sz w:val="19"/>
           <w:szCs w:val="19"/>
         </w:rPr>
-        <w:t xml:space="preserve">Yhteys kokonaisprojektiin: Viikon 45 testaustaulukko antaa testitapauksen, jolla näet, toimiiko peli refaktoroinnin jälkeen kuten ennen. Selkeytät yhden koodikohdan, esimerkiksi pitkän metodin tai epäselvän nimen, ja pyydät toisen ihmisen katselmoimaan sen, koska selkeä koodi helpottaa julkaisua edeltäviä korjauksia. Samalla harjoittelet ratkaisun selittämistä, jota tarvitset näytössä viikolla 49.</w:t>
+        <w:t xml:space="preserve">Yhteys kokonaisprojektiin: Viikon 3 testaustaulukko antaa testitapauksen, jolla näet, toimiiko peli refaktoroinnin jälkeen kuten ennen. Selkeytät yhden koodikohdan, esimerkiksi pitkän metodin tai epäselvän nimen, ja pyydät toisen ihmisen katselmoimaan sen, koska selkeä koodi helpottaa julkaisua edeltäviä korjauksia. Samalla harjoittelet ratkaisun selittämistä, jota tarvitset näytössä viikolla 7.</w:t>
       </w:r>
     </w:p>
     <w:p>
@@ -8263,7 +8569,7 @@
           <w:sz w:val="19"/>
           <w:szCs w:val="19"/>
         </w:rPr>
-        <w:t xml:space="preserve">Tallenna työnäyte: Kuvaus ja testitapauksen tunnus viikon 46 päiväkirjaan.</w:t>
+        <w:t xml:space="preserve">Tallenna työnäyte: Kuvaus ja testitapauksen tunnus viikon 4 päiväkirjaan.</w:t>
       </w:r>
     </w:p>
     <w:p>
@@ -8357,7 +8663,7 @@
           <w:sz w:val="19"/>
           <w:szCs w:val="19"/>
         </w:rPr>
-        <w:t xml:space="preserve">Tallenna työnäyte: Commit-linkki sekä ennen- ja jälkeen-tulokset viikon 46 päiväkirjaan.</w:t>
+        <w:t xml:space="preserve">Tallenna työnäyte: Commit-linkki sekä ennen- ja jälkeen-tulokset viikon 4 päiväkirjaan.</w:t>
       </w:r>
     </w:p>
     <w:p>
@@ -8464,7 +8770,7 @@
           <w:sz w:val="19"/>
           <w:szCs w:val="19"/>
         </w:rPr>
-        <w:t xml:space="preserve">Tallenna työnäyte: Kommentti, vastaus ja selitetty kohta viikon 46 päiväkirjaan. Tekoälyn käyttö AI-lokiin.</w:t>
+        <w:t xml:space="preserve">Tallenna työnäyte: Kommentti, vastaus ja selitetty kohta viikon 4 päiväkirjaan. Tekoälyn käyttö AI-lokiin.</w:t>
       </w:r>
     </w:p>
     <w:p>
@@ -8520,7 +8826,7 @@
           <w:bCs/>
           <w:color w:val="1d4ed8"/>
         </w:rPr>
-        <w:t xml:space="preserve">Vko 47 · 16.–20.11. – Pelin julkaisu · Ensimmäinen julkaisuehdokas RC1 testipelattavana</w:t>
+        <w:t xml:space="preserve">Vko 5 · 1.–5.2. – Pelin julkaisu · Ensimmäinen julkaisuehdokas RC1 testipelattavana</w:t>
       </w:r>
     </w:p>
     <w:p>
@@ -8532,7 +8838,7 @@
           <w:sz w:val="19"/>
           <w:szCs w:val="19"/>
         </w:rPr>
-        <w:t xml:space="preserve">Yhteys kokonaisprojektiin: Peli on nyt testattu ja selkeytetty, joten jäädytät ominaisuudet: peliin ei enää lisätä uutta, vaan vain virheitä korjataan. Merkitset ensimmäisen julkaisuehdokkaan (RC1) tagilla, ja asiakas ja toinen ihminen testaavat sen, koska kaksi testaajaa löytää eri virheitä. Luokittelemasi havainnot päättävät, mitä viikolla 48 korjataan ennen julkaisua.</w:t>
+        <w:t xml:space="preserve">Yhteys kokonaisprojektiin: Peli on nyt testattu ja selkeytetty, joten jäädytät ominaisuudet: peliin ei enää lisätä uutta, vaan vain virheitä korjataan. Merkitset ensimmäisen julkaisuehdokkaan (RC1) tagilla, ja asiakas ja toinen ihminen testaavat sen, koska kaksi testaajaa löytää eri virheitä. Luokittelemasi havainnot päättävät, mitä viikolla 6 korjataan ennen julkaisua.</w:t>
       </w:r>
     </w:p>
     <w:p>
@@ -8653,7 +8959,7 @@
           <w:sz w:val="19"/>
           <w:szCs w:val="19"/>
         </w:rPr>
-        <w:t xml:space="preserve">Tallenna työnäyte: RC1-tagin linkki ja commitin tunniste viikon 47 päiväkirjaan.</w:t>
+        <w:t xml:space="preserve">Tallenna työnäyte: RC1-tagin linkki ja commitin tunniste viikon 5 päiväkirjaan.</w:t>
       </w:r>
     </w:p>
     <w:p>
@@ -8747,7 +9053,7 @@
           <w:sz w:val="19"/>
           <w:szCs w:val="19"/>
         </w:rPr>
-        <w:t xml:space="preserve">Tallenna työnäyte: Havainnot viikon 47 päiväkirjaan.</w:t>
+        <w:t xml:space="preserve">Tallenna työnäyte: Havainnot viikon 5 päiväkirjaan.</w:t>
       </w:r>
     </w:p>
     <w:p>
@@ -8854,7 +9160,7 @@
           <w:sz w:val="19"/>
           <w:szCs w:val="19"/>
         </w:rPr>
-        <w:t xml:space="preserve">Tallenna työnäyte: Luokiteltu lista ja issueiden linkit viikon 47 päiväkirjaan.</w:t>
+        <w:t xml:space="preserve">Tallenna työnäyte: Luokiteltu lista ja issueiden linkit viikon 5 päiväkirjaan.</w:t>
       </w:r>
     </w:p>
     <w:p>
@@ -8896,7 +9202,7 @@
           <w:bCs/>
           <w:color w:val="1d4ed8"/>
         </w:rPr>
-        <w:t xml:space="preserve">Vko 48 · 23.–27.11. – Pelin julkaisu · v1.0 julki</w:t>
+        <w:t xml:space="preserve">Vko 6 · 8.–12.2. – Pelin julkaisu · v1.0 julki</w:t>
       </w:r>
     </w:p>
     <w:p>
@@ -8908,7 +9214,7 @@
           <w:sz w:val="19"/>
           <w:szCs w:val="19"/>
         </w:rPr>
-        <w:t xml:space="preserve">Yhteys kokonaisprojektiin: Viikon 47 luokitellusta listasta korjaat vain korjataan nyt -havainnot. Sitten peli siirtyy Unity-editorista GitHub Pagesiin, ja testaat julkaistua linkkiä toisella laitteella, koska vain julkinen linkki osoittaa, että tiedostot, asetukset ja tallennus toimivat asiakkaan ympäristössä. Julkaistu versio v1.0 on sama, jonka esittelet näytössä viikolla 49.</w:t>
+        <w:t xml:space="preserve">Yhteys kokonaisprojektiin: Viikon 5 luokitellusta listasta korjaat vain korjataan nyt -havainnot. Sitten peli siirtyy Unity-editorista GitHub Pagesiin, ja testaat julkaistua linkkiä toisella laitteella, koska vain julkinen linkki osoittaa, että tiedostot, asetukset ja tallennus toimivat asiakkaan ympäristössä. Julkaistu versio v1.0 on sama, jonka esittelet näytössä viikolla 7.</w:t>
       </w:r>
     </w:p>
     <w:p>
@@ -8949,7 +9255,7 @@
           <w:sz w:val="19"/>
           <w:szCs w:val="19"/>
         </w:rPr>
-        <w:t xml:space="preserve">☐  1. Avaa viikon 47 luokiteltu lista. Ota työn alle vain havainnot, joiden päätös on ”korjataan nyt”.</w:t>
+        <w:t xml:space="preserve">☐  1. Avaa viikon 5 luokiteltu lista. Ota työn alle vain havainnot, joiden päätös on ”korjataan nyt”.</w:t>
       </w:r>
     </w:p>
     <w:p>
@@ -9016,7 +9322,7 @@
           <w:sz w:val="19"/>
           <w:szCs w:val="19"/>
         </w:rPr>
-        <w:t xml:space="preserve">Tallenna työnäyte: Korjauscommitien linkit viikon 48 päiväkirjaan.</w:t>
+        <w:t xml:space="preserve">Tallenna työnäyte: Korjauscommitien linkit viikon 6 päiväkirjaan.</w:t>
       </w:r>
     </w:p>
     <w:p>
@@ -9149,7 +9455,7 @@
           <w:sz w:val="19"/>
           <w:szCs w:val="19"/>
         </w:rPr>
-        <w:t xml:space="preserve">Tallenna työnäyte: Julkaisulinkki ja v1.0-tagin linkki viikon 48 päiväkirjaan.</w:t>
+        <w:t xml:space="preserve">Tallenna työnäyte: Julkaisulinkki ja v1.0-tagin linkki viikon 6 päiväkirjaan.</w:t>
       </w:r>
     </w:p>
     <w:p>
@@ -9202,7 +9508,7 @@
           <w:sz w:val="19"/>
           <w:szCs w:val="19"/>
         </w:rPr>
-        <w:t xml:space="preserve">☐  3. Lisää otsikko ”Tunnetut puutteet” ja listaa sen alle viikon 47 tunnetut puutteet.</w:t>
+        <w:t xml:space="preserve">☐  3. Lisää otsikko ”Tunnetut puutteet” ja listaa sen alle viikon 5 tunnetut puutteet.</w:t>
       </w:r>
     </w:p>
     <w:p>
@@ -9363,7 +9669,7 @@
           <w:sz w:val="19"/>
           <w:szCs w:val="19"/>
         </w:rPr>
-        <w:t xml:space="preserve">Tallenna työnäyte: Laite, selain, testaajan rooli ja tulos viikon 48 päiväkirjaan.</w:t>
+        <w:t xml:space="preserve">Tallenna työnäyte: Laite, selain, testaajan rooli ja tulos viikon 6 päiväkirjaan.</w:t>
       </w:r>
     </w:p>
     <w:p>
@@ -9405,7 +9711,7 @@
           <w:bCs/>
           <w:color w:val="1d4ed8"/>
         </w:rPr>
-        <w:t xml:space="preserve">Vko 49 · 30.11.–4.12. – Näyttö · Aineisto ja luovutus</w:t>
+        <w:t xml:space="preserve">Vko 7 · 15.–19.2. – Näyttö · Aineisto ja luovutus</w:t>
       </w:r>
     </w:p>
     <w:p>
@@ -9417,7 +9723,7 @@
           <w:sz w:val="19"/>
           <w:szCs w:val="19"/>
         </w:rPr>
-        <w:t xml:space="preserve">Yhteys kokonaisprojektiin: Peliä ei enää muuteta: julkaistu v1.0 ja viikkojen 34–48 työnäytteet ovat näyttösi aineisto. Tarkistat päiväkirjan, kirjoitat itsearvioinnin ja liität jokaiseen näyttömatriisin vaatimukseen tarkan linkin, koska arvioija voi arvioida vain löydettävän osaamisen. Demossa näytät saman version ja selität ratkaisusi itse.</w:t>
+        <w:t xml:space="preserve">Yhteys kokonaisprojektiin: Peliä ei enää muuteta: julkaistu v1.0 ja viikkojen 43–51 ja 2–6 työnäytteet ovat näyttösi aineisto. Tarkistat päiväkirjan, kirjoitat itsearvioinnin ja liität jokaiseen näyttömatriisin vaatimukseen tarkan linkin, koska arvioija voi arvioida vain löydettävän osaamisen. Demossa näytät saman version ja selität ratkaisusi itse.</w:t>
       </w:r>
     </w:p>
     <w:p>
@@ -9445,7 +9751,7 @@
         </w:rPr>
         <w:t xml:space="preserve">Kuvaohje tai materiaali: </w:t>
       </w:r>
-      <w:hyperlink w:history="1" r:id="rIdtlk-oxanwhxr4mtiakvun">
+      <w:hyperlink w:history="1" r:id="rIdylxj7wsimmomhssxxtphr">
         <w:r>
           <w:rPr>
             <w:rStyle w:val="Hyperlink"/>
@@ -9467,7 +9773,7 @@
         </w:rPr>
         <w:t xml:space="preserve">Kuvaohje tai materiaali: </w:t>
       </w:r>
-      <w:hyperlink w:history="1" r:id="rIdrfvmqre7p1r8javuhvsg8">
+      <w:hyperlink w:history="1" r:id="rIdvwfarooy8lupdeumih18f">
         <w:r>
           <w:rPr>
             <w:rStyle w:val="Hyperlink"/>
@@ -9636,7 +9942,7 @@
           <w:sz w:val="19"/>
           <w:szCs w:val="19"/>
         </w:rPr>
-        <w:t xml:space="preserve">Valmis kun: Viikon 49 päiväkirjassa on kolme vahvuutta työnäytteineen ja yksi kehitysaskel.</w:t>
+        <w:t xml:space="preserve">Valmis kun: Viikon 7 päiväkirjassa on kolme vahvuutta työnäytteineen ja yksi kehitysaskel.</w:t>
       </w:r>
     </w:p>
     <w:p>
@@ -9650,7 +9956,7 @@
           <w:sz w:val="19"/>
           <w:szCs w:val="19"/>
         </w:rPr>
-        <w:t xml:space="preserve">Tallenna työnäyte: Itsearviointi viikon 49 päiväkirjaan.</w:t>
+        <w:t xml:space="preserve">Tallenna työnäyte: Itsearviointi viikon 7 päiväkirjaan.</w:t>
       </w:r>
     </w:p>
     <w:p>
@@ -9757,7 +10063,7 @@
           <w:sz w:val="19"/>
           <w:szCs w:val="19"/>
         </w:rPr>
-        <w:t xml:space="preserve">Tallenna työnäyte: project-docs/nayttomatriisi.md, commit ja push. Linkki tiedostoon viikon 49 päiväkirjaan.</w:t>
+        <w:t xml:space="preserve">Tallenna työnäyte: project-docs/nayttomatriisi.md, commit ja push. Linkki tiedostoon viikon 7 päiväkirjaan.</w:t>
       </w:r>
     </w:p>
     <w:p>
@@ -9851,7 +10157,7 @@
           <w:sz w:val="19"/>
           <w:szCs w:val="19"/>
         </w:rPr>
-        <w:t xml:space="preserve">Tallenna työnäyte: Demon runko viikon 49 päiväkirjaan.</w:t>
+        <w:t xml:space="preserve">Tallenna työnäyte: Demon runko viikon 7 päiväkirjaan.</w:t>
       </w:r>
     </w:p>
     <w:p>
@@ -9865,7 +10171,7 @@
           <w:sz w:val="21"/>
           <w:szCs w:val="21"/>
         </w:rPr>
-        <w:t xml:space="preserve">Työvaihe 5 / 5 · Luovuta peli ja aineisto viimeistään pe 4.12.2026.</w:t>
+        <w:t xml:space="preserve">Työvaihe 5 / 5 · Luovuta peli ja aineisto viimeistään pe 19.2.2027.</w:t>
       </w:r>
     </w:p>
     <w:p>
@@ -9917,7 +10223,7 @@
           <w:sz w:val="19"/>
           <w:szCs w:val="19"/>
         </w:rPr>
-        <w:t xml:space="preserve">☐  4. Luovuta peli, repository, projektipäiväkirja ja näyttöaineisto ohjaajalle viimeistään pe 4.12.2026.</w:t>
+        <w:t xml:space="preserve">☐  4. Luovuta peli, repository, projektipäiväkirja ja näyttöaineisto ohjaajalle viimeistään pe 19.2.2027.</w:t>
       </w:r>
     </w:p>
     <w:p>
@@ -9931,7 +10237,7 @@
           <w:sz w:val="19"/>
           <w:szCs w:val="19"/>
         </w:rPr>
-        <w:t xml:space="preserve">Valmis kun: Aineisto on luovutettu viimeistään pe 4.12.2026, ja toinen ihminen on tarkistanut sen.</w:t>
+        <w:t xml:space="preserve">Valmis kun: Aineisto on luovutettu viimeistään pe 19.2.2027, ja toinen ihminen on tarkistanut sen.</w:t>
       </w:r>
     </w:p>
     <w:p>
@@ -9945,7 +10251,7 @@
           <w:sz w:val="19"/>
           <w:szCs w:val="19"/>
         </w:rPr>
-        <w:t xml:space="preserve">Tallenna työnäyte: Luovutuksen päivä viikon 49 päiväkirjaan.</w:t>
+        <w:t xml:space="preserve">Tallenna työnäyte: Luovutuksen päivä viikon 7 päiväkirjaan.</w:t>
       </w:r>
     </w:p>
     <w:p>
@@ -10048,7 +10354,7 @@
                 <w:szCs w:val="19"/>
               </w:rPr>
               <w:t xml:space="preserve">repository
-vko 34</w:t>
+vko 43</w:t>
             </w:r>
           </w:p>
         </w:tc>
@@ -10100,7 +10406,7 @@
                 <w:szCs w:val="19"/>
               </w:rPr>
               <w:t xml:space="preserve">commit
-vko 34</w:t>
+vko 43</w:t>
             </w:r>
           </w:p>
         </w:tc>
@@ -10152,7 +10458,7 @@
                 <w:szCs w:val="19"/>
               </w:rPr>
               <w:t xml:space="preserve">build
-vko 34</w:t>
+vko 43</w:t>
             </w:r>
           </w:p>
         </w:tc>
@@ -10204,7 +10510,7 @@
                 <w:szCs w:val="19"/>
               </w:rPr>
               <w:t xml:space="preserve">WebGL
-vko 34</w:t>
+vko 43</w:t>
             </w:r>
           </w:p>
         </w:tc>
@@ -10256,7 +10562,7 @@
                 <w:szCs w:val="19"/>
               </w:rPr>
               <w:t xml:space="preserve">push
-vko 34</w:t>
+vko 43</w:t>
             </w:r>
           </w:p>
         </w:tc>
@@ -10308,7 +10614,7 @@
                 <w:szCs w:val="19"/>
               </w:rPr>
               <w:t xml:space="preserve">P0
-vko 34</w:t>
+vko 43</w:t>
             </w:r>
           </w:p>
         </w:tc>
@@ -10360,7 +10666,7 @@
                 <w:szCs w:val="19"/>
               </w:rPr>
               <w:t xml:space="preserve">P1
-vko 35</w:t>
+vko 44</w:t>
             </w:r>
           </w:p>
         </w:tc>
@@ -10412,7 +10718,7 @@
                 <w:szCs w:val="19"/>
               </w:rPr>
               <w:t xml:space="preserve">P2
-vko 35</w:t>
+vko 44</w:t>
             </w:r>
           </w:p>
         </w:tc>
@@ -10464,7 +10770,7 @@
                 <w:szCs w:val="19"/>
               </w:rPr>
               <w:t xml:space="preserve">GDD
-vko 35</w:t>
+vko 44</w:t>
             </w:r>
           </w:p>
         </w:tc>
@@ -10516,7 +10822,7 @@
                 <w:szCs w:val="19"/>
               </w:rPr>
               <w:t xml:space="preserve">GitHub-issue
-vko 35</w:t>
+vko 44</w:t>
             </w:r>
           </w:p>
         </w:tc>
@@ -10568,7 +10874,7 @@
                 <w:szCs w:val="19"/>
               </w:rPr>
               <w:t xml:space="preserve">backlog
-vko 35</w:t>
+vko 44</w:t>
             </w:r>
           </w:p>
         </w:tc>
@@ -10620,7 +10926,7 @@
                 <w:szCs w:val="19"/>
               </w:rPr>
               <w:t xml:space="preserve">mockup
-vko 35</w:t>
+vko 44</w:t>
             </w:r>
           </w:p>
         </w:tc>
@@ -10643,7 +10949,7 @@
                 <w:sz w:val="19"/>
                 <w:szCs w:val="19"/>
               </w:rPr>
-              <w:t xml:space="preserve">Käyttöliittymän luonnoskuva. Mockup on paperille tai piirto-ohjelmalla tehty luonnos ruuduista ennen koodaamista. Tässä projektissa se on project-docs/evidence/week-35/mockup.png, ja ruudut rakennetaan sen mukaan.</w:t>
+              <w:t xml:space="preserve">Käyttöliittymän luonnoskuva. Mockup on paperille tai piirto-ohjelmalla tehty luonnos ruuduista ennen koodaamista. Tässä projektissa se on project-docs/evidence/week-44/mockup.png, ja ruudut rakennetaan sen mukaan.</w:t>
             </w:r>
           </w:p>
         </w:tc>
@@ -10672,7 +10978,7 @@
                 <w:szCs w:val="19"/>
               </w:rPr>
               <w:t xml:space="preserve">UI
-vko 35</w:t>
+vko 44</w:t>
             </w:r>
           </w:p>
         </w:tc>
@@ -10724,7 +11030,7 @@
                 <w:szCs w:val="19"/>
               </w:rPr>
               <w:t xml:space="preserve">feature
-vko 35</w:t>
+vko 44</w:t>
             </w:r>
           </w:p>
         </w:tc>
@@ -10776,7 +11082,7 @@
                 <w:szCs w:val="19"/>
               </w:rPr>
               <w:t xml:space="preserve">scene
-vko 34</w:t>
+vko 43</w:t>
             </w:r>
           </w:p>
         </w:tc>
@@ -10828,7 +11134,7 @@
                 <w:szCs w:val="19"/>
               </w:rPr>
               <w:t xml:space="preserve">Hierarchy
-vko 36</w:t>
+vko 45</w:t>
             </w:r>
           </w:p>
         </w:tc>
@@ -10880,7 +11186,7 @@
                 <w:szCs w:val="19"/>
               </w:rPr>
               <w:t xml:space="preserve">metodi
-vko 36</w:t>
+vko 45</w:t>
             </w:r>
           </w:p>
         </w:tc>
@@ -10932,7 +11238,7 @@
                 <w:szCs w:val="19"/>
               </w:rPr>
               <w:t xml:space="preserve">TODO
-vko 36</w:t>
+vko 45</w:t>
             </w:r>
           </w:p>
         </w:tc>
@@ -10984,7 +11290,7 @@
                 <w:szCs w:val="19"/>
               </w:rPr>
               <w:t xml:space="preserve">hyväksymistesti
-vko 36</w:t>
+vko 45</w:t>
             </w:r>
           </w:p>
         </w:tc>
@@ -11036,7 +11342,7 @@
                 <w:szCs w:val="19"/>
               </w:rPr>
               <w:t xml:space="preserve">Canvas
-vko 36</w:t>
+vko 45</w:t>
             </w:r>
           </w:p>
         </w:tc>
@@ -11088,7 +11394,7 @@
                 <w:szCs w:val="19"/>
               </w:rPr>
               <w:t xml:space="preserve">Inspector
-vko 36</w:t>
+vko 45</w:t>
             </w:r>
           </w:p>
         </w:tc>
@@ -11140,7 +11446,7 @@
                 <w:szCs w:val="19"/>
               </w:rPr>
               <w:t xml:space="preserve">asset
-vko 36</w:t>
+vko 45</w:t>
             </w:r>
           </w:p>
         </w:tc>
@@ -11192,7 +11498,7 @@
                 <w:szCs w:val="19"/>
               </w:rPr>
               <w:t xml:space="preserve">JSON
-vko 35</w:t>
+vko 44</w:t>
             </w:r>
           </w:p>
         </w:tc>
@@ -11244,7 +11550,7 @@
                 <w:szCs w:val="19"/>
               </w:rPr>
               <w:t xml:space="preserve">Console
-vko 37</w:t>
+vko 46</w:t>
             </w:r>
           </w:p>
         </w:tc>
@@ -11296,7 +11602,7 @@
                 <w:szCs w:val="19"/>
               </w:rPr>
               <w:t xml:space="preserve">rajatilanne
-vko 38</w:t>
+vko 47</w:t>
             </w:r>
           </w:p>
         </w:tc>
@@ -11348,7 +11654,7 @@
                 <w:szCs w:val="19"/>
               </w:rPr>
               <w:t xml:space="preserve">vertainen
-vko 39</w:t>
+vko 48</w:t>
             </w:r>
           </w:p>
         </w:tc>
@@ -11400,7 +11706,7 @@
                 <w:szCs w:val="19"/>
               </w:rPr>
               <w:t xml:space="preserve">PlayerPrefs
-vko 40</w:t>
+vko 49</w:t>
             </w:r>
           </w:p>
         </w:tc>
@@ -11452,7 +11758,7 @@
                 <w:szCs w:val="19"/>
               </w:rPr>
               <w:t xml:space="preserve">katselmointi
-vko 41</w:t>
+vko 50</w:t>
             </w:r>
           </w:p>
         </w:tc>
@@ -11475,7 +11781,7 @@
                 <w:sz w:val="19"/>
                 <w:szCs w:val="19"/>
               </w:rPr>
-              <w:t xml:space="preserve">Työn yhteinen tarkastus. Katselmoinnissa toinen ihminen kokeilee peliä tai lukee koodia ja antaa palautetta. Viikolla 41 asiakas katselmoi pelin, viikolla 46 ohjaaja tai vertainen katselmoi koodin.</w:t>
+              <w:t xml:space="preserve">Työn yhteinen tarkastus. Katselmoinnissa toinen ihminen kokeilee peliä tai lukee koodia ja antaa palautetta. Viikolla 50 asiakas katselmoi pelin, viikolla 4 ohjaaja tai vertainen katselmoi koodin.</w:t>
             </w:r>
           </w:p>
         </w:tc>
@@ -11504,7 +11810,7 @@
                 <w:szCs w:val="19"/>
               </w:rPr>
               <w:t xml:space="preserve">branch
-vko 43</w:t>
+vko 51</w:t>
             </w:r>
           </w:p>
         </w:tc>
@@ -11556,7 +11862,7 @@
                 <w:szCs w:val="19"/>
               </w:rPr>
               <w:t xml:space="preserve">pull request
-vko 43</w:t>
+vko 51</w:t>
             </w:r>
           </w:p>
         </w:tc>
@@ -11608,7 +11914,7 @@
                 <w:szCs w:val="19"/>
               </w:rPr>
               <w:t xml:space="preserve">T01
-vko 45</w:t>
+vko 3</w:t>
             </w:r>
           </w:p>
         </w:tc>
@@ -11660,7 +11966,7 @@
                 <w:szCs w:val="19"/>
               </w:rPr>
               <w:t xml:space="preserve">refaktorointi
-vko 46</w:t>
+vko 4</w:t>
             </w:r>
           </w:p>
         </w:tc>
@@ -11712,7 +12018,7 @@
                 <w:szCs w:val="19"/>
               </w:rPr>
               <w:t xml:space="preserve">regressiotesti
-vko 45</w:t>
+vko 3</w:t>
             </w:r>
           </w:p>
         </w:tc>
@@ -11764,7 +12070,7 @@
                 <w:szCs w:val="19"/>
               </w:rPr>
               <w:t xml:space="preserve">RC
-vko 47</w:t>
+vko 5</w:t>
             </w:r>
           </w:p>
         </w:tc>
@@ -11816,7 +12122,7 @@
                 <w:szCs w:val="19"/>
               </w:rPr>
               <w:t xml:space="preserve">tagi
-vko 47</w:t>
+vko 5</w:t>
             </w:r>
           </w:p>
         </w:tc>
@@ -12070,7 +12376,7 @@
           <w:sz w:val="19"/>
           <w:szCs w:val="19"/>
         </w:rPr>
-        <w:t xml:space="preserve">☐  Version katselmointi – Lokit viikoilta 41 ja 47.</w:t>
+        <w:t xml:space="preserve">☐  Version katselmointi – Lokit viikoilta 50 ja 5.</w:t>
       </w:r>
     </w:p>
     <w:p>
@@ -12240,7 +12546,7 @@
           <w:sz w:val="19"/>
           <w:szCs w:val="19"/>
         </w:rPr>
-        <w:t xml:space="preserve">☐  Kirjaston mahdollisuudet ja rajoitteet – Viikon 40 kirjaus tallennusratkaisun rajoituksista ja viikon 48 julkaisupäätökset tunnettuine puutteineen.</w:t>
+        <w:t xml:space="preserve">☐  Kirjaston mahdollisuudet ja rajoitteet – Viikon 49 kirjaus tallennusratkaisun rajoituksista ja viikon 6 julkaisupäätökset tunnettuine puutteineen.</w:t>
       </w:r>
     </w:p>
     <w:p>

</xml_diff>